<commit_message>
Update doc tutorial web - sensor data penting
</commit_message>
<xml_diff>
--- a/Tutorial_Pengoperasian_Website_NIAS_Jatim.docx
+++ b/Tutorial_Pengoperasian_Website_NIAS_Jatim.docx
@@ -330,8 +330,6 @@
         </w:rPr>
         <w:t>CATATAN: satu club maksimal hanya bisa mendaftarkan 2 akun pelatih. Pastikan email dan password yang terdaftar di website diingat atau disimpan dengan baik datanya. Jika ada email yang telah terdaftar di website tetapi emailnya sudah mati/off, silahkan hubungi admin it.possijatim@gmail.com</w:t>
       </w:r>
-      <w:bookmarkStart w:id="0" w:name="_GoBack"/>
-      <w:bookmarkEnd w:id="0"/>
     </w:p>
     <w:p>
       <w:pPr>
@@ -1245,6 +1243,62 @@
         <w:jc w:val="center"/>
       </w:pPr>
       <w:r>
+        <w:rPr>
+          <w:sz w:val="22"/>
+        </w:rPr>
+        <w:pict>
+          <v:rect id="_x0000_s1026" o:spid="_x0000_s1026" o:spt="1" style="position:absolute;left:0pt;margin-left:224.55pt;margin-top:148.15pt;height:10pt;width:61.6pt;z-index:251659264;mso-width-relative:page;mso-height-relative:page;" fillcolor="#FFFFFF" filled="t" stroked="t" coordsize="21600,21600">
+            <v:path/>
+            <v:fill on="t" focussize="0,0"/>
+            <v:stroke color="#000000"/>
+            <v:imagedata o:title=""/>
+            <o:lock v:ext="edit" aspectratio="f"/>
+          </v:rect>
+        </w:pict>
+      </w:r>
+      <w:r>
+        <w:rPr>
+          <w:sz w:val="22"/>
+        </w:rPr>
+        <w:pict>
+          <v:rect id="_x0000_s1032" o:spid="_x0000_s1032" o:spt="1" style="position:absolute;left:0pt;margin-left:147.15pt;margin-top:147.35pt;height:10.75pt;width:39.9pt;z-index:251662336;mso-width-relative:page;mso-height-relative:page;" fillcolor="#FFFFFF" filled="t" stroked="t" coordsize="21600,21600">
+            <v:path/>
+            <v:fill on="t" focussize="0,0"/>
+            <v:stroke color="#000000"/>
+            <v:imagedata o:title=""/>
+            <o:lock v:ext="edit" aspectratio="f"/>
+          </v:rect>
+        </w:pict>
+      </w:r>
+      <w:r>
+        <w:rPr>
+          <w:sz w:val="22"/>
+        </w:rPr>
+        <w:pict>
+          <v:rect id="_x0000_s1031" o:spid="_x0000_s1031" o:spt="1" style="position:absolute;left:0pt;margin-left:188.7pt;margin-top:180.7pt;height:7.5pt;width:20pt;z-index:251661312;mso-width-relative:page;mso-height-relative:page;" fillcolor="#FFFFFF" filled="t" stroked="t" coordsize="21600,21600">
+            <v:path/>
+            <v:fill on="t" focussize="0,0"/>
+            <v:stroke color="#000000"/>
+            <v:imagedata o:title=""/>
+            <o:lock v:ext="edit" aspectratio="f"/>
+          </v:rect>
+        </w:pict>
+      </w:r>
+      <w:r>
+        <w:rPr>
+          <w:sz w:val="22"/>
+        </w:rPr>
+        <w:pict>
+          <v:rect id="_x0000_s1030" o:spid="_x0000_s1030" o:spt="1" style="position:absolute;left:0pt;margin-left:101.2pt;margin-top:149pt;height:7.5pt;width:21.7pt;z-index:251660288;mso-width-relative:page;mso-height-relative:page;" fillcolor="#FFFFFF" filled="t" stroked="t" coordsize="21600,21600">
+            <v:path/>
+            <v:fill on="t" focussize="0,0"/>
+            <v:stroke color="#000000"/>
+            <v:imagedata o:title=""/>
+            <o:lock v:ext="edit" aspectratio="f"/>
+          </v:rect>
+        </w:pict>
+      </w:r>
+      <w:r>
         <w:drawing>
           <wp:inline distT="0" distB="0" distL="0" distR="0">
             <wp:extent cx="4859655" cy="4062730"/>
@@ -1314,6 +1368,62 @@
         <w:jc w:val="center"/>
       </w:pPr>
       <w:r>
+        <w:rPr>
+          <w:sz w:val="22"/>
+        </w:rPr>
+        <w:pict>
+          <v:rect id="_x0000_s1036" o:spid="_x0000_s1036" o:spt="1" style="position:absolute;left:0pt;margin-left:188.9pt;margin-top:180.6pt;height:10pt;width:21.25pt;z-index:251666432;mso-width-relative:page;mso-height-relative:page;" fillcolor="#FFFFFF" filled="t" stroked="t" coordsize="21600,21600">
+            <v:path/>
+            <v:fill on="t" focussize="0,0"/>
+            <v:stroke color="#000000"/>
+            <v:imagedata o:title=""/>
+            <o:lock v:ext="edit" aspectratio="f"/>
+          </v:rect>
+        </w:pict>
+      </w:r>
+      <w:r>
+        <w:rPr>
+          <w:sz w:val="22"/>
+        </w:rPr>
+        <w:pict>
+          <v:rect id="_x0000_s1035" o:spid="_x0000_s1035" o:spt="1" style="position:absolute;left:0pt;margin-left:223.9pt;margin-top:148.75pt;height:9.35pt;width:61.25pt;z-index:251665408;mso-width-relative:page;mso-height-relative:page;" fillcolor="#FFFFFF" filled="t" stroked="t" coordsize="21600,21600">
+            <v:path/>
+            <v:fill on="t" focussize="0,0"/>
+            <v:stroke color="#000000"/>
+            <v:imagedata o:title=""/>
+            <o:lock v:ext="edit" aspectratio="f"/>
+          </v:rect>
+        </w:pict>
+      </w:r>
+      <w:r>
+        <w:rPr>
+          <w:sz w:val="22"/>
+        </w:rPr>
+        <w:pict>
+          <v:rect id="_x0000_s1034" o:spid="_x0000_s1034" o:spt="1" style="position:absolute;left:0pt;margin-left:145.8pt;margin-top:149.35pt;height:10pt;width:50pt;z-index:251664384;mso-width-relative:page;mso-height-relative:page;" fillcolor="#FFFFFF" filled="t" stroked="t" coordsize="21600,21600">
+            <v:path/>
+            <v:fill on="t" focussize="0,0"/>
+            <v:stroke color="#000000"/>
+            <v:imagedata o:title=""/>
+            <o:lock v:ext="edit" aspectratio="f"/>
+          </v:rect>
+        </w:pict>
+      </w:r>
+      <w:r>
+        <w:rPr>
+          <w:sz w:val="22"/>
+        </w:rPr>
+        <w:pict>
+          <v:rect id="_x0000_s1033" o:spid="_x0000_s1033" o:spt="1" style="position:absolute;left:0pt;margin-left:102.65pt;margin-top:148.75pt;height:9.35pt;width:19.4pt;z-index:251663360;mso-width-relative:page;mso-height-relative:page;" fillcolor="#FFFFFF" filled="t" stroked="t" coordsize="21600,21600">
+            <v:path/>
+            <v:fill on="t" focussize="0,0"/>
+            <v:stroke color="#000000"/>
+            <v:imagedata o:title=""/>
+            <o:lock v:ext="edit" aspectratio="f"/>
+          </v:rect>
+        </w:pict>
+      </w:r>
+      <w:r>
         <w:drawing>
           <wp:inline distT="0" distB="0" distL="0" distR="0">
             <wp:extent cx="4859655" cy="4062730"/>
@@ -1383,6 +1493,62 @@
         <w:jc w:val="center"/>
       </w:pPr>
       <w:r>
+        <w:rPr>
+          <w:sz w:val="22"/>
+        </w:rPr>
+        <w:pict>
+          <v:rect id="_x0000_s1040" o:spid="_x0000_s1040" o:spt="1" style="position:absolute;left:0pt;margin-left:187.7pt;margin-top:180.8pt;height:8.75pt;width:21.2pt;z-index:251670528;mso-width-relative:page;mso-height-relative:page;" fillcolor="#FFFFFF" filled="t" stroked="t" coordsize="21600,21600">
+            <v:path/>
+            <v:fill on="t" focussize="0,0"/>
+            <v:stroke color="#000000"/>
+            <v:imagedata o:title=""/>
+            <o:lock v:ext="edit" aspectratio="f"/>
+          </v:rect>
+        </w:pict>
+      </w:r>
+      <w:r>
+        <w:rPr>
+          <w:sz w:val="22"/>
+        </w:rPr>
+        <w:pict>
+          <v:rect id="_x0000_s1039" o:spid="_x0000_s1039" o:spt="1" style="position:absolute;left:0pt;margin-left:102.05pt;margin-top:148.3pt;height:8.75pt;width:20.6pt;z-index:251669504;mso-width-relative:page;mso-height-relative:page;" fillcolor="#FFFFFF" filled="t" stroked="t" coordsize="21600,21600">
+            <v:path/>
+            <v:fill on="t" focussize="0,0"/>
+            <v:stroke color="#000000"/>
+            <v:imagedata o:title=""/>
+            <o:lock v:ext="edit" aspectratio="f"/>
+          </v:rect>
+        </w:pict>
+      </w:r>
+      <w:r>
+        <w:rPr>
+          <w:sz w:val="22"/>
+        </w:rPr>
+        <w:pict>
+          <v:rect id="_x0000_s1038" o:spid="_x0000_s1038" o:spt="1" style="position:absolute;left:0pt;margin-left:145.15pt;margin-top:148.9pt;height:8.15pt;width:44.4pt;z-index:251668480;mso-width-relative:page;mso-height-relative:page;" fillcolor="#FFFFFF" filled="t" stroked="t" coordsize="21600,21600">
+            <v:path/>
+            <v:fill on="t" focussize="0,0"/>
+            <v:stroke color="#000000"/>
+            <v:imagedata o:title=""/>
+            <o:lock v:ext="edit" aspectratio="f"/>
+          </v:rect>
+        </w:pict>
+      </w:r>
+      <w:r>
+        <w:rPr>
+          <w:sz w:val="22"/>
+        </w:rPr>
+        <w:pict>
+          <v:rect id="_x0000_s1037" o:spid="_x0000_s1037" o:spt="1" style="position:absolute;left:0pt;margin-left:223.3pt;margin-top:147.05pt;height:10pt;width:65.6pt;z-index:251667456;mso-width-relative:page;mso-height-relative:page;" fillcolor="#FFFFFF" filled="t" stroked="t" coordsize="21600,21600">
+            <v:path/>
+            <v:fill on="t" focussize="0,0"/>
+            <v:stroke color="#000000"/>
+            <v:imagedata o:title=""/>
+            <o:lock v:ext="edit" aspectratio="f"/>
+          </v:rect>
+        </w:pict>
+      </w:r>
+      <w:r>
         <w:drawing>
           <wp:inline distT="0" distB="0" distL="0" distR="0">
             <wp:extent cx="4859655" cy="4749800"/>
@@ -1471,6 +1637,62 @@
         <w:jc w:val="center"/>
       </w:pPr>
       <w:r>
+        <w:rPr>
+          <w:sz w:val="22"/>
+        </w:rPr>
+        <w:pict>
+          <v:rect id="_x0000_s1044" o:spid="_x0000_s1044" o:spt="1" style="position:absolute;left:0pt;margin-left:189.55pt;margin-top:160.1pt;height:8.75pt;width:20pt;z-index:251674624;mso-width-relative:page;mso-height-relative:page;" fillcolor="#FFFFFF" filled="t" stroked="t" coordsize="21600,21600">
+            <v:path/>
+            <v:fill on="t" focussize="0,0"/>
+            <v:stroke color="#000000"/>
+            <v:imagedata o:title=""/>
+            <o:lock v:ext="edit" aspectratio="f"/>
+          </v:rect>
+        </w:pict>
+      </w:r>
+      <w:r>
+        <w:rPr>
+          <w:sz w:val="22"/>
+        </w:rPr>
+        <w:pict>
+          <v:rect id="_x0000_s1043" o:spid="_x0000_s1043" o:spt="1" style="position:absolute;left:0pt;margin-left:220.15pt;margin-top:127.6pt;height:8.15pt;width:41.9pt;z-index:251673600;mso-width-relative:page;mso-height-relative:page;" fillcolor="#FFFFFF" filled="t" stroked="t" coordsize="21600,21600">
+            <v:path/>
+            <v:fill on="t" focussize="0,0"/>
+            <v:stroke color="#000000"/>
+            <v:imagedata o:title=""/>
+            <o:lock v:ext="edit" aspectratio="f"/>
+          </v:rect>
+        </w:pict>
+      </w:r>
+      <w:r>
+        <w:rPr>
+          <w:sz w:val="22"/>
+        </w:rPr>
+        <w:pict>
+          <v:rect id="_x0000_s1042" o:spid="_x0000_s1042" o:spt="1" style="position:absolute;left:0pt;margin-left:100.15pt;margin-top:126.35pt;height:8.75pt;width:22.5pt;z-index:251672576;mso-width-relative:page;mso-height-relative:page;" fillcolor="#FFFFFF" filled="t" stroked="t" coordsize="21600,21600">
+            <v:path/>
+            <v:fill on="t" focussize="0,0"/>
+            <v:stroke color="#000000"/>
+            <v:imagedata o:title=""/>
+            <o:lock v:ext="edit" aspectratio="f"/>
+          </v:rect>
+        </w:pict>
+      </w:r>
+      <w:r>
+        <w:rPr>
+          <w:sz w:val="22"/>
+        </w:rPr>
+        <w:pict>
+          <v:rect id="_x0000_s1041" o:spid="_x0000_s1041" o:spt="1" style="position:absolute;left:0pt;margin-left:143.3pt;margin-top:126.35pt;height:10pt;width:40.6pt;z-index:251671552;mso-width-relative:page;mso-height-relative:page;" fillcolor="#FFFFFF" filled="t" stroked="t" coordsize="21600,21600">
+            <v:path/>
+            <v:fill on="t" focussize="0,0"/>
+            <v:stroke color="#000000"/>
+            <v:imagedata o:title=""/>
+            <o:lock v:ext="edit" aspectratio="f"/>
+          </v:rect>
+        </w:pict>
+      </w:r>
+      <w:r>
         <w:drawing>
           <wp:inline distT="0" distB="0" distL="0" distR="0">
             <wp:extent cx="4859655" cy="4749800"/>
@@ -1660,6 +1882,34 @@
         <w:jc w:val="center"/>
       </w:pPr>
       <w:r>
+        <w:rPr>
+          <w:sz w:val="22"/>
+        </w:rPr>
+        <w:pict>
+          <v:rect id="_x0000_s1046" o:spid="_x0000_s1046" o:spt="1" style="position:absolute;left:0pt;margin-left:205.15pt;margin-top:126.95pt;height:8.15pt;width:61.9pt;z-index:251676672;mso-width-relative:page;mso-height-relative:page;" fillcolor="#FFFFFF" filled="t" stroked="t" coordsize="21600,21600">
+            <v:path/>
+            <v:fill on="t" focussize="0,0"/>
+            <v:stroke color="#000000"/>
+            <v:imagedata o:title=""/>
+            <o:lock v:ext="edit" aspectratio="f"/>
+          </v:rect>
+        </w:pict>
+      </w:r>
+      <w:r>
+        <w:rPr>
+          <w:sz w:val="22"/>
+        </w:rPr>
+        <w:pict>
+          <v:rect id="_x0000_s1045" o:spid="_x0000_s1045" o:spt="1" style="position:absolute;left:0pt;margin-left:87.65pt;margin-top:128.85pt;height:8.1pt;width:95.65pt;z-index:251675648;mso-width-relative:page;mso-height-relative:page;" fillcolor="#FFFFFF" filled="t" stroked="t" coordsize="21600,21600">
+            <v:path/>
+            <v:fill on="t" focussize="0,0"/>
+            <v:stroke color="#000000"/>
+            <v:imagedata o:title=""/>
+            <o:lock v:ext="edit" aspectratio="f"/>
+          </v:rect>
+        </w:pict>
+      </w:r>
+      <w:r>
         <w:drawing>
           <wp:inline distT="0" distB="0" distL="0" distR="0">
             <wp:extent cx="4859655" cy="4749800"/>
@@ -1716,6 +1966,34 @@
         <w:jc w:val="center"/>
       </w:pPr>
       <w:r>
+        <w:rPr>
+          <w:sz w:val="22"/>
+        </w:rPr>
+        <w:pict>
+          <v:rect id="_x0000_s1048" o:spid="_x0000_s1048" o:spt="1" style="position:absolute;left:0pt;margin-left:103.3pt;margin-top:170.55pt;height:8.15pt;width:26.85pt;z-index:251678720;mso-width-relative:page;mso-height-relative:page;" fillcolor="#FFFFFF" filled="t" stroked="t" coordsize="21600,21600">
+            <v:path/>
+            <v:fill on="t" focussize="0,0"/>
+            <v:stroke color="#000000"/>
+            <v:imagedata o:title=""/>
+            <o:lock v:ext="edit" aspectratio="f"/>
+          </v:rect>
+        </w:pict>
+      </w:r>
+      <w:r>
+        <w:rPr>
+          <w:sz w:val="22"/>
+        </w:rPr>
+        <w:pict>
+          <v:rect id="_x0000_s1047" o:spid="_x0000_s1047" o:spt="1" style="position:absolute;left:0pt;margin-left:145.8pt;margin-top:164.95pt;height:8.75pt;width:40.6pt;z-index:251677696;mso-width-relative:page;mso-height-relative:page;" fillcolor="#FFFFFF" filled="t" stroked="t" coordsize="21600,21600">
+            <v:path/>
+            <v:fill on="t" focussize="0,0"/>
+            <v:stroke color="#000000"/>
+            <v:imagedata o:title=""/>
+            <o:lock v:ext="edit" aspectratio="f"/>
+          </v:rect>
+        </w:pict>
+      </w:r>
+      <w:r>
         <w:drawing>
           <wp:inline distT="0" distB="0" distL="0" distR="0">
             <wp:extent cx="4859655" cy="4115435"/>
@@ -1772,6 +2050,48 @@
         <w:jc w:val="center"/>
       </w:pPr>
       <w:r>
+        <w:rPr>
+          <w:sz w:val="22"/>
+        </w:rPr>
+        <w:pict>
+          <v:rect id="_x0000_s1051" o:spid="_x0000_s1051" o:spt="1" style="position:absolute;left:0pt;margin-left:225.15pt;margin-top:168.45pt;height:11.85pt;width:16.25pt;z-index:251681792;mso-width-relative:page;mso-height-relative:page;" fillcolor="#FFFFFF" filled="t" stroked="t" coordsize="21600,21600">
+            <v:path/>
+            <v:fill on="t" focussize="0,0"/>
+            <v:stroke color="#000000"/>
+            <v:imagedata o:title=""/>
+            <o:lock v:ext="edit" aspectratio="f"/>
+          </v:rect>
+        </w:pict>
+      </w:r>
+      <w:r>
+        <w:rPr>
+          <w:sz w:val="22"/>
+        </w:rPr>
+        <w:pict>
+          <v:rect id="_x0000_s1050" o:spid="_x0000_s1050" o:spt="1" style="position:absolute;left:0pt;margin-left:147.05pt;margin-top:164.05pt;height:10pt;width:51.25pt;z-index:251680768;mso-width-relative:page;mso-height-relative:page;" fillcolor="#FFFFFF" filled="t" stroked="t" coordsize="21600,21600">
+            <v:path/>
+            <v:fill on="t" focussize="0,0"/>
+            <v:stroke color="#000000"/>
+            <v:imagedata o:title=""/>
+            <o:lock v:ext="edit" aspectratio="f"/>
+          </v:rect>
+        </w:pict>
+      </w:r>
+      <w:r>
+        <w:rPr>
+          <w:sz w:val="22"/>
+        </w:rPr>
+        <w:pict>
+          <v:rect id="_x0000_s1049" o:spid="_x0000_s1049" o:spt="1" style="position:absolute;left:0pt;margin-left:102.05pt;margin-top:170.95pt;height:10.6pt;width:28.1pt;z-index:251679744;mso-width-relative:page;mso-height-relative:page;" fillcolor="#FFFFFF" filled="t" stroked="t" coordsize="21600,21600">
+            <v:path/>
+            <v:fill on="t" focussize="0,0"/>
+            <v:stroke color="#000000"/>
+            <v:imagedata o:title=""/>
+            <o:lock v:ext="edit" aspectratio="f"/>
+          </v:rect>
+        </w:pict>
+      </w:r>
+      <w:r>
         <w:drawing>
           <wp:inline distT="0" distB="0" distL="0" distR="0">
             <wp:extent cx="4859655" cy="4115435"/>
@@ -1828,6 +2148,48 @@
         <w:jc w:val="center"/>
       </w:pPr>
       <w:r>
+        <w:rPr>
+          <w:sz w:val="22"/>
+        </w:rPr>
+        <w:pict>
+          <v:rect id="_x0000_s1054" o:spid="_x0000_s1054" o:spt="1" style="position:absolute;left:0pt;margin-left:224.55pt;margin-top:170.5pt;height:8.75pt;width:16.25pt;z-index:251684864;mso-width-relative:page;mso-height-relative:page;" fillcolor="#FFFFFF" filled="t" stroked="t" coordsize="21600,21600">
+            <v:path/>
+            <v:fill on="t" focussize="0,0"/>
+            <v:stroke color="#000000"/>
+            <v:imagedata o:title=""/>
+            <o:lock v:ext="edit" aspectratio="f"/>
+          </v:rect>
+        </w:pict>
+      </w:r>
+      <w:r>
+        <w:rPr>
+          <w:sz w:val="22"/>
+        </w:rPr>
+        <w:pict>
+          <v:rect id="_x0000_s1053" o:spid="_x0000_s1053" o:spt="1" style="position:absolute;left:0pt;margin-left:148.3pt;margin-top:164.9pt;height:8.75pt;width:48.75pt;z-index:251683840;mso-width-relative:page;mso-height-relative:page;" fillcolor="#FFFFFF" filled="t" stroked="t" coordsize="21600,21600">
+            <v:path/>
+            <v:fill on="t" focussize="0,0"/>
+            <v:stroke color="#000000"/>
+            <v:imagedata o:title=""/>
+            <o:lock v:ext="edit" aspectratio="f"/>
+          </v:rect>
+        </w:pict>
+      </w:r>
+      <w:r>
+        <w:rPr>
+          <w:sz w:val="22"/>
+        </w:rPr>
+        <w:pict>
+          <v:rect id="_x0000_s1052" o:spid="_x0000_s1052" o:spt="1" style="position:absolute;left:0pt;margin-left:103.9pt;margin-top:168pt;height:12.5pt;width:26.25pt;z-index:251682816;mso-width-relative:page;mso-height-relative:page;" fillcolor="#FFFFFF" filled="t" stroked="t" coordsize="21600,21600">
+            <v:path/>
+            <v:fill on="t" focussize="0,0"/>
+            <v:stroke color="#000000"/>
+            <v:imagedata o:title=""/>
+            <o:lock v:ext="edit" aspectratio="f"/>
+          </v:rect>
+        </w:pict>
+      </w:r>
+      <w:r>
         <w:drawing>
           <wp:inline distT="0" distB="0" distL="0" distR="0">
             <wp:extent cx="4859655" cy="4115435"/>
@@ -1897,6 +2259,48 @@
         <w:jc w:val="center"/>
       </w:pPr>
       <w:r>
+        <w:rPr>
+          <w:sz w:val="22"/>
+        </w:rPr>
+        <w:pict>
+          <v:rect id="_x0000_s1057" o:spid="_x0000_s1057" o:spt="1" style="position:absolute;left:0pt;margin-left:249.55pt;margin-top:90.35pt;height:6.25pt;width:6.85pt;z-index:251687936;mso-width-relative:page;mso-height-relative:page;" fillcolor="#FFFFFF" filled="t" stroked="t" coordsize="21600,21600">
+            <v:path/>
+            <v:fill on="t" focussize="0,0"/>
+            <v:stroke color="#000000"/>
+            <v:imagedata o:title=""/>
+            <o:lock v:ext="edit" aspectratio="f"/>
+          </v:rect>
+        </w:pict>
+      </w:r>
+      <w:r>
+        <w:rPr>
+          <w:sz w:val="22"/>
+        </w:rPr>
+        <w:pict>
+          <v:rect id="_x0000_s1056" o:spid="_x0000_s1056" o:spt="1" style="position:absolute;left:0pt;margin-left:213.3pt;margin-top:89.1pt;height:8.1pt;width:23.75pt;z-index:251686912;mso-width-relative:page;mso-height-relative:page;" fillcolor="#FFFFFF" filled="t" stroked="t" coordsize="21600,21600">
+            <v:path/>
+            <v:fill on="t" focussize="0,0"/>
+            <v:stroke color="#000000"/>
+            <v:imagedata o:title=""/>
+            <o:lock v:ext="edit" aspectratio="f"/>
+          </v:rect>
+        </w:pict>
+      </w:r>
+      <w:r>
+        <w:rPr>
+          <w:sz w:val="22"/>
+        </w:rPr>
+        <w:pict>
+          <v:rect id="_x0000_s1055" o:spid="_x0000_s1055" o:spt="1" style="position:absolute;left:0pt;margin-left:193.9pt;margin-top:89.1pt;height:8.75pt;width:10pt;z-index:251685888;mso-width-relative:page;mso-height-relative:page;" fillcolor="#FFFFFF" filled="t" stroked="t" coordsize="21600,21600">
+            <v:path/>
+            <v:fill on="t" focussize="0,0"/>
+            <v:stroke color="#000000"/>
+            <v:imagedata o:title=""/>
+            <o:lock v:ext="edit" aspectratio="f"/>
+          </v:rect>
+        </w:pict>
+      </w:r>
+      <w:r>
         <w:drawing>
           <wp:inline distT="0" distB="0" distL="0" distR="0">
             <wp:extent cx="4859655" cy="2733675"/>
@@ -1953,6 +2357,20 @@
         <w:jc w:val="center"/>
       </w:pPr>
       <w:r>
+        <w:rPr>
+          <w:sz w:val="22"/>
+        </w:rPr>
+        <w:pict>
+          <v:rect id="_x0000_s1058" o:spid="_x0000_s1058" o:spt="1" style="position:absolute;left:0pt;margin-left:103.9pt;margin-top:167.05pt;height:13.75pt;width:81.9pt;z-index:251688960;mso-width-relative:page;mso-height-relative:page;" fillcolor="#FFFFFF" filled="t" stroked="t" coordsize="21600,21600">
+            <v:path/>
+            <v:fill on="t" focussize="0,0"/>
+            <v:stroke color="#000000"/>
+            <v:imagedata o:title=""/>
+            <o:lock v:ext="edit" aspectratio="f"/>
+          </v:rect>
+        </w:pict>
+      </w:r>
+      <w:r>
         <w:drawing>
           <wp:inline distT="0" distB="0" distL="0" distR="0">
             <wp:extent cx="4859655" cy="4115435"/>
@@ -2009,6 +2427,20 @@
         <w:jc w:val="center"/>
       </w:pPr>
       <w:r>
+        <w:rPr>
+          <w:sz w:val="22"/>
+        </w:rPr>
+        <w:pict>
+          <v:rect id="_x0000_s1059" o:spid="_x0000_s1059" o:spt="1" style="position:absolute;left:0pt;margin-left:101.4pt;margin-top:166.15pt;height:15.65pt;width:138.75pt;z-index:251689984;mso-width-relative:page;mso-height-relative:page;" fillcolor="#FFFFFF" filled="t" stroked="t" coordsize="21600,21600">
+            <v:path/>
+            <v:fill on="t" focussize="0,0"/>
+            <v:stroke color="#000000"/>
+            <v:imagedata o:title=""/>
+            <o:lock v:ext="edit" aspectratio="f"/>
+          </v:rect>
+        </w:pict>
+      </w:r>
+      <w:r>
         <w:drawing>
           <wp:inline distT="0" distB="0" distL="0" distR="0">
             <wp:extent cx="4859655" cy="4115435"/>
@@ -2078,6 +2510,20 @@
         <w:jc w:val="center"/>
       </w:pPr>
       <w:r>
+        <w:rPr>
+          <w:sz w:val="22"/>
+        </w:rPr>
+        <w:pict>
+          <v:rect id="_x0000_s1060" o:spid="_x0000_s1060" o:spt="1" style="position:absolute;left:0pt;margin-left:105.8pt;margin-top:165.55pt;height:15.6pt;width:83.1pt;z-index:251691008;mso-width-relative:page;mso-height-relative:page;" fillcolor="#FFFFFF" filled="t" stroked="t" coordsize="21600,21600">
+            <v:path/>
+            <v:fill on="t" focussize="0,0"/>
+            <v:stroke color="#000000"/>
+            <v:imagedata o:title=""/>
+            <o:lock v:ext="edit" aspectratio="f"/>
+          </v:rect>
+        </w:pict>
+      </w:r>
+      <w:r>
         <w:drawing>
           <wp:inline distT="0" distB="0" distL="0" distR="0">
             <wp:extent cx="4859655" cy="4115435"/>
@@ -2134,6 +2580,20 @@
         <w:jc w:val="center"/>
       </w:pPr>
       <w:r>
+        <w:rPr>
+          <w:sz w:val="22"/>
+        </w:rPr>
+        <w:pict>
+          <v:rect id="_x0000_s1061" o:spid="_x0000_s1061" o:spt="1" style="position:absolute;left:0pt;margin-left:108.3pt;margin-top:164.8pt;height:18.15pt;width:78.1pt;z-index:251692032;mso-width-relative:page;mso-height-relative:page;" fillcolor="#FFFFFF" filled="t" stroked="t" coordsize="21600,21600">
+            <v:path/>
+            <v:fill on="t" focussize="0,0"/>
+            <v:stroke color="#000000"/>
+            <v:imagedata o:title=""/>
+            <o:lock v:ext="edit" aspectratio="f"/>
+          </v:rect>
+        </w:pict>
+      </w:r>
+      <w:r>
         <w:drawing>
           <wp:inline distT="0" distB="0" distL="0" distR="0">
             <wp:extent cx="4859655" cy="4115435"/>
@@ -2190,6 +2650,20 @@
         <w:jc w:val="center"/>
       </w:pPr>
       <w:r>
+        <w:rPr>
+          <w:sz w:val="22"/>
+        </w:rPr>
+        <w:pict>
+          <v:rect id="_x0000_s1062" o:spid="_x0000_s1062" o:spt="1" style="position:absolute;left:0pt;margin-left:107.65pt;margin-top:163.4pt;height:21.25pt;width:81.25pt;z-index:251693056;mso-width-relative:page;mso-height-relative:page;" fillcolor="#FFFFFF" filled="t" stroked="t" coordsize="21600,21600">
+            <v:path/>
+            <v:fill on="t" focussize="0,0"/>
+            <v:stroke color="#000000"/>
+            <v:imagedata o:title=""/>
+            <o:lock v:ext="edit" aspectratio="f"/>
+          </v:rect>
+        </w:pict>
+      </w:r>
+      <w:r>
         <w:drawing>
           <wp:inline distT="0" distB="0" distL="0" distR="0">
             <wp:extent cx="4859655" cy="4115435"/>
@@ -2302,6 +2776,48 @@
         <w:jc w:val="center"/>
       </w:pPr>
       <w:r>
+        <w:rPr>
+          <w:sz w:val="22"/>
+        </w:rPr>
+        <w:pict>
+          <v:rect id="_x0000_s1065" o:spid="_x0000_s1065" o:spt="1" style="position:absolute;left:0pt;margin-left:250.15pt;margin-top:379pt;height:8.1pt;width:17.5pt;z-index:251696128;mso-width-relative:page;mso-height-relative:page;" fillcolor="#FFFFFF" filled="t" stroked="t" coordsize="21600,21600">
+            <v:path/>
+            <v:fill on="t" focussize="0,0"/>
+            <v:stroke color="#000000"/>
+            <v:imagedata o:title=""/>
+            <o:lock v:ext="edit" aspectratio="f"/>
+          </v:rect>
+        </w:pict>
+      </w:r>
+      <w:r>
+        <w:rPr>
+          <w:sz w:val="22"/>
+        </w:rPr>
+        <w:pict>
+          <v:rect id="_x0000_s1064" o:spid="_x0000_s1064" o:spt="1" style="position:absolute;left:0pt;margin-left:144.55pt;margin-top:377.75pt;height:9.35pt;width:48.1pt;z-index:251695104;mso-width-relative:page;mso-height-relative:page;" fillcolor="#FFFFFF" filled="t" stroked="t" coordsize="21600,21600">
+            <v:path/>
+            <v:fill on="t" focussize="0,0"/>
+            <v:stroke color="#000000"/>
+            <v:imagedata o:title=""/>
+            <o:lock v:ext="edit" aspectratio="f"/>
+          </v:rect>
+        </w:pict>
+      </w:r>
+      <w:r>
+        <w:rPr>
+          <w:sz w:val="22"/>
+        </w:rPr>
+        <w:pict>
+          <v:rect id="_x0000_s1063" o:spid="_x0000_s1063" o:spt="1" style="position:absolute;left:0pt;margin-left:97.65pt;margin-top:379pt;height:7.5pt;width:27.5pt;z-index:251694080;mso-width-relative:page;mso-height-relative:page;" fillcolor="#FFFFFF" filled="t" stroked="t" coordsize="21600,21600">
+            <v:path/>
+            <v:fill on="t" focussize="0,0"/>
+            <v:stroke color="#000000"/>
+            <v:imagedata o:title=""/>
+            <o:lock v:ext="edit" aspectratio="f"/>
+          </v:rect>
+        </w:pict>
+      </w:r>
+      <w:r>
         <w:drawing>
           <wp:inline distT="0" distB="0" distL="0" distR="0">
             <wp:extent cx="4859655" cy="5100955"/>
@@ -2373,6 +2889,50 @@
       <w:pPr>
         <w:jc w:val="center"/>
       </w:pPr>
+      <w:bookmarkStart w:id="0" w:name="_GoBack"/>
+      <w:r>
+        <w:rPr>
+          <w:sz w:val="22"/>
+        </w:rPr>
+        <w:pict>
+          <v:rect id="_x0000_s1068" o:spid="_x0000_s1068" o:spt="1" style="position:absolute;left:0pt;margin-left:185.8pt;margin-top:158.35pt;height:9.4pt;width:24.35pt;z-index:251699200;mso-width-relative:page;mso-height-relative:page;" fillcolor="#FFFFFF" filled="t" stroked="t" coordsize="21600,21600">
+            <v:path/>
+            <v:fill on="t" focussize="0,0"/>
+            <v:stroke color="#000000"/>
+            <v:imagedata o:title=""/>
+            <o:lock v:ext="edit" aspectratio="f"/>
+          </v:rect>
+        </w:pict>
+      </w:r>
+      <w:bookmarkEnd w:id="0"/>
+      <w:r>
+        <w:rPr>
+          <w:sz w:val="22"/>
+        </w:rPr>
+        <w:pict>
+          <v:rect id="_x0000_s1067" o:spid="_x0000_s1067" o:spt="1" style="position:absolute;left:0pt;margin-left:217.65pt;margin-top:125.25pt;height:10.6pt;width:43.75pt;z-index:251698176;mso-width-relative:page;mso-height-relative:page;" fillcolor="#FFFFFF" filled="t" stroked="t" coordsize="21600,21600">
+            <v:path/>
+            <v:fill on="t" focussize="0,0"/>
+            <v:stroke color="#000000"/>
+            <v:imagedata o:title=""/>
+            <o:lock v:ext="edit" aspectratio="f"/>
+          </v:rect>
+        </w:pict>
+      </w:r>
+      <w:r>
+        <w:rPr>
+          <w:sz w:val="22"/>
+        </w:rPr>
+        <w:pict>
+          <v:rect id="_x0000_s1066" o:spid="_x0000_s1066" o:spt="1" style="position:absolute;left:0pt;margin-left:97.05pt;margin-top:127.1pt;height:7.5pt;width:85pt;z-index:251697152;mso-width-relative:page;mso-height-relative:page;" fillcolor="#FFFFFF" filled="t" stroked="t" coordsize="21600,21600">
+            <v:path/>
+            <v:fill on="t" focussize="0,0"/>
+            <v:stroke color="#000000"/>
+            <v:imagedata o:title=""/>
+            <o:lock v:ext="edit" aspectratio="f"/>
+          </v:rect>
+        </w:pict>
+      </w:r>
       <w:r>
         <w:drawing>
           <wp:inline distT="0" distB="0" distL="0" distR="0">
@@ -3364,6 +3924,46 @@
   <customSectProps/>
   <customShpExts>
     <customShpInfo spid="_x0000_s2049" textRotate="1"/>
+    <customShpInfo spid="_x0000_s1026"/>
+    <customShpInfo spid="_x0000_s1032"/>
+    <customShpInfo spid="_x0000_s1031"/>
+    <customShpInfo spid="_x0000_s1030"/>
+    <customShpInfo spid="_x0000_s1036"/>
+    <customShpInfo spid="_x0000_s1035"/>
+    <customShpInfo spid="_x0000_s1034"/>
+    <customShpInfo spid="_x0000_s1033"/>
+    <customShpInfo spid="_x0000_s1040"/>
+    <customShpInfo spid="_x0000_s1039"/>
+    <customShpInfo spid="_x0000_s1038"/>
+    <customShpInfo spid="_x0000_s1037"/>
+    <customShpInfo spid="_x0000_s1044"/>
+    <customShpInfo spid="_x0000_s1043"/>
+    <customShpInfo spid="_x0000_s1042"/>
+    <customShpInfo spid="_x0000_s1041"/>
+    <customShpInfo spid="_x0000_s1046"/>
+    <customShpInfo spid="_x0000_s1045"/>
+    <customShpInfo spid="_x0000_s1048"/>
+    <customShpInfo spid="_x0000_s1047"/>
+    <customShpInfo spid="_x0000_s1051"/>
+    <customShpInfo spid="_x0000_s1050"/>
+    <customShpInfo spid="_x0000_s1049"/>
+    <customShpInfo spid="_x0000_s1054"/>
+    <customShpInfo spid="_x0000_s1053"/>
+    <customShpInfo spid="_x0000_s1052"/>
+    <customShpInfo spid="_x0000_s1057"/>
+    <customShpInfo spid="_x0000_s1056"/>
+    <customShpInfo spid="_x0000_s1055"/>
+    <customShpInfo spid="_x0000_s1058"/>
+    <customShpInfo spid="_x0000_s1059"/>
+    <customShpInfo spid="_x0000_s1060"/>
+    <customShpInfo spid="_x0000_s1061"/>
+    <customShpInfo spid="_x0000_s1062"/>
+    <customShpInfo spid="_x0000_s1065"/>
+    <customShpInfo spid="_x0000_s1064"/>
+    <customShpInfo spid="_x0000_s1063"/>
+    <customShpInfo spid="_x0000_s1068"/>
+    <customShpInfo spid="_x0000_s1067"/>
+    <customShpInfo spid="_x0000_s1066"/>
   </customShpExts>
 </s:customData>
 </file>

</xml_diff>

<commit_message>
Update tutorial doc - nias exsting and export data
</commit_message>
<xml_diff>
--- a/Tutorial_Pengoperasian_Website_NIAS_Jatim.docx
+++ b/Tutorial_Pengoperasian_Website_NIAS_Jatim.docx
@@ -1,16 +1,61 @@
 
 <file path=word/document.xml><?xml version="1.0" encoding="utf-8"?>
-<w:document xmlns:wpc="http://schemas.microsoft.com/office/word/2010/wordprocessingCanvas" xmlns:mc="http://schemas.openxmlformats.org/markup-compatibility/2006" xmlns:o="urn:schemas-microsoft-com:office:office" xmlns:r="http://schemas.openxmlformats.org/officeDocument/2006/relationships" xmlns:m="http://schemas.openxmlformats.org/officeDocument/2006/math" xmlns:v="urn:schemas-microsoft-com:vml" xmlns:wp14="http://schemas.microsoft.com/office/word/2010/wordprocessingDrawing" xmlns:wp="http://schemas.openxmlformats.org/drawingml/2006/wordprocessingDrawing" xmlns:w="http://schemas.openxmlformats.org/wordprocessingml/2006/main" xmlns:w14="http://schemas.microsoft.com/office/word/2010/wordml" xmlns:w10="urn:schemas-microsoft-com:office:word" xmlns:w15="http://schemas.microsoft.com/office/word/2012/wordml" xmlns:wpg="http://schemas.microsoft.com/office/word/2010/wordprocessingGroup" xmlns:wpi="http://schemas.microsoft.com/office/word/2010/wordprocessingInk" xmlns:wne="http://schemas.microsoft.com/office/word/2006/wordml" xmlns:wps="http://schemas.microsoft.com/office/word/2010/wordprocessingShape" xmlns:wpsCustomData="http://www.wps.cn/officeDocument/2013/wpsCustomData" mc:Ignorable="w14 w15 wp14">
+<w:document xmlns:wpc="http://schemas.microsoft.com/office/word/2010/wordprocessingCanvas" xmlns:cx="http://schemas.microsoft.com/office/drawing/2014/chartex" xmlns:cx1="http://schemas.microsoft.com/office/drawing/2015/9/8/chartex" xmlns:cx2="http://schemas.microsoft.com/office/drawing/2015/10/21/chartex" xmlns:cx3="http://schemas.microsoft.com/office/drawing/2016/5/9/chartex" xmlns:cx4="http://schemas.microsoft.com/office/drawing/2016/5/10/chartex" xmlns:cx5="http://schemas.microsoft.com/office/drawing/2016/5/11/chartex" xmlns:cx6="http://schemas.microsoft.com/office/drawing/2016/5/12/chartex" xmlns:cx7="http://schemas.microsoft.com/office/drawing/2016/5/13/chartex" xmlns:cx8="http://schemas.microsoft.com/office/drawing/2016/5/14/chartex" xmlns:mc="http://schemas.openxmlformats.org/markup-compatibility/2006" xmlns:o="urn:schemas-microsoft-com:office:office" xmlns:r="http://schemas.openxmlformats.org/officeDocument/2006/relationships" xmlns:m="http://schemas.openxmlformats.org/officeDocument/2006/math" xmlns:v="urn:schemas-microsoft-com:vml" xmlns:wp14="http://schemas.microsoft.com/office/word/2010/wordprocessingDrawing" xmlns:wp="http://schemas.openxmlformats.org/drawingml/2006/wordprocessingDrawing" xmlns:w="http://schemas.openxmlformats.org/wordprocessingml/2006/main" xmlns:w14="http://schemas.microsoft.com/office/word/2010/wordml" xmlns:w10="urn:schemas-microsoft-com:office:word" xmlns:w15="http://schemas.microsoft.com/office/word/2012/wordml" xmlns:wpg="http://schemas.microsoft.com/office/word/2010/wordprocessingGroup" xmlns:wpi="http://schemas.microsoft.com/office/word/2010/wordprocessingInk" xmlns:wne="http://schemas.microsoft.com/office/word/2006/wordml" xmlns:wps="http://schemas.microsoft.com/office/word/2010/wordprocessingShape" xmlns:wpsCustomData="http://www.wps.cn/officeDocument/2013/wpsCustomData" mc:Ignorable="w14 w15 wp14">
   <w:body>
     <w:p>
       <w:pPr>
         <w:pStyle w:val="10"/>
         <w:jc w:val="center"/>
-      </w:pPr>
-      <w:r>
         <w:rPr>
           <w:b/>
         </w:rPr>
+      </w:pPr>
+    </w:p>
+    <w:p>
+      <w:pPr>
+        <w:pStyle w:val="10"/>
+        <w:jc w:val="center"/>
+        <w:rPr>
+          <w:b/>
+        </w:rPr>
+      </w:pPr>
+    </w:p>
+    <w:p>
+      <w:pPr>
+        <w:pStyle w:val="10"/>
+        <w:jc w:val="center"/>
+        <w:rPr>
+          <w:b/>
+        </w:rPr>
+      </w:pPr>
+    </w:p>
+    <w:p>
+      <w:pPr>
+        <w:pStyle w:val="10"/>
+        <w:jc w:val="center"/>
+        <w:rPr>
+          <w:b/>
+        </w:rPr>
+      </w:pPr>
+    </w:p>
+    <w:p>
+      <w:pPr>
+        <w:pStyle w:val="10"/>
+        <w:jc w:val="center"/>
+        <w:rPr>
+          <w:b/>
+        </w:rPr>
+      </w:pPr>
+    </w:p>
+    <w:p>
+      <w:pPr>
+        <w:pStyle w:val="10"/>
+        <w:jc w:val="center"/>
+      </w:pPr>
+      <w:r>
+        <w:rPr>
+          <w:b/>
+        </w:rPr>
         <w:t>Tutorial Pengoperasian</w:t>
       </w:r>
     </w:p>
@@ -39,6 +84,13 @@
       <w:pPr>
         <w:pStyle w:val="9"/>
         <w:jc w:val="center"/>
+        <w:sectPr>
+          <w:footerReference r:id="rId3" w:type="default"/>
+          <w:pgSz w:w="11906" w:h="16838"/>
+          <w:pgMar w:top="720" w:right="720" w:bottom="720" w:left="720" w:header="720" w:footer="720" w:gutter="0"/>
+          <w:pgNumType w:fmt="decimal"/>
+          <w:cols w:space="720" w:num="1"/>
+        </w:sectPr>
       </w:pPr>
       <w:r>
         <w:t>POSSI Jawa Timur</w:t>
@@ -46,11 +98,654 @@
     </w:p>
     <w:p>
       <w:pPr>
+        <w:pStyle w:val="11"/>
+        <w:tabs>
+          <w:tab w:val="right" w:leader="dot" w:pos="10466"/>
+        </w:tabs>
+        <w:rPr>
+          <w:rFonts w:hint="default"/>
+          <w:lang w:val="en-US"/>
+        </w:rPr>
+      </w:pPr>
+      <w:r>
+        <w:rPr>
+          <w:rFonts w:hint="default"/>
+          <w:lang w:val="en-US"/>
+        </w:rPr>
+        <w:t>Daftar Isi</w:t>
+      </w:r>
+    </w:p>
+    <w:p>
+      <w:pPr>
+        <w:pStyle w:val="11"/>
+        <w:tabs>
+          <w:tab w:val="right" w:leader="dot" w:pos="10466"/>
+        </w:tabs>
+      </w:pPr>
+    </w:p>
+    <w:p>
+      <w:pPr>
+        <w:pStyle w:val="11"/>
+        <w:tabs>
+          <w:tab w:val="right" w:leader="dot" w:pos="10466"/>
+        </w:tabs>
+      </w:pPr>
+      <w:bookmarkStart w:id="14" w:name="_GoBack"/>
+      <w:bookmarkEnd w:id="14"/>
+      <w:r>
+        <w:fldChar w:fldCharType="begin"/>
+      </w:r>
+      <w:r>
+        <w:instrText xml:space="preserve">TOC \o "1-1" \h \u </w:instrText>
+      </w:r>
+      <w:r>
+        <w:fldChar w:fldCharType="separate"/>
+      </w:r>
+      <w:r>
+        <w:fldChar w:fldCharType="begin"/>
+      </w:r>
+      <w:r>
+        <w:instrText xml:space="preserve"> HYPERLINK \l _Toc1773711299 </w:instrText>
+      </w:r>
+      <w:r>
+        <w:fldChar w:fldCharType="separate"/>
+      </w:r>
+      <w:r>
+        <w:t>1. Pendahuluan</w:t>
+      </w:r>
+      <w:r>
+        <w:tab/>
+      </w:r>
+      <w:r>
+        <w:fldChar w:fldCharType="begin"/>
+      </w:r>
+      <w:r>
+        <w:instrText xml:space="preserve"> PAGEREF _Toc1773711299 \h </w:instrText>
+      </w:r>
+      <w:r>
+        <w:fldChar w:fldCharType="separate"/>
+      </w:r>
+      <w:r>
+        <w:t>3</w:t>
+      </w:r>
+      <w:r>
+        <w:fldChar w:fldCharType="end"/>
+      </w:r>
+      <w:r>
+        <w:fldChar w:fldCharType="end"/>
+      </w:r>
+    </w:p>
+    <w:p>
+      <w:pPr>
+        <w:pStyle w:val="11"/>
+        <w:tabs>
+          <w:tab w:val="right" w:leader="dot" w:pos="10466"/>
+        </w:tabs>
+      </w:pPr>
+      <w:r>
+        <w:fldChar w:fldCharType="begin"/>
+      </w:r>
+      <w:r>
+        <w:instrText xml:space="preserve"> HYPERLINK \l _Toc206092538 </w:instrText>
+      </w:r>
+      <w:r>
+        <w:fldChar w:fldCharType="separate"/>
+      </w:r>
+      <w:r>
+        <w:t>2. Membuat Akun</w:t>
+      </w:r>
+      <w:r>
+        <w:tab/>
+      </w:r>
+      <w:r>
+        <w:fldChar w:fldCharType="begin"/>
+      </w:r>
+      <w:r>
+        <w:instrText xml:space="preserve"> PAGEREF _Toc206092538 \h </w:instrText>
+      </w:r>
+      <w:r>
+        <w:fldChar w:fldCharType="separate"/>
+      </w:r>
+      <w:r>
+        <w:t>4</w:t>
+      </w:r>
+      <w:r>
+        <w:fldChar w:fldCharType="end"/>
+      </w:r>
+      <w:r>
+        <w:fldChar w:fldCharType="end"/>
+      </w:r>
+    </w:p>
+    <w:p>
+      <w:pPr>
+        <w:pStyle w:val="11"/>
+        <w:tabs>
+          <w:tab w:val="right" w:leader="dot" w:pos="10466"/>
+        </w:tabs>
+      </w:pPr>
+      <w:r>
+        <w:fldChar w:fldCharType="begin"/>
+      </w:r>
+      <w:r>
+        <w:instrText xml:space="preserve"> HYPERLINK \l _Toc1882144265 </w:instrText>
+      </w:r>
+      <w:r>
+        <w:fldChar w:fldCharType="separate"/>
+      </w:r>
+      <w:r>
+        <w:t>3. Masuk dan Keluar Akun</w:t>
+      </w:r>
+      <w:r>
+        <w:tab/>
+      </w:r>
+      <w:r>
+        <w:fldChar w:fldCharType="begin"/>
+      </w:r>
+      <w:r>
+        <w:instrText xml:space="preserve"> PAGEREF _Toc1882144265 \h </w:instrText>
+      </w:r>
+      <w:r>
+        <w:fldChar w:fldCharType="separate"/>
+      </w:r>
+      <w:r>
+        <w:t>6</w:t>
+      </w:r>
+      <w:r>
+        <w:fldChar w:fldCharType="end"/>
+      </w:r>
+      <w:r>
+        <w:fldChar w:fldCharType="end"/>
+      </w:r>
+    </w:p>
+    <w:p>
+      <w:pPr>
+        <w:pStyle w:val="11"/>
+        <w:tabs>
+          <w:tab w:val="right" w:leader="dot" w:pos="10466"/>
+        </w:tabs>
+      </w:pPr>
+      <w:r>
+        <w:fldChar w:fldCharType="begin"/>
+      </w:r>
+      <w:r>
+        <w:instrText xml:space="preserve"> HYPERLINK \l _Toc1403974640 </w:instrText>
+      </w:r>
+      <w:r>
+        <w:fldChar w:fldCharType="separate"/>
+      </w:r>
+      <w:r>
+        <w:t>4. Halaman Utama (Data NIAS)</w:t>
+      </w:r>
+      <w:r>
+        <w:tab/>
+      </w:r>
+      <w:r>
+        <w:fldChar w:fldCharType="begin"/>
+      </w:r>
+      <w:r>
+        <w:instrText xml:space="preserve"> PAGEREF _Toc1403974640 \h </w:instrText>
+      </w:r>
+      <w:r>
+        <w:fldChar w:fldCharType="separate"/>
+      </w:r>
+      <w:r>
+        <w:t>8</w:t>
+      </w:r>
+      <w:r>
+        <w:fldChar w:fldCharType="end"/>
+      </w:r>
+      <w:r>
+        <w:fldChar w:fldCharType="end"/>
+      </w:r>
+    </w:p>
+    <w:p>
+      <w:pPr>
+        <w:pStyle w:val="11"/>
+        <w:tabs>
+          <w:tab w:val="right" w:leader="dot" w:pos="10466"/>
+        </w:tabs>
+      </w:pPr>
+      <w:r>
+        <w:fldChar w:fldCharType="begin"/>
+      </w:r>
+      <w:r>
+        <w:instrText xml:space="preserve"> HYPERLINK \l _Toc1471381638 </w:instrText>
+      </w:r>
+      <w:r>
+        <w:fldChar w:fldCharType="separate"/>
+      </w:r>
+      <w:r>
+        <w:t>5. Mendaftarkan Atlet Baru</w:t>
+      </w:r>
+      <w:r>
+        <w:tab/>
+      </w:r>
+      <w:r>
+        <w:fldChar w:fldCharType="begin"/>
+      </w:r>
+      <w:r>
+        <w:instrText xml:space="preserve"> PAGEREF _Toc1471381638 \h </w:instrText>
+      </w:r>
+      <w:r>
+        <w:fldChar w:fldCharType="separate"/>
+      </w:r>
+      <w:r>
+        <w:t>9</w:t>
+      </w:r>
+      <w:r>
+        <w:fldChar w:fldCharType="end"/>
+      </w:r>
+      <w:r>
+        <w:fldChar w:fldCharType="end"/>
+      </w:r>
+    </w:p>
+    <w:p>
+      <w:pPr>
+        <w:pStyle w:val="11"/>
+        <w:tabs>
+          <w:tab w:val="right" w:leader="dot" w:pos="10466"/>
+        </w:tabs>
+      </w:pPr>
+      <w:r>
+        <w:fldChar w:fldCharType="begin"/>
+      </w:r>
+      <w:r>
+        <w:instrText xml:space="preserve"> HYPERLINK \l _Toc779474862 </w:instrText>
+      </w:r>
+      <w:r>
+        <w:fldChar w:fldCharType="separate"/>
+      </w:r>
+      <w:r>
+        <w:t>6. Data Berhasil Disimpan</w:t>
+      </w:r>
+      <w:r>
+        <w:tab/>
+      </w:r>
+      <w:r>
+        <w:fldChar w:fldCharType="begin"/>
+      </w:r>
+      <w:r>
+        <w:instrText xml:space="preserve"> PAGEREF _Toc779474862 \h </w:instrText>
+      </w:r>
+      <w:r>
+        <w:fldChar w:fldCharType="separate"/>
+      </w:r>
+      <w:r>
+        <w:t>11</w:t>
+      </w:r>
+      <w:r>
+        <w:fldChar w:fldCharType="end"/>
+      </w:r>
+      <w:r>
+        <w:fldChar w:fldCharType="end"/>
+      </w:r>
+    </w:p>
+    <w:p>
+      <w:pPr>
+        <w:pStyle w:val="11"/>
+        <w:tabs>
+          <w:tab w:val="right" w:leader="dot" w:pos="10466"/>
+        </w:tabs>
+      </w:pPr>
+      <w:r>
+        <w:fldChar w:fldCharType="begin"/>
+      </w:r>
+      <w:r>
+        <w:instrText xml:space="preserve"> HYPERLINK \l _Toc397457170 </w:instrText>
+      </w:r>
+      <w:r>
+        <w:fldChar w:fldCharType="separate"/>
+      </w:r>
+      <w:r>
+        <w:t>7. Update / Perpanjang NIAS</w:t>
+      </w:r>
+      <w:r>
+        <w:tab/>
+      </w:r>
+      <w:r>
+        <w:fldChar w:fldCharType="begin"/>
+      </w:r>
+      <w:r>
+        <w:instrText xml:space="preserve"> PAGEREF _Toc397457170 \h </w:instrText>
+      </w:r>
+      <w:r>
+        <w:fldChar w:fldCharType="separate"/>
+      </w:r>
+      <w:r>
+        <w:t>12</w:t>
+      </w:r>
+      <w:r>
+        <w:fldChar w:fldCharType="end"/>
+      </w:r>
+      <w:r>
+        <w:fldChar w:fldCharType="end"/>
+      </w:r>
+    </w:p>
+    <w:p>
+      <w:pPr>
+        <w:pStyle w:val="11"/>
+        <w:tabs>
+          <w:tab w:val="right" w:leader="dot" w:pos="10466"/>
+        </w:tabs>
+      </w:pPr>
+      <w:r>
+        <w:fldChar w:fldCharType="begin"/>
+      </w:r>
+      <w:r>
+        <w:instrText xml:space="preserve"> HYPERLINK \l _Toc1564085149 </w:instrText>
+      </w:r>
+      <w:r>
+        <w:fldChar w:fldCharType="separate"/>
+      </w:r>
+      <w:r>
+        <w:t>8. Konfirmasi dan Hasil Update</w:t>
+      </w:r>
+      <w:r>
+        <w:tab/>
+      </w:r>
+      <w:r>
+        <w:fldChar w:fldCharType="begin"/>
+      </w:r>
+      <w:r>
+        <w:instrText xml:space="preserve"> PAGEREF _Toc1564085149 \h </w:instrText>
+      </w:r>
+      <w:r>
+        <w:fldChar w:fldCharType="separate"/>
+      </w:r>
+      <w:r>
+        <w:t>16</w:t>
+      </w:r>
+      <w:r>
+        <w:fldChar w:fldCharType="end"/>
+      </w:r>
+      <w:r>
+        <w:fldChar w:fldCharType="end"/>
+      </w:r>
+    </w:p>
+    <w:p>
+      <w:pPr>
+        <w:pStyle w:val="11"/>
+        <w:tabs>
+          <w:tab w:val="right" w:leader="dot" w:pos="10466"/>
+        </w:tabs>
+      </w:pPr>
+      <w:r>
+        <w:fldChar w:fldCharType="begin"/>
+      </w:r>
+      <w:r>
+        <w:instrText xml:space="preserve"> HYPERLINK \l _Toc649835153 </w:instrText>
+      </w:r>
+      <w:r>
+        <w:fldChar w:fldCharType="separate"/>
+      </w:r>
+      <w:r>
+        <w:t>9. Upload Bukti Transfer</w:t>
+      </w:r>
+      <w:r>
+        <w:tab/>
+      </w:r>
+      <w:r>
+        <w:fldChar w:fldCharType="begin"/>
+      </w:r>
+      <w:r>
+        <w:instrText xml:space="preserve"> PAGEREF _Toc649835153 \h </w:instrText>
+      </w:r>
+      <w:r>
+        <w:fldChar w:fldCharType="separate"/>
+      </w:r>
+      <w:r>
+        <w:t>18</w:t>
+      </w:r>
+      <w:r>
+        <w:fldChar w:fldCharType="end"/>
+      </w:r>
+      <w:r>
+        <w:fldChar w:fldCharType="end"/>
+      </w:r>
+    </w:p>
+    <w:p>
+      <w:pPr>
+        <w:pStyle w:val="11"/>
+        <w:tabs>
+          <w:tab w:val="right" w:leader="dot" w:pos="10466"/>
+        </w:tabs>
+      </w:pPr>
+      <w:r>
+        <w:fldChar w:fldCharType="begin"/>
+      </w:r>
+      <w:r>
+        <w:instrText xml:space="preserve"> HYPERLINK \l _Toc67329082 </w:instrText>
+      </w:r>
+      <w:r>
+        <w:fldChar w:fldCharType="separate"/>
+      </w:r>
+      <w:r>
+        <w:t>10. Mengirim Data ke POSSI Jatim</w:t>
+      </w:r>
+      <w:r>
+        <w:tab/>
+      </w:r>
+      <w:r>
+        <w:fldChar w:fldCharType="begin"/>
+      </w:r>
+      <w:r>
+        <w:instrText xml:space="preserve"> PAGEREF _Toc67329082 \h </w:instrText>
+      </w:r>
+      <w:r>
+        <w:fldChar w:fldCharType="separate"/>
+      </w:r>
+      <w:r>
+        <w:t>20</w:t>
+      </w:r>
+      <w:r>
+        <w:fldChar w:fldCharType="end"/>
+      </w:r>
+      <w:r>
+        <w:fldChar w:fldCharType="end"/>
+      </w:r>
+    </w:p>
+    <w:p>
+      <w:pPr>
+        <w:pStyle w:val="11"/>
+        <w:tabs>
+          <w:tab w:val="right" w:leader="dot" w:pos="10466"/>
+        </w:tabs>
+      </w:pPr>
+      <w:r>
+        <w:fldChar w:fldCharType="begin"/>
+      </w:r>
+      <w:r>
+        <w:instrText xml:space="preserve"> HYPERLINK \l _Toc1025688225 </w:instrText>
+      </w:r>
+      <w:r>
+        <w:fldChar w:fldCharType="separate"/>
+      </w:r>
+      <w:r>
+        <w:t xml:space="preserve">11. </w:t>
+      </w:r>
+      <w:r>
+        <w:rPr>
+          <w:rFonts w:hint="default"/>
+          <w:lang w:val="en-US"/>
+        </w:rPr>
+        <w:t>Cara Melihat Data NIAS per Club</w:t>
+      </w:r>
+      <w:r>
+        <w:tab/>
+      </w:r>
+      <w:r>
+        <w:fldChar w:fldCharType="begin"/>
+      </w:r>
+      <w:r>
+        <w:instrText xml:space="preserve"> PAGEREF _Toc1025688225 \h </w:instrText>
+      </w:r>
+      <w:r>
+        <w:fldChar w:fldCharType="separate"/>
+      </w:r>
+      <w:r>
+        <w:t>22</w:t>
+      </w:r>
+      <w:r>
+        <w:fldChar w:fldCharType="end"/>
+      </w:r>
+      <w:r>
+        <w:fldChar w:fldCharType="end"/>
+      </w:r>
+    </w:p>
+    <w:p>
+      <w:pPr>
+        <w:pStyle w:val="11"/>
+        <w:tabs>
+          <w:tab w:val="right" w:leader="dot" w:pos="10466"/>
+        </w:tabs>
+      </w:pPr>
+      <w:r>
+        <w:fldChar w:fldCharType="begin"/>
+      </w:r>
+      <w:r>
+        <w:instrText xml:space="preserve"> HYPERLINK \l _Toc272528582 </w:instrText>
+      </w:r>
+      <w:r>
+        <w:fldChar w:fldCharType="separate"/>
+      </w:r>
+      <w:r>
+        <w:t xml:space="preserve">12. </w:t>
+      </w:r>
+      <w:r>
+        <w:rPr>
+          <w:rFonts w:hint="default"/>
+          <w:lang w:val="en-US"/>
+        </w:rPr>
+        <w:t>Cara Download Data NIAS yang sudah terdaftar</w:t>
+      </w:r>
+      <w:r>
+        <w:tab/>
+      </w:r>
+      <w:r>
+        <w:fldChar w:fldCharType="begin"/>
+      </w:r>
+      <w:r>
+        <w:instrText xml:space="preserve"> PAGEREF _Toc272528582 \h </w:instrText>
+      </w:r>
+      <w:r>
+        <w:fldChar w:fldCharType="separate"/>
+      </w:r>
+      <w:r>
+        <w:t>23</w:t>
+      </w:r>
+      <w:r>
+        <w:fldChar w:fldCharType="end"/>
+      </w:r>
+      <w:r>
+        <w:fldChar w:fldCharType="end"/>
+      </w:r>
+    </w:p>
+    <w:p>
+      <w:pPr>
+        <w:pStyle w:val="11"/>
+        <w:tabs>
+          <w:tab w:val="right" w:leader="dot" w:pos="10466"/>
+        </w:tabs>
+      </w:pPr>
+      <w:r>
+        <w:fldChar w:fldCharType="begin"/>
+      </w:r>
+      <w:r>
+        <w:instrText xml:space="preserve"> HYPERLINK \l _Toc1389201324 </w:instrText>
+      </w:r>
+      <w:r>
+        <w:fldChar w:fldCharType="separate"/>
+      </w:r>
+      <w:r>
+        <w:t>13. Pemecahan Masalah (Troubleshooting)</w:t>
+      </w:r>
+      <w:r>
+        <w:tab/>
+      </w:r>
+      <w:r>
+        <w:fldChar w:fldCharType="begin"/>
+      </w:r>
+      <w:r>
+        <w:instrText xml:space="preserve"> PAGEREF _Toc1389201324 \h </w:instrText>
+      </w:r>
+      <w:r>
+        <w:fldChar w:fldCharType="separate"/>
+      </w:r>
+      <w:r>
+        <w:t>24</w:t>
+      </w:r>
+      <w:r>
+        <w:fldChar w:fldCharType="end"/>
+      </w:r>
+      <w:r>
+        <w:fldChar w:fldCharType="end"/>
+      </w:r>
+    </w:p>
+    <w:p>
+      <w:pPr>
+        <w:pStyle w:val="11"/>
+        <w:tabs>
+          <w:tab w:val="right" w:leader="dot" w:pos="10466"/>
+        </w:tabs>
+      </w:pPr>
+      <w:r>
+        <w:fldChar w:fldCharType="begin"/>
+      </w:r>
+      <w:r>
+        <w:instrText xml:space="preserve"> HYPERLINK \l _Toc643639544 </w:instrText>
+      </w:r>
+      <w:r>
+        <w:fldChar w:fldCharType="separate"/>
+      </w:r>
+      <w:r>
+        <w:t>14. Informasi Penting</w:t>
+      </w:r>
+      <w:r>
+        <w:tab/>
+      </w:r>
+      <w:r>
+        <w:fldChar w:fldCharType="begin"/>
+      </w:r>
+      <w:r>
+        <w:instrText xml:space="preserve"> PAGEREF _Toc643639544 \h </w:instrText>
+      </w:r>
+      <w:r>
+        <w:fldChar w:fldCharType="separate"/>
+      </w:r>
+      <w:r>
+        <w:t>25</w:t>
+      </w:r>
+      <w:r>
+        <w:fldChar w:fldCharType="end"/>
+      </w:r>
+      <w:r>
+        <w:fldChar w:fldCharType="end"/>
+      </w:r>
+    </w:p>
+    <w:p>
+      <w:pPr>
+        <w:pStyle w:val="9"/>
+        <w:jc w:val="center"/>
+        <w:sectPr>
+          <w:pgSz w:w="11906" w:h="16838"/>
+          <w:pgMar w:top="720" w:right="720" w:bottom="720" w:left="720" w:header="720" w:footer="720" w:gutter="0"/>
+          <w:pgNumType w:fmt="decimal"/>
+          <w:cols w:space="720" w:num="1"/>
+        </w:sectPr>
+      </w:pPr>
+      <w:r>
+        <w:fldChar w:fldCharType="end"/>
+      </w:r>
+    </w:p>
+    <w:p>
+      <w:pPr>
         <w:pStyle w:val="2"/>
       </w:pPr>
+      <w:bookmarkStart w:id="0" w:name="_Toc1773711299"/>
       <w:r>
         <w:t>1. Pendahuluan</w:t>
       </w:r>
+      <w:bookmarkEnd w:id="0"/>
     </w:p>
     <w:p>
       <w:r>
@@ -72,7 +767,7 @@
     </w:p>
     <w:p>
       <w:pPr>
-        <w:pStyle w:val="11"/>
+        <w:pStyle w:val="12"/>
         <w:ind w:left="360"/>
       </w:pPr>
       <w:r>
@@ -81,7 +776,7 @@
     </w:p>
     <w:p>
       <w:pPr>
-        <w:pStyle w:val="11"/>
+        <w:pStyle w:val="12"/>
         <w:ind w:left="360"/>
       </w:pPr>
       <w:r>
@@ -90,7 +785,7 @@
     </w:p>
     <w:p>
       <w:pPr>
-        <w:pStyle w:val="11"/>
+        <w:pStyle w:val="12"/>
         <w:ind w:left="360"/>
       </w:pPr>
       <w:r>
@@ -99,139 +794,187 @@
     </w:p>
     <w:p>
       <w:pPr>
-        <w:pStyle w:val="11"/>
-        <w:ind w:left="360"/>
-      </w:pPr>
-    </w:p>
-    <w:p>
-      <w:pPr>
-        <w:pStyle w:val="11"/>
-        <w:ind w:left="360"/>
-      </w:pPr>
-    </w:p>
-    <w:p>
-      <w:pPr>
-        <w:pStyle w:val="11"/>
-        <w:ind w:left="360"/>
-      </w:pPr>
-    </w:p>
-    <w:p>
-      <w:pPr>
-        <w:pStyle w:val="11"/>
-        <w:ind w:left="360"/>
-      </w:pPr>
-    </w:p>
-    <w:p>
-      <w:pPr>
-        <w:pStyle w:val="11"/>
-        <w:ind w:left="360"/>
-      </w:pPr>
-    </w:p>
-    <w:p>
-      <w:pPr>
-        <w:pStyle w:val="11"/>
-        <w:ind w:left="360"/>
-      </w:pPr>
-    </w:p>
-    <w:p>
-      <w:pPr>
-        <w:pStyle w:val="11"/>
-        <w:ind w:left="360"/>
-      </w:pPr>
-    </w:p>
-    <w:p>
-      <w:pPr>
-        <w:pStyle w:val="11"/>
-        <w:ind w:left="360"/>
-      </w:pPr>
-    </w:p>
-    <w:p>
-      <w:pPr>
-        <w:pStyle w:val="11"/>
-        <w:ind w:left="360"/>
-      </w:pPr>
-    </w:p>
-    <w:p>
-      <w:pPr>
-        <w:pStyle w:val="11"/>
-        <w:ind w:left="360"/>
-      </w:pPr>
-    </w:p>
-    <w:p>
-      <w:pPr>
-        <w:pStyle w:val="11"/>
-        <w:ind w:left="360"/>
-      </w:pPr>
-    </w:p>
-    <w:p>
-      <w:pPr>
-        <w:pStyle w:val="11"/>
-        <w:ind w:left="360"/>
-      </w:pPr>
-    </w:p>
-    <w:p>
-      <w:pPr>
-        <w:pStyle w:val="11"/>
-        <w:ind w:left="360"/>
-      </w:pPr>
-    </w:p>
-    <w:p>
-      <w:pPr>
-        <w:pStyle w:val="11"/>
-        <w:ind w:left="360"/>
-      </w:pPr>
-    </w:p>
-    <w:p>
-      <w:pPr>
-        <w:pStyle w:val="11"/>
-        <w:ind w:left="360"/>
-      </w:pPr>
-    </w:p>
-    <w:p>
-      <w:pPr>
-        <w:pStyle w:val="11"/>
-        <w:ind w:left="360"/>
-      </w:pPr>
-    </w:p>
-    <w:p>
-      <w:pPr>
-        <w:pStyle w:val="11"/>
-        <w:ind w:left="360"/>
-      </w:pPr>
-    </w:p>
-    <w:p>
-      <w:pPr>
-        <w:pStyle w:val="11"/>
-        <w:ind w:left="360"/>
-      </w:pPr>
-    </w:p>
-    <w:p>
-      <w:pPr>
-        <w:pStyle w:val="11"/>
-        <w:ind w:left="360"/>
-      </w:pPr>
-    </w:p>
-    <w:p>
-      <w:pPr>
-        <w:pStyle w:val="11"/>
-        <w:ind w:left="360"/>
-      </w:pPr>
-    </w:p>
-    <w:p>
-      <w:pPr>
-        <w:pStyle w:val="11"/>
-        <w:ind w:left="360"/>
-      </w:pPr>
-    </w:p>
-    <w:p>
-      <w:pPr>
-        <w:pStyle w:val="11"/>
-        <w:ind w:left="360"/>
-      </w:pPr>
-    </w:p>
-    <w:p>
-      <w:pPr>
-        <w:pStyle w:val="11"/>
+        <w:pStyle w:val="12"/>
+        <w:ind w:left="360"/>
+      </w:pPr>
+    </w:p>
+    <w:p>
+      <w:pPr>
+        <w:pStyle w:val="12"/>
+        <w:ind w:left="360"/>
+      </w:pPr>
+    </w:p>
+    <w:p>
+      <w:pPr>
+        <w:pStyle w:val="12"/>
+        <w:ind w:left="360"/>
+      </w:pPr>
+    </w:p>
+    <w:p>
+      <w:pPr>
+        <w:pStyle w:val="12"/>
+        <w:ind w:left="360"/>
+      </w:pPr>
+    </w:p>
+    <w:p>
+      <w:pPr>
+        <w:pStyle w:val="12"/>
+        <w:ind w:left="360"/>
+      </w:pPr>
+    </w:p>
+    <w:p>
+      <w:pPr>
+        <w:pStyle w:val="12"/>
+        <w:ind w:left="360"/>
+      </w:pPr>
+    </w:p>
+    <w:p>
+      <w:pPr>
+        <w:pStyle w:val="12"/>
+        <w:ind w:left="360"/>
+      </w:pPr>
+    </w:p>
+    <w:p>
+      <w:pPr>
+        <w:pStyle w:val="12"/>
+        <w:ind w:left="360"/>
+      </w:pPr>
+    </w:p>
+    <w:p>
+      <w:pPr>
+        <w:pStyle w:val="12"/>
+        <w:ind w:left="360"/>
+      </w:pPr>
+    </w:p>
+    <w:p>
+      <w:pPr>
+        <w:pStyle w:val="12"/>
+        <w:ind w:left="360"/>
+      </w:pPr>
+    </w:p>
+    <w:p>
+      <w:pPr>
+        <w:pStyle w:val="12"/>
+        <w:ind w:left="360"/>
+      </w:pPr>
+    </w:p>
+    <w:p>
+      <w:pPr>
+        <w:pStyle w:val="12"/>
+        <w:ind w:left="360"/>
+      </w:pPr>
+    </w:p>
+    <w:p>
+      <w:pPr>
+        <w:pStyle w:val="12"/>
+        <w:ind w:left="360"/>
+      </w:pPr>
+    </w:p>
+    <w:p>
+      <w:pPr>
+        <w:pStyle w:val="12"/>
+        <w:ind w:left="360"/>
+      </w:pPr>
+    </w:p>
+    <w:p>
+      <w:pPr>
+        <w:pStyle w:val="12"/>
+        <w:ind w:left="360"/>
+      </w:pPr>
+    </w:p>
+    <w:p>
+      <w:pPr>
+        <w:pStyle w:val="12"/>
+        <w:ind w:left="360"/>
+      </w:pPr>
+    </w:p>
+    <w:p>
+      <w:pPr>
+        <w:pStyle w:val="12"/>
+        <w:ind w:left="360"/>
+      </w:pPr>
+    </w:p>
+    <w:p>
+      <w:pPr>
+        <w:pStyle w:val="12"/>
+        <w:ind w:left="360"/>
+      </w:pPr>
+    </w:p>
+    <w:p>
+      <w:pPr>
+        <w:pStyle w:val="12"/>
+        <w:ind w:left="360"/>
+      </w:pPr>
+    </w:p>
+    <w:p>
+      <w:pPr>
+        <w:pStyle w:val="12"/>
+        <w:ind w:left="360"/>
+      </w:pPr>
+    </w:p>
+    <w:p>
+      <w:pPr>
+        <w:pStyle w:val="12"/>
+        <w:ind w:left="360"/>
+      </w:pPr>
+    </w:p>
+    <w:p>
+      <w:pPr>
+        <w:pStyle w:val="12"/>
+        <w:ind w:left="360"/>
+      </w:pPr>
+    </w:p>
+    <w:p>
+      <w:pPr>
+        <w:pStyle w:val="12"/>
+        <w:ind w:left="360"/>
+      </w:pPr>
+    </w:p>
+    <w:p>
+      <w:pPr>
+        <w:pStyle w:val="12"/>
+        <w:ind w:left="360"/>
+      </w:pPr>
+    </w:p>
+    <w:p>
+      <w:pPr>
+        <w:pStyle w:val="12"/>
+        <w:ind w:left="360"/>
+      </w:pPr>
+    </w:p>
+    <w:p>
+      <w:pPr>
+        <w:pStyle w:val="12"/>
+        <w:ind w:left="360"/>
+      </w:pPr>
+    </w:p>
+    <w:p>
+      <w:pPr>
+        <w:pStyle w:val="12"/>
+        <w:ind w:left="360"/>
+      </w:pPr>
+    </w:p>
+    <w:p>
+      <w:pPr>
+        <w:pStyle w:val="12"/>
+        <w:ind w:left="360"/>
+      </w:pPr>
+    </w:p>
+    <w:p>
+      <w:pPr>
+        <w:pStyle w:val="12"/>
+        <w:ind w:left="360"/>
+      </w:pPr>
+    </w:p>
+    <w:p>
+      <w:pPr>
+        <w:pStyle w:val="12"/>
+        <w:ind w:left="360"/>
+      </w:pPr>
+    </w:p>
+    <w:p>
+      <w:pPr>
+        <w:pStyle w:val="12"/>
         <w:ind w:left="360"/>
       </w:pPr>
     </w:p>
@@ -239,9 +982,11 @@
       <w:pPr>
         <w:pStyle w:val="2"/>
       </w:pPr>
+      <w:bookmarkStart w:id="1" w:name="_Toc206092538"/>
       <w:r>
         <w:t>2. Membuat Akun</w:t>
       </w:r>
+      <w:bookmarkEnd w:id="1"/>
     </w:p>
     <w:p>
       <w:r>
@@ -556,9 +1301,11 @@
       <w:pPr>
         <w:pStyle w:val="2"/>
       </w:pPr>
+      <w:bookmarkStart w:id="2" w:name="_Toc1882144265"/>
       <w:r>
         <w:t>3. Masuk dan Keluar Akun</w:t>
       </w:r>
+      <w:bookmarkEnd w:id="2"/>
     </w:p>
     <w:p>
       <w:r>
@@ -686,9 +1433,11 @@
       <w:pPr>
         <w:pStyle w:val="2"/>
       </w:pPr>
+      <w:bookmarkStart w:id="3" w:name="_Toc1403974640"/>
       <w:r>
         <w:t>4. Halaman Utama (Data NIAS)</w:t>
       </w:r>
+      <w:bookmarkEnd w:id="3"/>
     </w:p>
     <w:p>
       <w:pPr>
@@ -753,7 +1502,7 @@
     </w:p>
     <w:p>
       <w:pPr>
-        <w:pStyle w:val="11"/>
+        <w:pStyle w:val="12"/>
         <w:ind w:left="360"/>
       </w:pPr>
       <w:r>
@@ -762,7 +1511,7 @@
     </w:p>
     <w:p>
       <w:pPr>
-        <w:pStyle w:val="11"/>
+        <w:pStyle w:val="12"/>
         <w:ind w:left="360"/>
       </w:pPr>
       <w:r>
@@ -771,7 +1520,7 @@
     </w:p>
     <w:p>
       <w:pPr>
-        <w:pStyle w:val="11"/>
+        <w:pStyle w:val="12"/>
         <w:ind w:left="360"/>
       </w:pPr>
       <w:r>
@@ -803,9 +1552,11 @@
       <w:pPr>
         <w:pStyle w:val="2"/>
       </w:pPr>
+      <w:bookmarkStart w:id="4" w:name="_Toc1471381638"/>
       <w:r>
         <w:t>5. Mendaftarkan Atlet Baru</w:t>
       </w:r>
+      <w:bookmarkEnd w:id="4"/>
     </w:p>
     <w:p>
       <w:r>
@@ -875,7 +1626,7 @@
     </w:p>
     <w:p>
       <w:pPr>
-        <w:pStyle w:val="11"/>
+        <w:pStyle w:val="12"/>
         <w:ind w:left="360"/>
       </w:pPr>
       <w:r>
@@ -884,7 +1635,7 @@
     </w:p>
     <w:p>
       <w:pPr>
-        <w:pStyle w:val="11"/>
+        <w:pStyle w:val="12"/>
         <w:ind w:left="360"/>
       </w:pPr>
       <w:r>
@@ -893,7 +1644,7 @@
     </w:p>
     <w:p>
       <w:pPr>
-        <w:pStyle w:val="11"/>
+        <w:pStyle w:val="12"/>
         <w:ind w:left="360"/>
       </w:pPr>
       <w:r>
@@ -902,7 +1653,7 @@
     </w:p>
     <w:p>
       <w:pPr>
-        <w:pStyle w:val="11"/>
+        <w:pStyle w:val="12"/>
         <w:ind w:left="360"/>
       </w:pPr>
       <w:r>
@@ -974,9 +1725,11 @@
       <w:pPr>
         <w:pStyle w:val="2"/>
       </w:pPr>
+      <w:bookmarkStart w:id="5" w:name="_Toc779474862"/>
       <w:r>
         <w:t>6. Data Berhasil Disimpan</w:t>
       </w:r>
+      <w:bookmarkEnd w:id="5"/>
     </w:p>
     <w:p>
       <w:pPr>
@@ -1099,9 +1852,11 @@
       <w:pPr>
         <w:pStyle w:val="2"/>
       </w:pPr>
+      <w:bookmarkStart w:id="6" w:name="_Toc397457170"/>
       <w:r>
         <w:t>7. Update / Perpanjang NIAS</w:t>
       </w:r>
+      <w:bookmarkEnd w:id="6"/>
     </w:p>
     <w:p>
       <w:r>
@@ -1247,7 +2002,7 @@
           <w:sz w:val="22"/>
         </w:rPr>
         <w:pict>
-          <v:rect id="_x0000_s1026" o:spid="_x0000_s1026" o:spt="1" style="position:absolute;left:0pt;margin-left:224.55pt;margin-top:148.15pt;height:10pt;width:61.6pt;z-index:251659264;mso-width-relative:page;mso-height-relative:page;" fillcolor="#FFFFFF" filled="t" stroked="t" coordsize="21600,21600">
+          <v:rect id="_x0000_s1026" o:spid="_x0000_s1026" o:spt="1" style="position:absolute;left:0pt;margin-left:0pt;margin-top:0pt;height:10pt;width:0pt;z-index:251659264;mso-width-relative:page;mso-height-relative:page;" fillcolor="#FFFFFF" filled="t" stroked="t" coordsize="21600,21600">
             <v:path/>
             <v:fill on="t" focussize="0,0"/>
             <v:stroke color="#000000"/>
@@ -1261,7 +2016,7 @@
           <w:sz w:val="22"/>
         </w:rPr>
         <w:pict>
-          <v:rect id="_x0000_s1032" o:spid="_x0000_s1032" o:spt="1" style="position:absolute;left:0pt;margin-left:147.15pt;margin-top:147.35pt;height:10.75pt;width:39.9pt;z-index:251662336;mso-width-relative:page;mso-height-relative:page;" fillcolor="#FFFFFF" filled="t" stroked="t" coordsize="21600,21600">
+          <v:rect id="_x0000_s1032" o:spid="_x0000_s1032" o:spt="1" style="position:absolute;left:0pt;margin-left:0pt;margin-top:0pt;height:0pt;width:0pt;z-index:251662336;mso-width-relative:page;mso-height-relative:page;" fillcolor="#FFFFFF" filled="t" stroked="t" coordsize="21600,21600">
             <v:path/>
             <v:fill on="t" focussize="0,0"/>
             <v:stroke color="#000000"/>
@@ -1275,7 +2030,7 @@
           <w:sz w:val="22"/>
         </w:rPr>
         <w:pict>
-          <v:rect id="_x0000_s1031" o:spid="_x0000_s1031" o:spt="1" style="position:absolute;left:0pt;margin-left:188.7pt;margin-top:180.7pt;height:7.5pt;width:20pt;z-index:251661312;mso-width-relative:page;mso-height-relative:page;" fillcolor="#FFFFFF" filled="t" stroked="t" coordsize="21600,21600">
+          <v:rect id="_x0000_s1031" o:spid="_x0000_s1031" o:spt="1" style="position:absolute;left:0pt;margin-left:0pt;margin-top:0pt;height:0pt;width:20pt;z-index:251661312;mso-width-relative:page;mso-height-relative:page;" fillcolor="#FFFFFF" filled="t" stroked="t" coordsize="21600,21600">
             <v:path/>
             <v:fill on="t" focussize="0,0"/>
             <v:stroke color="#000000"/>
@@ -1289,7 +2044,7 @@
           <w:sz w:val="22"/>
         </w:rPr>
         <w:pict>
-          <v:rect id="_x0000_s1030" o:spid="_x0000_s1030" o:spt="1" style="position:absolute;left:0pt;margin-left:101.2pt;margin-top:149pt;height:7.5pt;width:21.7pt;z-index:251660288;mso-width-relative:page;mso-height-relative:page;" fillcolor="#FFFFFF" filled="t" stroked="t" coordsize="21600,21600">
+          <v:rect id="_x0000_s1030" o:spid="_x0000_s1030" o:spt="1" style="position:absolute;left:0pt;margin-left:0pt;margin-top:149pt;height:0pt;width:0pt;z-index:251660288;mso-width-relative:page;mso-height-relative:page;" fillcolor="#FFFFFF" filled="t" stroked="t" coordsize="21600,21600">
             <v:path/>
             <v:fill on="t" focussize="0,0"/>
             <v:stroke color="#000000"/>
@@ -1302,8 +2057,8 @@
         <w:drawing>
           <wp:inline distT="0" distB="0" distL="0" distR="0">
             <wp:extent cx="4859655" cy="4062730"/>
-            <wp:effectExtent l="0" t="0" r="0" b="0"/>
-            <wp:docPr id="12" name="Picture 12"/>
+            <wp:effectExtent l="0" t="0" r="17145" b="13970"/>
+            <wp:docPr id="12" name="Picture 12" descr="/home/adit/Documents/Picture15.pngPicture15"/>
             <wp:cNvGraphicFramePr>
               <a:graphicFrameLocks xmlns:a="http://schemas.openxmlformats.org/drawingml/2006/main" noChangeAspect="1"/>
             </wp:cNvGraphicFramePr>
@@ -1311,13 +2066,14 @@
               <a:graphicData uri="http://schemas.openxmlformats.org/drawingml/2006/picture">
                 <pic:pic xmlns:pic="http://schemas.openxmlformats.org/drawingml/2006/picture">
                   <pic:nvPicPr>
-                    <pic:cNvPr id="12" name="Picture 12"/>
+                    <pic:cNvPr id="12" name="Picture 12" descr="/home/adit/Documents/Picture15.pngPicture15"/>
                     <pic:cNvPicPr>
                       <a:picLocks noChangeAspect="1"/>
                     </pic:cNvPicPr>
                   </pic:nvPicPr>
                   <pic:blipFill>
                     <a:blip r:embed="rId16"/>
+                    <a:srcRect t="7" b="7"/>
                     <a:stretch>
                       <a:fillRect/>
                     </a:stretch>
@@ -1325,7 +2081,7 @@
                   <pic:spPr>
                     <a:xfrm>
                       <a:off x="0" y="0"/>
-                      <a:ext cx="4860000" cy="4063106"/>
+                      <a:ext cx="4859655" cy="4063106"/>
                     </a:xfrm>
                     <a:prstGeom prst="rect">
                       <a:avLst/>
@@ -1372,7 +2128,7 @@
           <w:sz w:val="22"/>
         </w:rPr>
         <w:pict>
-          <v:rect id="_x0000_s1036" o:spid="_x0000_s1036" o:spt="1" style="position:absolute;left:0pt;margin-left:188.9pt;margin-top:180.6pt;height:10pt;width:21.25pt;z-index:251666432;mso-width-relative:page;mso-height-relative:page;" fillcolor="#FFFFFF" filled="t" stroked="t" coordsize="21600,21600">
+          <v:rect id="_x0000_s1036" o:spid="_x0000_s1036" o:spt="1" style="position:absolute;left:0pt;margin-left:0pt;margin-top:0pt;height:10pt;width:0pt;z-index:251665408;mso-width-relative:page;mso-height-relative:page;" fillcolor="#FFFFFF" filled="t" stroked="t" coordsize="21600,21600">
             <v:path/>
             <v:fill on="t" focussize="0,0"/>
             <v:stroke color="#000000"/>
@@ -1386,7 +2142,7 @@
           <w:sz w:val="22"/>
         </w:rPr>
         <w:pict>
-          <v:rect id="_x0000_s1035" o:spid="_x0000_s1035" o:spt="1" style="position:absolute;left:0pt;margin-left:223.9pt;margin-top:148.75pt;height:9.35pt;width:61.25pt;z-index:251665408;mso-width-relative:page;mso-height-relative:page;" fillcolor="#FFFFFF" filled="t" stroked="t" coordsize="21600,21600">
+          <v:rect id="_x0000_s1035" o:spid="_x0000_s1035" o:spt="1" style="position:absolute;left:0pt;margin-left:0pt;margin-top:0pt;height:0pt;width:0pt;z-index:251664384;mso-width-relative:page;mso-height-relative:page;" fillcolor="#FFFFFF" filled="t" stroked="t" coordsize="21600,21600">
             <v:path/>
             <v:fill on="t" focussize="0,0"/>
             <v:stroke color="#000000"/>
@@ -1400,7 +2156,7 @@
           <w:sz w:val="22"/>
         </w:rPr>
         <w:pict>
-          <v:rect id="_x0000_s1034" o:spid="_x0000_s1034" o:spt="1" style="position:absolute;left:0pt;margin-left:145.8pt;margin-top:149.35pt;height:10pt;width:50pt;z-index:251664384;mso-width-relative:page;mso-height-relative:page;" fillcolor="#FFFFFF" filled="t" stroked="t" coordsize="21600,21600">
+          <v:rect id="_x0000_s1033" o:spid="_x0000_s1033" o:spt="1" style="position:absolute;left:0pt;margin-left:0pt;margin-top:0pt;height:0pt;width:0pt;z-index:251663360;mso-width-relative:page;mso-height-relative:page;" fillcolor="#FFFFFF" filled="t" stroked="t" coordsize="21600,21600">
             <v:path/>
             <v:fill on="t" focussize="0,0"/>
             <v:stroke color="#000000"/>
@@ -1410,25 +2166,11 @@
         </w:pict>
       </w:r>
       <w:r>
-        <w:rPr>
-          <w:sz w:val="22"/>
-        </w:rPr>
-        <w:pict>
-          <v:rect id="_x0000_s1033" o:spid="_x0000_s1033" o:spt="1" style="position:absolute;left:0pt;margin-left:102.65pt;margin-top:148.75pt;height:9.35pt;width:19.4pt;z-index:251663360;mso-width-relative:page;mso-height-relative:page;" fillcolor="#FFFFFF" filled="t" stroked="t" coordsize="21600,21600">
-            <v:path/>
-            <v:fill on="t" focussize="0,0"/>
-            <v:stroke color="#000000"/>
-            <v:imagedata o:title=""/>
-            <o:lock v:ext="edit" aspectratio="f"/>
-          </v:rect>
-        </w:pict>
-      </w:r>
-      <w:r>
         <w:drawing>
           <wp:inline distT="0" distB="0" distL="0" distR="0">
             <wp:extent cx="4859655" cy="4062730"/>
-            <wp:effectExtent l="0" t="0" r="0" b="0"/>
-            <wp:docPr id="13" name="Picture 13"/>
+            <wp:effectExtent l="0" t="0" r="17145" b="13970"/>
+            <wp:docPr id="13" name="Picture 13" descr="/home/adit/Documents/Picture14.pngPicture14"/>
             <wp:cNvGraphicFramePr>
               <a:graphicFrameLocks xmlns:a="http://schemas.openxmlformats.org/drawingml/2006/main" noChangeAspect="1"/>
             </wp:cNvGraphicFramePr>
@@ -1436,13 +2178,14 @@
               <a:graphicData uri="http://schemas.openxmlformats.org/drawingml/2006/picture">
                 <pic:pic xmlns:pic="http://schemas.openxmlformats.org/drawingml/2006/picture">
                   <pic:nvPicPr>
-                    <pic:cNvPr id="13" name="Picture 13"/>
+                    <pic:cNvPr id="13" name="Picture 13" descr="/home/adit/Documents/Picture14.pngPicture14"/>
                     <pic:cNvPicPr>
                       <a:picLocks noChangeAspect="1"/>
                     </pic:cNvPicPr>
                   </pic:nvPicPr>
                   <pic:blipFill>
                     <a:blip r:embed="rId17"/>
+                    <a:srcRect t="7" b="7"/>
                     <a:stretch>
                       <a:fillRect/>
                     </a:stretch>
@@ -1450,7 +2193,7 @@
                   <pic:spPr>
                     <a:xfrm>
                       <a:off x="0" y="0"/>
-                      <a:ext cx="4860000" cy="4063106"/>
+                      <a:ext cx="4859655" cy="4063106"/>
                     </a:xfrm>
                     <a:prstGeom prst="rect">
                       <a:avLst/>
@@ -1497,7 +2240,7 @@
           <w:sz w:val="22"/>
         </w:rPr>
         <w:pict>
-          <v:rect id="_x0000_s1040" o:spid="_x0000_s1040" o:spt="1" style="position:absolute;left:0pt;margin-left:187.7pt;margin-top:180.8pt;height:8.75pt;width:21.2pt;z-index:251670528;mso-width-relative:page;mso-height-relative:page;" fillcolor="#FFFFFF" filled="t" stroked="t" coordsize="21600,21600">
+          <v:rect id="_x0000_s1040" o:spid="_x0000_s1040" o:spt="1" style="position:absolute;left:0pt;margin-left:0pt;margin-top:0pt;height:0pt;width:0pt;z-index:251669504;mso-width-relative:page;mso-height-relative:page;" fillcolor="#FFFFFF" filled="t" stroked="t" coordsize="21600,21600">
             <v:path/>
             <v:fill on="t" focussize="0,0"/>
             <v:stroke color="#000000"/>
@@ -1511,7 +2254,7 @@
           <w:sz w:val="22"/>
         </w:rPr>
         <w:pict>
-          <v:rect id="_x0000_s1039" o:spid="_x0000_s1039" o:spt="1" style="position:absolute;left:0pt;margin-left:102.05pt;margin-top:148.3pt;height:8.75pt;width:20.6pt;z-index:251669504;mso-width-relative:page;mso-height-relative:page;" fillcolor="#FFFFFF" filled="t" stroked="t" coordsize="21600,21600">
+          <v:rect id="_x0000_s1039" o:spid="_x0000_s1039" o:spt="1" style="position:absolute;left:0pt;margin-left:0pt;margin-top:0pt;height:0pt;width:0pt;z-index:251668480;mso-width-relative:page;mso-height-relative:page;" fillcolor="#FFFFFF" filled="t" stroked="t" coordsize="21600,21600">
             <v:path/>
             <v:fill on="t" focussize="0,0"/>
             <v:stroke color="#000000"/>
@@ -1525,7 +2268,7 @@
           <w:sz w:val="22"/>
         </w:rPr>
         <w:pict>
-          <v:rect id="_x0000_s1038" o:spid="_x0000_s1038" o:spt="1" style="position:absolute;left:0pt;margin-left:145.15pt;margin-top:148.9pt;height:8.15pt;width:44.4pt;z-index:251668480;mso-width-relative:page;mso-height-relative:page;" fillcolor="#FFFFFF" filled="t" stroked="t" coordsize="21600,21600">
+          <v:rect id="_x0000_s1038" o:spid="_x0000_s1038" o:spt="1" style="position:absolute;left:0pt;margin-left:0pt;margin-top:0pt;height:0pt;width:0pt;z-index:251667456;mso-width-relative:page;mso-height-relative:page;" fillcolor="#FFFFFF" filled="t" stroked="t" coordsize="21600,21600">
             <v:path/>
             <v:fill on="t" focussize="0,0"/>
             <v:stroke color="#000000"/>
@@ -1539,7 +2282,7 @@
           <w:sz w:val="22"/>
         </w:rPr>
         <w:pict>
-          <v:rect id="_x0000_s1037" o:spid="_x0000_s1037" o:spt="1" style="position:absolute;left:0pt;margin-left:223.3pt;margin-top:147.05pt;height:10pt;width:65.6pt;z-index:251667456;mso-width-relative:page;mso-height-relative:page;" fillcolor="#FFFFFF" filled="t" stroked="t" coordsize="21600,21600">
+          <v:rect id="_x0000_s1037" o:spid="_x0000_s1037" o:spt="1" style="position:absolute;left:0pt;margin-left:0pt;margin-top:0pt;height:10pt;width:0pt;z-index:251666432;mso-width-relative:page;mso-height-relative:page;" fillcolor="#FFFFFF" filled="t" stroked="t" coordsize="21600,21600">
             <v:path/>
             <v:fill on="t" focussize="0,0"/>
             <v:stroke color="#000000"/>
@@ -1552,8 +2295,8 @@
         <w:drawing>
           <wp:inline distT="0" distB="0" distL="0" distR="0">
             <wp:extent cx="4859655" cy="4749800"/>
-            <wp:effectExtent l="0" t="0" r="0" b="0"/>
-            <wp:docPr id="14" name="Picture 14"/>
+            <wp:effectExtent l="0" t="0" r="17145" b="12700"/>
+            <wp:docPr id="14" name="Picture 14" descr="/home/adit/Documents/Picture13.pngPicture13"/>
             <wp:cNvGraphicFramePr>
               <a:graphicFrameLocks xmlns:a="http://schemas.openxmlformats.org/drawingml/2006/main" noChangeAspect="1"/>
             </wp:cNvGraphicFramePr>
@@ -1561,13 +2304,14 @@
               <a:graphicData uri="http://schemas.openxmlformats.org/drawingml/2006/picture">
                 <pic:pic xmlns:pic="http://schemas.openxmlformats.org/drawingml/2006/picture">
                   <pic:nvPicPr>
-                    <pic:cNvPr id="14" name="Picture 14"/>
+                    <pic:cNvPr id="14" name="Picture 14" descr="/home/adit/Documents/Picture13.pngPicture13"/>
                     <pic:cNvPicPr>
                       <a:picLocks noChangeAspect="1"/>
                     </pic:cNvPicPr>
                   </pic:nvPicPr>
                   <pic:blipFill>
                     <a:blip r:embed="rId18"/>
+                    <a:srcRect l="7" r="7"/>
                     <a:stretch>
                       <a:fillRect/>
                     </a:stretch>
@@ -1575,7 +2319,7 @@
                   <pic:spPr>
                     <a:xfrm>
                       <a:off x="0" y="0"/>
-                      <a:ext cx="4860000" cy="4749902"/>
+                      <a:ext cx="4860000" cy="4749800"/>
                     </a:xfrm>
                     <a:prstGeom prst="rect">
                       <a:avLst/>
@@ -1641,7 +2385,7 @@
           <w:sz w:val="22"/>
         </w:rPr>
         <w:pict>
-          <v:rect id="_x0000_s1044" o:spid="_x0000_s1044" o:spt="1" style="position:absolute;left:0pt;margin-left:189.55pt;margin-top:160.1pt;height:8.75pt;width:20pt;z-index:251674624;mso-width-relative:page;mso-height-relative:page;" fillcolor="#FFFFFF" filled="t" stroked="t" coordsize="21600,21600">
+          <v:rect id="_x0000_s1044" o:spid="_x0000_s1044" o:spt="1" style="position:absolute;left:0pt;margin-left:0pt;margin-top:0pt;height:0pt;width:20pt;z-index:251673600;mso-width-relative:page;mso-height-relative:page;" fillcolor="#FFFFFF" filled="t" stroked="t" coordsize="21600,21600">
             <v:path/>
             <v:fill on="t" focussize="0,0"/>
             <v:stroke color="#000000"/>
@@ -1655,7 +2399,7 @@
           <w:sz w:val="22"/>
         </w:rPr>
         <w:pict>
-          <v:rect id="_x0000_s1043" o:spid="_x0000_s1043" o:spt="1" style="position:absolute;left:0pt;margin-left:220.15pt;margin-top:127.6pt;height:8.15pt;width:41.9pt;z-index:251673600;mso-width-relative:page;mso-height-relative:page;" fillcolor="#FFFFFF" filled="t" stroked="t" coordsize="21600,21600">
+          <v:rect id="_x0000_s1043" o:spid="_x0000_s1043" o:spt="1" style="position:absolute;left:0pt;margin-left:0pt;margin-top:0pt;height:0pt;width:0pt;z-index:251672576;mso-width-relative:page;mso-height-relative:page;" fillcolor="#FFFFFF" filled="t" stroked="t" coordsize="21600,21600">
             <v:path/>
             <v:fill on="t" focussize="0,0"/>
             <v:stroke color="#000000"/>
@@ -1669,7 +2413,7 @@
           <w:sz w:val="22"/>
         </w:rPr>
         <w:pict>
-          <v:rect id="_x0000_s1042" o:spid="_x0000_s1042" o:spt="1" style="position:absolute;left:0pt;margin-left:100.15pt;margin-top:126.35pt;height:8.75pt;width:22.5pt;z-index:251672576;mso-width-relative:page;mso-height-relative:page;" fillcolor="#FFFFFF" filled="t" stroked="t" coordsize="21600,21600">
+          <v:rect id="_x0000_s1042" o:spid="_x0000_s1042" o:spt="1" style="position:absolute;left:0pt;margin-left:0pt;margin-top:0pt;height:0pt;width:0pt;z-index:251671552;mso-width-relative:page;mso-height-relative:page;" fillcolor="#FFFFFF" filled="t" stroked="t" coordsize="21600,21600">
             <v:path/>
             <v:fill on="t" focussize="0,0"/>
             <v:stroke color="#000000"/>
@@ -1683,7 +2427,7 @@
           <w:sz w:val="22"/>
         </w:rPr>
         <w:pict>
-          <v:rect id="_x0000_s1041" o:spid="_x0000_s1041" o:spt="1" style="position:absolute;left:0pt;margin-left:143.3pt;margin-top:126.35pt;height:10pt;width:40.6pt;z-index:251671552;mso-width-relative:page;mso-height-relative:page;" fillcolor="#FFFFFF" filled="t" stroked="t" coordsize="21600,21600">
+          <v:rect id="_x0000_s1041" o:spid="_x0000_s1041" o:spt="1" style="position:absolute;left:0pt;margin-left:0pt;margin-top:0pt;height:10pt;width:0pt;z-index:251670528;mso-width-relative:page;mso-height-relative:page;" fillcolor="#FFFFFF" filled="t" stroked="t" coordsize="21600,21600">
             <v:path/>
             <v:fill on="t" focussize="0,0"/>
             <v:stroke color="#000000"/>
@@ -1696,8 +2440,8 @@
         <w:drawing>
           <wp:inline distT="0" distB="0" distL="0" distR="0">
             <wp:extent cx="4859655" cy="4749800"/>
-            <wp:effectExtent l="0" t="0" r="0" b="0"/>
-            <wp:docPr id="15" name="Picture 15"/>
+            <wp:effectExtent l="0" t="0" r="17145" b="12700"/>
+            <wp:docPr id="15" name="Picture 15" descr="/home/adit/Documents/Picture12.pngPicture12"/>
             <wp:cNvGraphicFramePr>
               <a:graphicFrameLocks xmlns:a="http://schemas.openxmlformats.org/drawingml/2006/main" noChangeAspect="1"/>
             </wp:cNvGraphicFramePr>
@@ -1705,13 +2449,14 @@
               <a:graphicData uri="http://schemas.openxmlformats.org/drawingml/2006/picture">
                 <pic:pic xmlns:pic="http://schemas.openxmlformats.org/drawingml/2006/picture">
                   <pic:nvPicPr>
-                    <pic:cNvPr id="15" name="Picture 15"/>
+                    <pic:cNvPr id="15" name="Picture 15" descr="/home/adit/Documents/Picture12.pngPicture12"/>
                     <pic:cNvPicPr>
                       <a:picLocks noChangeAspect="1"/>
                     </pic:cNvPicPr>
                   </pic:nvPicPr>
                   <pic:blipFill>
                     <a:blip r:embed="rId19"/>
+                    <a:srcRect l="7" r="7"/>
                     <a:stretch>
                       <a:fillRect/>
                     </a:stretch>
@@ -1719,7 +2464,7 @@
                   <pic:spPr>
                     <a:xfrm>
                       <a:off x="0" y="0"/>
-                      <a:ext cx="4860000" cy="4749902"/>
+                      <a:ext cx="4860000" cy="4749800"/>
                     </a:xfrm>
                     <a:prstGeom prst="rect">
                       <a:avLst/>
@@ -1868,9 +2613,11 @@
       <w:pPr>
         <w:pStyle w:val="2"/>
       </w:pPr>
+      <w:bookmarkStart w:id="7" w:name="_Toc1564085149"/>
       <w:r>
         <w:t>8. Konfirmasi dan Hasil Update</w:t>
       </w:r>
+      <w:bookmarkEnd w:id="7"/>
     </w:p>
     <w:p>
       <w:r>
@@ -1886,7 +2633,7 @@
           <w:sz w:val="22"/>
         </w:rPr>
         <w:pict>
-          <v:rect id="_x0000_s1046" o:spid="_x0000_s1046" o:spt="1" style="position:absolute;left:0pt;margin-left:205.15pt;margin-top:126.95pt;height:8.15pt;width:61.9pt;z-index:251676672;mso-width-relative:page;mso-height-relative:page;" fillcolor="#FFFFFF" filled="t" stroked="t" coordsize="21600,21600">
+          <v:rect id="_x0000_s1046" o:spid="_x0000_s1046" o:spt="1" style="position:absolute;left:0pt;margin-left:0pt;margin-top:0pt;height:0pt;width:0pt;z-index:251675648;mso-width-relative:page;mso-height-relative:page;" fillcolor="#FFFFFF" filled="t" stroked="t" coordsize="21600,21600">
             <v:path/>
             <v:fill on="t" focussize="0,0"/>
             <v:stroke color="#000000"/>
@@ -1900,7 +2647,7 @@
           <w:sz w:val="22"/>
         </w:rPr>
         <w:pict>
-          <v:rect id="_x0000_s1045" o:spid="_x0000_s1045" o:spt="1" style="position:absolute;left:0pt;margin-left:87.65pt;margin-top:128.85pt;height:8.1pt;width:95.65pt;z-index:251675648;mso-width-relative:page;mso-height-relative:page;" fillcolor="#FFFFFF" filled="t" stroked="t" coordsize="21600,21600">
+          <v:rect id="_x0000_s1045" o:spid="_x0000_s1045" o:spt="1" style="position:absolute;left:0pt;margin-left:0pt;margin-top:0pt;height:0pt;width:0pt;z-index:251674624;mso-width-relative:page;mso-height-relative:page;" fillcolor="#FFFFFF" filled="t" stroked="t" coordsize="21600,21600">
             <v:path/>
             <v:fill on="t" focussize="0,0"/>
             <v:stroke color="#000000"/>
@@ -1913,8 +2660,8 @@
         <w:drawing>
           <wp:inline distT="0" distB="0" distL="0" distR="0">
             <wp:extent cx="4859655" cy="4749800"/>
-            <wp:effectExtent l="0" t="0" r="0" b="0"/>
-            <wp:docPr id="16" name="Picture 16"/>
+            <wp:effectExtent l="0" t="0" r="17145" b="12700"/>
+            <wp:docPr id="16" name="Picture 16" descr="/home/adit/Documents/Picture11.pngPicture11"/>
             <wp:cNvGraphicFramePr>
               <a:graphicFrameLocks xmlns:a="http://schemas.openxmlformats.org/drawingml/2006/main" noChangeAspect="1"/>
             </wp:cNvGraphicFramePr>
@@ -1922,13 +2669,14 @@
               <a:graphicData uri="http://schemas.openxmlformats.org/drawingml/2006/picture">
                 <pic:pic xmlns:pic="http://schemas.openxmlformats.org/drawingml/2006/picture">
                   <pic:nvPicPr>
-                    <pic:cNvPr id="16" name="Picture 16"/>
+                    <pic:cNvPr id="16" name="Picture 16" descr="/home/adit/Documents/Picture11.pngPicture11"/>
                     <pic:cNvPicPr>
                       <a:picLocks noChangeAspect="1"/>
                     </pic:cNvPicPr>
                   </pic:nvPicPr>
                   <pic:blipFill>
                     <a:blip r:embed="rId20"/>
+                    <a:srcRect l="7" r="7"/>
                     <a:stretch>
                       <a:fillRect/>
                     </a:stretch>
@@ -1936,7 +2684,7 @@
                   <pic:spPr>
                     <a:xfrm>
                       <a:off x="0" y="0"/>
-                      <a:ext cx="4860000" cy="4749902"/>
+                      <a:ext cx="4860000" cy="4749800"/>
                     </a:xfrm>
                     <a:prstGeom prst="rect">
                       <a:avLst/>
@@ -1970,7 +2718,7 @@
           <w:sz w:val="22"/>
         </w:rPr>
         <w:pict>
-          <v:rect id="_x0000_s1048" o:spid="_x0000_s1048" o:spt="1" style="position:absolute;left:0pt;margin-left:103.3pt;margin-top:170.55pt;height:8.15pt;width:26.85pt;z-index:251678720;mso-width-relative:page;mso-height-relative:page;" fillcolor="#FFFFFF" filled="t" stroked="t" coordsize="21600,21600">
+          <v:rect id="_x0000_s1048" o:spid="_x0000_s1048" o:spt="1" style="position:absolute;left:0pt;margin-left:0pt;margin-top:0pt;height:0pt;width:0pt;z-index:251677696;mso-width-relative:page;mso-height-relative:page;" fillcolor="#FFFFFF" filled="t" stroked="t" coordsize="21600,21600">
             <v:path/>
             <v:fill on="t" focussize="0,0"/>
             <v:stroke color="#000000"/>
@@ -1984,7 +2732,7 @@
           <w:sz w:val="22"/>
         </w:rPr>
         <w:pict>
-          <v:rect id="_x0000_s1047" o:spid="_x0000_s1047" o:spt="1" style="position:absolute;left:0pt;margin-left:145.8pt;margin-top:164.95pt;height:8.75pt;width:40.6pt;z-index:251677696;mso-width-relative:page;mso-height-relative:page;" fillcolor="#FFFFFF" filled="t" stroked="t" coordsize="21600,21600">
+          <v:rect id="_x0000_s1047" o:spid="_x0000_s1047" o:spt="1" style="position:absolute;left:0pt;margin-left:0pt;margin-top:0pt;height:0pt;width:0pt;z-index:251676672;mso-width-relative:page;mso-height-relative:page;" fillcolor="#FFFFFF" filled="t" stroked="t" coordsize="21600,21600">
             <v:path/>
             <v:fill on="t" focussize="0,0"/>
             <v:stroke color="#000000"/>
@@ -1997,8 +2745,8 @@
         <w:drawing>
           <wp:inline distT="0" distB="0" distL="0" distR="0">
             <wp:extent cx="4859655" cy="4115435"/>
-            <wp:effectExtent l="0" t="0" r="0" b="0"/>
-            <wp:docPr id="17" name="Picture 17"/>
+            <wp:effectExtent l="0" t="0" r="17145" b="18415"/>
+            <wp:docPr id="17" name="Picture 17" descr="/home/adit/Documents/Picture10.pngPicture10"/>
             <wp:cNvGraphicFramePr>
               <a:graphicFrameLocks xmlns:a="http://schemas.openxmlformats.org/drawingml/2006/main" noChangeAspect="1"/>
             </wp:cNvGraphicFramePr>
@@ -2006,13 +2754,14 @@
               <a:graphicData uri="http://schemas.openxmlformats.org/drawingml/2006/picture">
                 <pic:pic xmlns:pic="http://schemas.openxmlformats.org/drawingml/2006/picture">
                   <pic:nvPicPr>
-                    <pic:cNvPr id="17" name="Picture 17"/>
+                    <pic:cNvPr id="17" name="Picture 17" descr="/home/adit/Documents/Picture10.pngPicture10"/>
                     <pic:cNvPicPr>
                       <a:picLocks noChangeAspect="1"/>
                     </pic:cNvPicPr>
                   </pic:nvPicPr>
                   <pic:blipFill>
                     <a:blip r:embed="rId21"/>
+                    <a:srcRect l="8" r="8"/>
                     <a:stretch>
                       <a:fillRect/>
                     </a:stretch>
@@ -2020,7 +2769,7 @@
                   <pic:spPr>
                     <a:xfrm>
                       <a:off x="0" y="0"/>
-                      <a:ext cx="4860000" cy="4115533"/>
+                      <a:ext cx="4860000" cy="4115435"/>
                     </a:xfrm>
                     <a:prstGeom prst="rect">
                       <a:avLst/>
@@ -2054,7 +2803,7 @@
           <w:sz w:val="22"/>
         </w:rPr>
         <w:pict>
-          <v:rect id="_x0000_s1051" o:spid="_x0000_s1051" o:spt="1" style="position:absolute;left:0pt;margin-left:225.15pt;margin-top:168.45pt;height:11.85pt;width:16.25pt;z-index:251681792;mso-width-relative:page;mso-height-relative:page;" fillcolor="#FFFFFF" filled="t" stroked="t" coordsize="21600,21600">
+          <v:rect id="_x0000_s1051" o:spid="_x0000_s1051" o:spt="1" style="position:absolute;left:0pt;margin-left:0pt;margin-top:0pt;height:0pt;width:0pt;z-index:251680768;mso-width-relative:page;mso-height-relative:page;" fillcolor="#FFFFFF" filled="t" stroked="t" coordsize="21600,21600">
             <v:path/>
             <v:fill on="t" focussize="0,0"/>
             <v:stroke color="#000000"/>
@@ -2068,7 +2817,7 @@
           <w:sz w:val="22"/>
         </w:rPr>
         <w:pict>
-          <v:rect id="_x0000_s1050" o:spid="_x0000_s1050" o:spt="1" style="position:absolute;left:0pt;margin-left:147.05pt;margin-top:164.05pt;height:10pt;width:51.25pt;z-index:251680768;mso-width-relative:page;mso-height-relative:page;" fillcolor="#FFFFFF" filled="t" stroked="t" coordsize="21600,21600">
+          <v:rect id="_x0000_s1050" o:spid="_x0000_s1050" o:spt="1" style="position:absolute;left:0pt;margin-left:0pt;margin-top:0pt;height:10pt;width:0pt;z-index:251679744;mso-width-relative:page;mso-height-relative:page;" fillcolor="#FFFFFF" filled="t" stroked="t" coordsize="21600,21600">
             <v:path/>
             <v:fill on="t" focussize="0,0"/>
             <v:stroke color="#000000"/>
@@ -2082,7 +2831,7 @@
           <w:sz w:val="22"/>
         </w:rPr>
         <w:pict>
-          <v:rect id="_x0000_s1049" o:spid="_x0000_s1049" o:spt="1" style="position:absolute;left:0pt;margin-left:102.05pt;margin-top:170.95pt;height:10.6pt;width:28.1pt;z-index:251679744;mso-width-relative:page;mso-height-relative:page;" fillcolor="#FFFFFF" filled="t" stroked="t" coordsize="21600,21600">
+          <v:rect id="_x0000_s1049" o:spid="_x0000_s1049" o:spt="1" style="position:absolute;left:0pt;margin-left:0pt;margin-top:0pt;height:0pt;width:0pt;z-index:251678720;mso-width-relative:page;mso-height-relative:page;" fillcolor="#FFFFFF" filled="t" stroked="t" coordsize="21600,21600">
             <v:path/>
             <v:fill on="t" focussize="0,0"/>
             <v:stroke color="#000000"/>
@@ -2095,8 +2844,8 @@
         <w:drawing>
           <wp:inline distT="0" distB="0" distL="0" distR="0">
             <wp:extent cx="4859655" cy="4115435"/>
-            <wp:effectExtent l="0" t="0" r="0" b="0"/>
-            <wp:docPr id="18" name="Picture 18"/>
+            <wp:effectExtent l="0" t="0" r="17145" b="18415"/>
+            <wp:docPr id="18" name="Picture 18" descr="/home/adit/Documents/Picture9.pngPicture9"/>
             <wp:cNvGraphicFramePr>
               <a:graphicFrameLocks xmlns:a="http://schemas.openxmlformats.org/drawingml/2006/main" noChangeAspect="1"/>
             </wp:cNvGraphicFramePr>
@@ -2104,13 +2853,14 @@
               <a:graphicData uri="http://schemas.openxmlformats.org/drawingml/2006/picture">
                 <pic:pic xmlns:pic="http://schemas.openxmlformats.org/drawingml/2006/picture">
                   <pic:nvPicPr>
-                    <pic:cNvPr id="18" name="Picture 18"/>
+                    <pic:cNvPr id="18" name="Picture 18" descr="/home/adit/Documents/Picture9.pngPicture9"/>
                     <pic:cNvPicPr>
                       <a:picLocks noChangeAspect="1"/>
                     </pic:cNvPicPr>
                   </pic:nvPicPr>
                   <pic:blipFill>
                     <a:blip r:embed="rId22"/>
+                    <a:srcRect l="8" r="8"/>
                     <a:stretch>
                       <a:fillRect/>
                     </a:stretch>
@@ -2118,7 +2868,7 @@
                   <pic:spPr>
                     <a:xfrm>
                       <a:off x="0" y="0"/>
-                      <a:ext cx="4860000" cy="4115533"/>
+                      <a:ext cx="4860000" cy="4115435"/>
                     </a:xfrm>
                     <a:prstGeom prst="rect">
                       <a:avLst/>
@@ -2152,7 +2902,7 @@
           <w:sz w:val="22"/>
         </w:rPr>
         <w:pict>
-          <v:rect id="_x0000_s1054" o:spid="_x0000_s1054" o:spt="1" style="position:absolute;left:0pt;margin-left:224.55pt;margin-top:170.5pt;height:8.75pt;width:16.25pt;z-index:251684864;mso-width-relative:page;mso-height-relative:page;" fillcolor="#FFFFFF" filled="t" stroked="t" coordsize="21600,21600">
+          <v:rect id="_x0000_s1054" o:spid="_x0000_s1054" o:spt="1" style="position:absolute;left:0pt;margin-left:0pt;margin-top:0pt;height:0pt;width:0pt;z-index:251683840;mso-width-relative:page;mso-height-relative:page;" fillcolor="#FFFFFF" filled="t" stroked="t" coordsize="21600,21600">
             <v:path/>
             <v:fill on="t" focussize="0,0"/>
             <v:stroke color="#000000"/>
@@ -2166,7 +2916,7 @@
           <w:sz w:val="22"/>
         </w:rPr>
         <w:pict>
-          <v:rect id="_x0000_s1053" o:spid="_x0000_s1053" o:spt="1" style="position:absolute;left:0pt;margin-left:148.3pt;margin-top:164.9pt;height:8.75pt;width:48.75pt;z-index:251683840;mso-width-relative:page;mso-height-relative:page;" fillcolor="#FFFFFF" filled="t" stroked="t" coordsize="21600,21600">
+          <v:rect id="_x0000_s1053" o:spid="_x0000_s1053" o:spt="1" style="position:absolute;left:0pt;margin-left:0pt;margin-top:0pt;height:0pt;width:0pt;z-index:251682816;mso-width-relative:page;mso-height-relative:page;" fillcolor="#FFFFFF" filled="t" stroked="t" coordsize="21600,21600">
             <v:path/>
             <v:fill on="t" focussize="0,0"/>
             <v:stroke color="#000000"/>
@@ -2180,7 +2930,7 @@
           <w:sz w:val="22"/>
         </w:rPr>
         <w:pict>
-          <v:rect id="_x0000_s1052" o:spid="_x0000_s1052" o:spt="1" style="position:absolute;left:0pt;margin-left:103.9pt;margin-top:168pt;height:12.5pt;width:26.25pt;z-index:251682816;mso-width-relative:page;mso-height-relative:page;" fillcolor="#FFFFFF" filled="t" stroked="t" coordsize="21600,21600">
+          <v:rect id="_x0000_s1052" o:spid="_x0000_s1052" o:spt="1" style="position:absolute;left:0pt;margin-left:0pt;margin-top:168pt;height:0pt;width:0pt;z-index:251681792;mso-width-relative:page;mso-height-relative:page;" fillcolor="#FFFFFF" filled="t" stroked="t" coordsize="21600,21600">
             <v:path/>
             <v:fill on="t" focussize="0,0"/>
             <v:stroke color="#000000"/>
@@ -2193,8 +2943,8 @@
         <w:drawing>
           <wp:inline distT="0" distB="0" distL="0" distR="0">
             <wp:extent cx="4859655" cy="4115435"/>
-            <wp:effectExtent l="0" t="0" r="0" b="0"/>
-            <wp:docPr id="19" name="Picture 19"/>
+            <wp:effectExtent l="0" t="0" r="17145" b="18415"/>
+            <wp:docPr id="19" name="Picture 19" descr="/home/adit/Documents/Picture8.pngPicture8"/>
             <wp:cNvGraphicFramePr>
               <a:graphicFrameLocks xmlns:a="http://schemas.openxmlformats.org/drawingml/2006/main" noChangeAspect="1"/>
             </wp:cNvGraphicFramePr>
@@ -2202,13 +2952,14 @@
               <a:graphicData uri="http://schemas.openxmlformats.org/drawingml/2006/picture">
                 <pic:pic xmlns:pic="http://schemas.openxmlformats.org/drawingml/2006/picture">
                   <pic:nvPicPr>
-                    <pic:cNvPr id="19" name="Picture 19"/>
+                    <pic:cNvPr id="19" name="Picture 19" descr="/home/adit/Documents/Picture8.pngPicture8"/>
                     <pic:cNvPicPr>
                       <a:picLocks noChangeAspect="1"/>
                     </pic:cNvPicPr>
                   </pic:nvPicPr>
                   <pic:blipFill>
                     <a:blip r:embed="rId23"/>
+                    <a:srcRect l="8" r="8"/>
                     <a:stretch>
                       <a:fillRect/>
                     </a:stretch>
@@ -2216,7 +2967,7 @@
                   <pic:spPr>
                     <a:xfrm>
                       <a:off x="0" y="0"/>
-                      <a:ext cx="4860000" cy="4115533"/>
+                      <a:ext cx="4860000" cy="4115435"/>
                     </a:xfrm>
                     <a:prstGeom prst="rect">
                       <a:avLst/>
@@ -2245,9 +2996,11 @@
       <w:pPr>
         <w:pStyle w:val="2"/>
       </w:pPr>
+      <w:bookmarkStart w:id="8" w:name="_Toc649835153"/>
       <w:r>
         <w:t>9. Upload Bukti Transfer</w:t>
       </w:r>
+      <w:bookmarkEnd w:id="8"/>
     </w:p>
     <w:p>
       <w:r>
@@ -2263,7 +3016,7 @@
           <w:sz w:val="22"/>
         </w:rPr>
         <w:pict>
-          <v:rect id="_x0000_s1057" o:spid="_x0000_s1057" o:spt="1" style="position:absolute;left:0pt;margin-left:249.55pt;margin-top:90.35pt;height:6.25pt;width:6.85pt;z-index:251687936;mso-width-relative:page;mso-height-relative:page;" fillcolor="#FFFFFF" filled="t" stroked="t" coordsize="21600,21600">
+          <v:rect id="_x0000_s1057" o:spid="_x0000_s1057" o:spt="1" style="position:absolute;left:0pt;margin-left:0pt;margin-top:0pt;height:0pt;width:0pt;z-index:251686912;mso-width-relative:page;mso-height-relative:page;" fillcolor="#FFFFFF" filled="t" stroked="t" coordsize="21600,21600">
             <v:path/>
             <v:fill on="t" focussize="0,0"/>
             <v:stroke color="#000000"/>
@@ -2277,7 +3030,7 @@
           <w:sz w:val="22"/>
         </w:rPr>
         <w:pict>
-          <v:rect id="_x0000_s1056" o:spid="_x0000_s1056" o:spt="1" style="position:absolute;left:0pt;margin-left:213.3pt;margin-top:89.1pt;height:8.1pt;width:23.75pt;z-index:251686912;mso-width-relative:page;mso-height-relative:page;" fillcolor="#FFFFFF" filled="t" stroked="t" coordsize="21600,21600">
+          <v:rect id="_x0000_s1056" o:spid="_x0000_s1056" o:spt="1" style="position:absolute;left:0pt;margin-left:0pt;margin-top:0pt;height:0pt;width:0pt;z-index:251685888;mso-width-relative:page;mso-height-relative:page;" fillcolor="#FFFFFF" filled="t" stroked="t" coordsize="21600,21600">
             <v:path/>
             <v:fill on="t" focussize="0,0"/>
             <v:stroke color="#000000"/>
@@ -2291,7 +3044,7 @@
           <w:sz w:val="22"/>
         </w:rPr>
         <w:pict>
-          <v:rect id="_x0000_s1055" o:spid="_x0000_s1055" o:spt="1" style="position:absolute;left:0pt;margin-left:193.9pt;margin-top:89.1pt;height:8.75pt;width:10pt;z-index:251685888;mso-width-relative:page;mso-height-relative:page;" fillcolor="#FFFFFF" filled="t" stroked="t" coordsize="21600,21600">
+          <v:rect id="_x0000_s1055" o:spid="_x0000_s1055" o:spt="1" style="position:absolute;left:0pt;margin-left:0pt;margin-top:0pt;height:0pt;width:10pt;z-index:251684864;mso-width-relative:page;mso-height-relative:page;" fillcolor="#FFFFFF" filled="t" stroked="t" coordsize="21600,21600">
             <v:path/>
             <v:fill on="t" focussize="0,0"/>
             <v:stroke color="#000000"/>
@@ -2304,8 +3057,8 @@
         <w:drawing>
           <wp:inline distT="0" distB="0" distL="0" distR="0">
             <wp:extent cx="4859655" cy="2733675"/>
-            <wp:effectExtent l="0" t="0" r="0" b="0"/>
-            <wp:docPr id="20" name="Picture 20"/>
+            <wp:effectExtent l="0" t="0" r="17145" b="9525"/>
+            <wp:docPr id="20" name="Picture 20" descr="/home/adit/Documents/Picture7.pngPicture7"/>
             <wp:cNvGraphicFramePr>
               <a:graphicFrameLocks xmlns:a="http://schemas.openxmlformats.org/drawingml/2006/main" noChangeAspect="1"/>
             </wp:cNvGraphicFramePr>
@@ -2313,13 +3066,14 @@
               <a:graphicData uri="http://schemas.openxmlformats.org/drawingml/2006/picture">
                 <pic:pic xmlns:pic="http://schemas.openxmlformats.org/drawingml/2006/picture">
                   <pic:nvPicPr>
-                    <pic:cNvPr id="20" name="Picture 20"/>
+                    <pic:cNvPr id="20" name="Picture 20" descr="/home/adit/Documents/Picture7.pngPicture7"/>
                     <pic:cNvPicPr>
                       <a:picLocks noChangeAspect="1"/>
                     </pic:cNvPicPr>
                   </pic:nvPicPr>
                   <pic:blipFill>
                     <a:blip r:embed="rId24"/>
+                    <a:srcRect t="7" b="7"/>
                     <a:stretch>
                       <a:fillRect/>
                     </a:stretch>
@@ -2327,7 +3081,7 @@
                   <pic:spPr>
                     <a:xfrm>
                       <a:off x="0" y="0"/>
-                      <a:ext cx="4860000" cy="2733750"/>
+                      <a:ext cx="4859655" cy="2733750"/>
                     </a:xfrm>
                     <a:prstGeom prst="rect">
                       <a:avLst/>
@@ -2361,7 +3115,7 @@
           <w:sz w:val="22"/>
         </w:rPr>
         <w:pict>
-          <v:rect id="_x0000_s1058" o:spid="_x0000_s1058" o:spt="1" style="position:absolute;left:0pt;margin-left:103.9pt;margin-top:167.05pt;height:13.75pt;width:81.9pt;z-index:251688960;mso-width-relative:page;mso-height-relative:page;" fillcolor="#FFFFFF" filled="t" stroked="t" coordsize="21600,21600">
+          <v:rect id="_x0000_s1058" o:spid="_x0000_s1058" o:spt="1" style="position:absolute;left:0pt;margin-left:0pt;margin-top:0pt;height:0pt;width:0pt;z-index:251687936;mso-width-relative:page;mso-height-relative:page;" fillcolor="#FFFFFF" filled="t" stroked="t" coordsize="21600,21600">
             <v:path/>
             <v:fill on="t" focussize="0,0"/>
             <v:stroke color="#000000"/>
@@ -2374,8 +3128,8 @@
         <w:drawing>
           <wp:inline distT="0" distB="0" distL="0" distR="0">
             <wp:extent cx="4859655" cy="4115435"/>
-            <wp:effectExtent l="0" t="0" r="0" b="0"/>
-            <wp:docPr id="21" name="Picture 21"/>
+            <wp:effectExtent l="0" t="0" r="17145" b="18415"/>
+            <wp:docPr id="21" name="Picture 21" descr="/home/adit/Documents/Picture6.pngPicture6"/>
             <wp:cNvGraphicFramePr>
               <a:graphicFrameLocks xmlns:a="http://schemas.openxmlformats.org/drawingml/2006/main" noChangeAspect="1"/>
             </wp:cNvGraphicFramePr>
@@ -2383,13 +3137,14 @@
               <a:graphicData uri="http://schemas.openxmlformats.org/drawingml/2006/picture">
                 <pic:pic xmlns:pic="http://schemas.openxmlformats.org/drawingml/2006/picture">
                   <pic:nvPicPr>
-                    <pic:cNvPr id="21" name="Picture 21"/>
+                    <pic:cNvPr id="21" name="Picture 21" descr="/home/adit/Documents/Picture6.pngPicture6"/>
                     <pic:cNvPicPr>
                       <a:picLocks noChangeAspect="1"/>
                     </pic:cNvPicPr>
                   </pic:nvPicPr>
                   <pic:blipFill>
                     <a:blip r:embed="rId25"/>
+                    <a:srcRect l="8" r="8"/>
                     <a:stretch>
                       <a:fillRect/>
                     </a:stretch>
@@ -2397,7 +3152,7 @@
                   <pic:spPr>
                     <a:xfrm>
                       <a:off x="0" y="0"/>
-                      <a:ext cx="4860000" cy="4115533"/>
+                      <a:ext cx="4860000" cy="4115435"/>
                     </a:xfrm>
                     <a:prstGeom prst="rect">
                       <a:avLst/>
@@ -2431,7 +3186,7 @@
           <w:sz w:val="22"/>
         </w:rPr>
         <w:pict>
-          <v:rect id="_x0000_s1059" o:spid="_x0000_s1059" o:spt="1" style="position:absolute;left:0pt;margin-left:101.4pt;margin-top:166.15pt;height:15.65pt;width:138.75pt;z-index:251689984;mso-width-relative:page;mso-height-relative:page;" fillcolor="#FFFFFF" filled="t" stroked="t" coordsize="21600,21600">
+          <v:rect id="_x0000_s1059" o:spid="_x0000_s1059" o:spt="1" style="position:absolute;left:0pt;margin-left:0pt;margin-top:0pt;height:0pt;width:0pt;z-index:251688960;mso-width-relative:page;mso-height-relative:page;" fillcolor="#FFFFFF" filled="t" stroked="t" coordsize="21600,21600">
             <v:path/>
             <v:fill on="t" focussize="0,0"/>
             <v:stroke color="#000000"/>
@@ -2444,8 +3199,8 @@
         <w:drawing>
           <wp:inline distT="0" distB="0" distL="0" distR="0">
             <wp:extent cx="4859655" cy="4115435"/>
-            <wp:effectExtent l="0" t="0" r="0" b="0"/>
-            <wp:docPr id="22" name="Picture 22"/>
+            <wp:effectExtent l="0" t="0" r="17145" b="18415"/>
+            <wp:docPr id="22" name="Picture 22" descr="/home/adit/Documents/Picture5.pngPicture5"/>
             <wp:cNvGraphicFramePr>
               <a:graphicFrameLocks xmlns:a="http://schemas.openxmlformats.org/drawingml/2006/main" noChangeAspect="1"/>
             </wp:cNvGraphicFramePr>
@@ -2453,13 +3208,14 @@
               <a:graphicData uri="http://schemas.openxmlformats.org/drawingml/2006/picture">
                 <pic:pic xmlns:pic="http://schemas.openxmlformats.org/drawingml/2006/picture">
                   <pic:nvPicPr>
-                    <pic:cNvPr id="22" name="Picture 22"/>
+                    <pic:cNvPr id="22" name="Picture 22" descr="/home/adit/Documents/Picture5.pngPicture5"/>
                     <pic:cNvPicPr>
                       <a:picLocks noChangeAspect="1"/>
                     </pic:cNvPicPr>
                   </pic:nvPicPr>
                   <pic:blipFill>
                     <a:blip r:embed="rId26"/>
+                    <a:srcRect l="8" r="8"/>
                     <a:stretch>
                       <a:fillRect/>
                     </a:stretch>
@@ -2467,7 +3223,7 @@
                   <pic:spPr>
                     <a:xfrm>
                       <a:off x="0" y="0"/>
-                      <a:ext cx="4860000" cy="4115533"/>
+                      <a:ext cx="4860000" cy="4115435"/>
                     </a:xfrm>
                     <a:prstGeom prst="rect">
                       <a:avLst/>
@@ -2496,9 +3252,11 @@
       <w:pPr>
         <w:pStyle w:val="2"/>
       </w:pPr>
+      <w:bookmarkStart w:id="9" w:name="_Toc67329082"/>
       <w:r>
         <w:t>10. Mengirim Data ke POSSI Jatim</w:t>
       </w:r>
+      <w:bookmarkEnd w:id="9"/>
     </w:p>
     <w:p>
       <w:r>
@@ -2514,7 +3272,7 @@
           <w:sz w:val="22"/>
         </w:rPr>
         <w:pict>
-          <v:rect id="_x0000_s1060" o:spid="_x0000_s1060" o:spt="1" style="position:absolute;left:0pt;margin-left:105.8pt;margin-top:165.55pt;height:15.6pt;width:83.1pt;z-index:251691008;mso-width-relative:page;mso-height-relative:page;" fillcolor="#FFFFFF" filled="t" stroked="t" coordsize="21600,21600">
+          <v:rect id="_x0000_s1060" o:spid="_x0000_s1060" o:spt="1" style="position:absolute;left:0pt;margin-left:0pt;margin-top:0pt;height:0pt;width:0pt;z-index:251689984;mso-width-relative:page;mso-height-relative:page;" fillcolor="#FFFFFF" filled="t" stroked="t" coordsize="21600,21600">
             <v:path/>
             <v:fill on="t" focussize="0,0"/>
             <v:stroke color="#000000"/>
@@ -2527,8 +3285,8 @@
         <w:drawing>
           <wp:inline distT="0" distB="0" distL="0" distR="0">
             <wp:extent cx="4859655" cy="4115435"/>
-            <wp:effectExtent l="0" t="0" r="0" b="0"/>
-            <wp:docPr id="23" name="Picture 23"/>
+            <wp:effectExtent l="0" t="0" r="17145" b="18415"/>
+            <wp:docPr id="23" name="Picture 23" descr="/home/adit/Documents/Picture4.pngPicture4"/>
             <wp:cNvGraphicFramePr>
               <a:graphicFrameLocks xmlns:a="http://schemas.openxmlformats.org/drawingml/2006/main" noChangeAspect="1"/>
             </wp:cNvGraphicFramePr>
@@ -2536,13 +3294,14 @@
               <a:graphicData uri="http://schemas.openxmlformats.org/drawingml/2006/picture">
                 <pic:pic xmlns:pic="http://schemas.openxmlformats.org/drawingml/2006/picture">
                   <pic:nvPicPr>
-                    <pic:cNvPr id="23" name="Picture 23"/>
+                    <pic:cNvPr id="23" name="Picture 23" descr="/home/adit/Documents/Picture4.pngPicture4"/>
                     <pic:cNvPicPr>
                       <a:picLocks noChangeAspect="1"/>
                     </pic:cNvPicPr>
                   </pic:nvPicPr>
                   <pic:blipFill>
                     <a:blip r:embed="rId27"/>
+                    <a:srcRect l="8" r="8"/>
                     <a:stretch>
                       <a:fillRect/>
                     </a:stretch>
@@ -2550,7 +3309,7 @@
                   <pic:spPr>
                     <a:xfrm>
                       <a:off x="0" y="0"/>
-                      <a:ext cx="4860000" cy="4115533"/>
+                      <a:ext cx="4860000" cy="4115435"/>
                     </a:xfrm>
                     <a:prstGeom prst="rect">
                       <a:avLst/>
@@ -2584,7 +3343,7 @@
           <w:sz w:val="22"/>
         </w:rPr>
         <w:pict>
-          <v:rect id="_x0000_s1061" o:spid="_x0000_s1061" o:spt="1" style="position:absolute;left:0pt;margin-left:108.3pt;margin-top:164.8pt;height:18.15pt;width:78.1pt;z-index:251692032;mso-width-relative:page;mso-height-relative:page;" fillcolor="#FFFFFF" filled="t" stroked="t" coordsize="21600,21600">
+          <v:rect id="_x0000_s1061" o:spid="_x0000_s1061" o:spt="1" style="position:absolute;left:0pt;margin-left:0pt;margin-top:0pt;height:0pt;width:0pt;z-index:251691008;mso-width-relative:page;mso-height-relative:page;" fillcolor="#FFFFFF" filled="t" stroked="t" coordsize="21600,21600">
             <v:path/>
             <v:fill on="t" focussize="0,0"/>
             <v:stroke color="#000000"/>
@@ -2597,8 +3356,8 @@
         <w:drawing>
           <wp:inline distT="0" distB="0" distL="0" distR="0">
             <wp:extent cx="4859655" cy="4115435"/>
-            <wp:effectExtent l="0" t="0" r="0" b="0"/>
-            <wp:docPr id="24" name="Picture 24"/>
+            <wp:effectExtent l="0" t="0" r="17145" b="18415"/>
+            <wp:docPr id="24" name="Picture 24" descr="/home/adit/Documents/Picture3.pngPicture3"/>
             <wp:cNvGraphicFramePr>
               <a:graphicFrameLocks xmlns:a="http://schemas.openxmlformats.org/drawingml/2006/main" noChangeAspect="1"/>
             </wp:cNvGraphicFramePr>
@@ -2606,13 +3365,14 @@
               <a:graphicData uri="http://schemas.openxmlformats.org/drawingml/2006/picture">
                 <pic:pic xmlns:pic="http://schemas.openxmlformats.org/drawingml/2006/picture">
                   <pic:nvPicPr>
-                    <pic:cNvPr id="24" name="Picture 24"/>
+                    <pic:cNvPr id="24" name="Picture 24" descr="/home/adit/Documents/Picture3.pngPicture3"/>
                     <pic:cNvPicPr>
                       <a:picLocks noChangeAspect="1"/>
                     </pic:cNvPicPr>
                   </pic:nvPicPr>
                   <pic:blipFill>
                     <a:blip r:embed="rId28"/>
+                    <a:srcRect l="8" r="8"/>
                     <a:stretch>
                       <a:fillRect/>
                     </a:stretch>
@@ -2620,7 +3380,7 @@
                   <pic:spPr>
                     <a:xfrm>
                       <a:off x="0" y="0"/>
-                      <a:ext cx="4860000" cy="4115533"/>
+                      <a:ext cx="4860000" cy="4115435"/>
                     </a:xfrm>
                     <a:prstGeom prst="rect">
                       <a:avLst/>
@@ -2654,7 +3414,7 @@
           <w:sz w:val="22"/>
         </w:rPr>
         <w:pict>
-          <v:rect id="_x0000_s1062" o:spid="_x0000_s1062" o:spt="1" style="position:absolute;left:0pt;margin-left:107.65pt;margin-top:163.4pt;height:21.25pt;width:81.25pt;z-index:251693056;mso-width-relative:page;mso-height-relative:page;" fillcolor="#FFFFFF" filled="t" stroked="t" coordsize="21600,21600">
+          <v:rect id="_x0000_s1062" o:spid="_x0000_s1062" o:spt="1" style="position:absolute;left:0pt;margin-left:0pt;margin-top:0pt;height:0pt;width:0pt;z-index:251692032;mso-width-relative:page;mso-height-relative:page;" fillcolor="#FFFFFF" filled="t" stroked="t" coordsize="21600,21600">
             <v:path/>
             <v:fill on="t" focussize="0,0"/>
             <v:stroke color="#000000"/>
@@ -2667,8 +3427,8 @@
         <w:drawing>
           <wp:inline distT="0" distB="0" distL="0" distR="0">
             <wp:extent cx="4859655" cy="4115435"/>
-            <wp:effectExtent l="0" t="0" r="0" b="0"/>
-            <wp:docPr id="25" name="Picture 25"/>
+            <wp:effectExtent l="0" t="0" r="17145" b="18415"/>
+            <wp:docPr id="25" name="Picture 25" descr="/home/adit/Documents/Picture2.pngPicture2"/>
             <wp:cNvGraphicFramePr>
               <a:graphicFrameLocks xmlns:a="http://schemas.openxmlformats.org/drawingml/2006/main" noChangeAspect="1"/>
             </wp:cNvGraphicFramePr>
@@ -2676,13 +3436,14 @@
               <a:graphicData uri="http://schemas.openxmlformats.org/drawingml/2006/picture">
                 <pic:pic xmlns:pic="http://schemas.openxmlformats.org/drawingml/2006/picture">
                   <pic:nvPicPr>
-                    <pic:cNvPr id="25" name="Picture 25"/>
+                    <pic:cNvPr id="25" name="Picture 25" descr="/home/adit/Documents/Picture2.pngPicture2"/>
                     <pic:cNvPicPr>
                       <a:picLocks noChangeAspect="1"/>
                     </pic:cNvPicPr>
                   </pic:nvPicPr>
                   <pic:blipFill>
                     <a:blip r:embed="rId29"/>
+                    <a:srcRect l="8" r="8"/>
                     <a:stretch>
                       <a:fillRect/>
                     </a:stretch>
@@ -2690,7 +3451,7 @@
                   <pic:spPr>
                     <a:xfrm>
                       <a:off x="0" y="0"/>
-                      <a:ext cx="4860000" cy="4115533"/>
+                      <a:ext cx="4860000" cy="4115435"/>
                     </a:xfrm>
                     <a:prstGeom prst="rect">
                       <a:avLst/>
@@ -2780,7 +3541,7 @@
           <w:sz w:val="22"/>
         </w:rPr>
         <w:pict>
-          <v:rect id="_x0000_s1065" o:spid="_x0000_s1065" o:spt="1" style="position:absolute;left:0pt;margin-left:250.15pt;margin-top:379pt;height:8.1pt;width:17.5pt;z-index:251696128;mso-width-relative:page;mso-height-relative:page;" fillcolor="#FFFFFF" filled="t" stroked="t" coordsize="21600,21600">
+          <v:rect id="_x0000_s1065" o:spid="_x0000_s1065" o:spt="1" style="position:absolute;left:0pt;margin-left:0pt;margin-top:379pt;height:0pt;width:0pt;z-index:251695104;mso-width-relative:page;mso-height-relative:page;" fillcolor="#FFFFFF" filled="t" stroked="t" coordsize="21600,21600">
             <v:path/>
             <v:fill on="t" focussize="0,0"/>
             <v:stroke color="#000000"/>
@@ -2794,7 +3555,7 @@
           <w:sz w:val="22"/>
         </w:rPr>
         <w:pict>
-          <v:rect id="_x0000_s1064" o:spid="_x0000_s1064" o:spt="1" style="position:absolute;left:0pt;margin-left:144.55pt;margin-top:377.75pt;height:9.35pt;width:48.1pt;z-index:251695104;mso-width-relative:page;mso-height-relative:page;" fillcolor="#FFFFFF" filled="t" stroked="t" coordsize="21600,21600">
+          <v:rect id="_x0000_s1064" o:spid="_x0000_s1064" o:spt="1" style="position:absolute;left:0pt;margin-left:0pt;margin-top:0pt;height:0pt;width:0pt;z-index:251694080;mso-width-relative:page;mso-height-relative:page;" fillcolor="#FFFFFF" filled="t" stroked="t" coordsize="21600,21600">
             <v:path/>
             <v:fill on="t" focussize="0,0"/>
             <v:stroke color="#000000"/>
@@ -2808,7 +3569,7 @@
           <w:sz w:val="22"/>
         </w:rPr>
         <w:pict>
-          <v:rect id="_x0000_s1063" o:spid="_x0000_s1063" o:spt="1" style="position:absolute;left:0pt;margin-left:97.65pt;margin-top:379pt;height:7.5pt;width:27.5pt;z-index:251694080;mso-width-relative:page;mso-height-relative:page;" fillcolor="#FFFFFF" filled="t" stroked="t" coordsize="21600,21600">
+          <v:rect id="_x0000_s1063" o:spid="_x0000_s1063" o:spt="1" style="position:absolute;left:0pt;margin-left:0pt;margin-top:379pt;height:0pt;width:0pt;z-index:251693056;mso-width-relative:page;mso-height-relative:page;" fillcolor="#FFFFFF" filled="t" stroked="t" coordsize="21600,21600">
             <v:path/>
             <v:fill on="t" focussize="0,0"/>
             <v:stroke color="#000000"/>
@@ -2821,8 +3582,8 @@
         <w:drawing>
           <wp:inline distT="0" distB="0" distL="0" distR="0">
             <wp:extent cx="4859655" cy="5100955"/>
-            <wp:effectExtent l="0" t="0" r="0" b="0"/>
-            <wp:docPr id="27" name="Picture 27"/>
+            <wp:effectExtent l="0" t="0" r="17145" b="4445"/>
+            <wp:docPr id="27" name="Picture 27" descr="/home/adit/Documents/Picture1.pngPicture1"/>
             <wp:cNvGraphicFramePr>
               <a:graphicFrameLocks xmlns:a="http://schemas.openxmlformats.org/drawingml/2006/main" noChangeAspect="1"/>
             </wp:cNvGraphicFramePr>
@@ -2830,13 +3591,14 @@
               <a:graphicData uri="http://schemas.openxmlformats.org/drawingml/2006/picture">
                 <pic:pic xmlns:pic="http://schemas.openxmlformats.org/drawingml/2006/picture">
                   <pic:nvPicPr>
-                    <pic:cNvPr id="27" name="Picture 27"/>
+                    <pic:cNvPr id="27" name="Picture 27" descr="/home/adit/Documents/Picture1.pngPicture1"/>
                     <pic:cNvPicPr>
                       <a:picLocks noChangeAspect="1"/>
                     </pic:cNvPicPr>
                   </pic:nvPicPr>
                   <pic:blipFill>
                     <a:blip r:embed="rId31"/>
+                    <a:srcRect l="6" r="6"/>
                     <a:stretch>
                       <a:fillRect/>
                     </a:stretch>
@@ -2844,7 +3606,7 @@
                   <pic:spPr>
                     <a:xfrm>
                       <a:off x="0" y="0"/>
-                      <a:ext cx="4860000" cy="5101165"/>
+                      <a:ext cx="4860000" cy="5100955"/>
                     </a:xfrm>
                     <a:prstGeom prst="rect">
                       <a:avLst/>
@@ -2872,30 +3634,362 @@
     <w:p>
       <w:pPr>
         <w:pStyle w:val="2"/>
-      </w:pPr>
-      <w:r>
-        <w:t>11. Pemecahan Masalah (Troubleshooting)</w:t>
-      </w:r>
+        <w:numPr>
+          <w:ilvl w:val="0"/>
+          <w:numId w:val="1"/>
+        </w:numPr>
+        <w:ind w:left="0" w:leftChars="0" w:firstLine="0" w:firstLineChars="0"/>
+      </w:pPr>
+      <w:bookmarkStart w:id="10" w:name="_Toc1025688225"/>
+      <w:r>
+        <w:rPr>
+          <w:rFonts w:hint="default"/>
+          <w:lang w:val="en-US"/>
+        </w:rPr>
+        <w:t>Cara Melihat Data NIAS per Club</w:t>
+      </w:r>
+      <w:bookmarkEnd w:id="10"/>
+    </w:p>
+    <w:p>
+      <w:pPr>
+        <w:bidi w:val="0"/>
+        <w:rPr>
+          <w:rFonts w:hint="default"/>
+          <w:lang w:val="en-US"/>
+        </w:rPr>
+      </w:pPr>
+      <w:r>
+        <w:rPr>
+          <w:rFonts w:hint="default"/>
+          <w:lang w:val="en-US"/>
+        </w:rPr>
+        <w:t>Setiap pelatih dapat melihat data nias dari atlet di club nya masing-masing dengan klik tombol “Nias Jatim yang sudah terdaftar”</w:t>
+      </w:r>
+    </w:p>
+    <w:p>
+      <w:pPr>
+        <w:bidi w:val="0"/>
+        <w:rPr>
+          <w:rFonts w:hint="default"/>
+          <w:lang w:val="en-US"/>
+        </w:rPr>
+      </w:pPr>
+    </w:p>
+    <w:p>
+      <w:pPr>
+        <w:bidi w:val="0"/>
+        <w:rPr>
+          <w:rFonts w:hint="default"/>
+          <w:lang w:val="en-US"/>
+        </w:rPr>
+      </w:pPr>
+      <w:r>
+        <w:rPr>
+          <w:sz w:val="22"/>
+        </w:rPr>
+        <w:pict>
+          <v:rect id="_x0000_s1069" o:spid="_x0000_s1069" o:spt="1" style="position:absolute;left:0pt;margin-left:320.75pt;margin-top:27.55pt;height:18.75pt;width:109.35pt;z-index:251699200;mso-width-relative:page;mso-height-relative:page;" filled="f" stroked="t" coordsize="21600,21600">
+            <v:path/>
+            <v:fill on="f" focussize="0,0"/>
+            <v:stroke weight="1.5pt" color="#FF0000"/>
+            <v:imagedata o:title=""/>
+            <o:lock v:ext="edit" aspectratio="f"/>
+          </v:rect>
+        </w:pict>
+      </w:r>
+      <w:r>
+        <w:drawing>
+          <wp:inline distT="0" distB="0" distL="114300" distR="114300">
+            <wp:extent cx="6643370" cy="2660650"/>
+            <wp:effectExtent l="0" t="0" r="5080" b="6350"/>
+            <wp:docPr id="29" name="Picture 1"/>
+            <wp:cNvGraphicFramePr>
+              <a:graphicFrameLocks xmlns:a="http://schemas.openxmlformats.org/drawingml/2006/main" noChangeAspect="1"/>
+            </wp:cNvGraphicFramePr>
+            <a:graphic xmlns:a="http://schemas.openxmlformats.org/drawingml/2006/main">
+              <a:graphicData uri="http://schemas.openxmlformats.org/drawingml/2006/picture">
+                <pic:pic xmlns:pic="http://schemas.openxmlformats.org/drawingml/2006/picture">
+                  <pic:nvPicPr>
+                    <pic:cNvPr id="29" name="Picture 1"/>
+                    <pic:cNvPicPr>
+                      <a:picLocks noChangeAspect="1"/>
+                    </pic:cNvPicPr>
+                  </pic:nvPicPr>
+                  <pic:blipFill>
+                    <a:blip r:embed="rId32"/>
+                    <a:stretch>
+                      <a:fillRect/>
+                    </a:stretch>
+                  </pic:blipFill>
+                  <pic:spPr>
+                    <a:xfrm>
+                      <a:off x="0" y="0"/>
+                      <a:ext cx="6643370" cy="2660650"/>
+                    </a:xfrm>
+                    <a:prstGeom prst="rect">
+                      <a:avLst/>
+                    </a:prstGeom>
+                    <a:noFill/>
+                    <a:ln>
+                      <a:noFill/>
+                    </a:ln>
+                  </pic:spPr>
+                </pic:pic>
+              </a:graphicData>
+            </a:graphic>
+          </wp:inline>
+        </w:drawing>
+      </w:r>
+    </w:p>
+    <w:p>
+      <w:pPr>
+        <w:pStyle w:val="2"/>
+        <w:numPr>
+          <w:ilvl w:val="0"/>
+          <w:numId w:val="1"/>
+        </w:numPr>
+        <w:ind w:left="0" w:leftChars="0" w:firstLine="0" w:firstLineChars="0"/>
+      </w:pPr>
+      <w:bookmarkStart w:id="11" w:name="_Toc272528582"/>
+      <w:r>
+        <w:rPr>
+          <w:rFonts w:hint="default"/>
+          <w:lang w:val="en-US"/>
+        </w:rPr>
+        <w:t>Cara Download Data NIAS yang sudah terdaftar</w:t>
+      </w:r>
+      <w:bookmarkEnd w:id="11"/>
+    </w:p>
+    <w:p>
+      <w:pPr>
+        <w:bidi w:val="0"/>
+        <w:rPr>
+          <w:rFonts w:hint="default"/>
+          <w:lang w:val="en-US"/>
+        </w:rPr>
+      </w:pPr>
+      <w:r>
+        <w:rPr>
+          <w:rFonts w:hint="default"/>
+          <w:lang w:val="en-US"/>
+        </w:rPr>
+        <w:t>Setiap pelatih dapat men-download data NIAS dari atlet nya dengan cara klik tombol “Export Data”.</w:t>
+      </w:r>
+    </w:p>
+    <w:p>
+      <w:pPr>
+        <w:bidi w:val="0"/>
+        <w:jc w:val="center"/>
+        <w:rPr>
+          <w:rFonts w:hint="default"/>
+          <w:lang w:val="en-US"/>
+        </w:rPr>
+      </w:pPr>
+      <w:r>
+        <w:rPr>
+          <w:sz w:val="22"/>
+        </w:rPr>
+        <w:pict>
+          <v:rect id="_x0000_s1070" o:spid="_x0000_s1070" o:spt="1" style="position:absolute;left:0pt;margin-left:387.1pt;margin-top:0.6pt;height:21.25pt;width:68.75pt;z-index:251700224;mso-width-relative:page;mso-height-relative:page;" filled="f" stroked="t" coordsize="21600,21600">
+            <v:path/>
+            <v:fill on="f" focussize="0,0"/>
+            <v:stroke weight="2.25pt" color="#FF0000"/>
+            <v:imagedata o:title=""/>
+            <o:lock v:ext="edit" aspectratio="f"/>
+          </v:rect>
+        </w:pict>
+      </w:r>
+      <w:r>
+        <w:rPr>
+          <w:rFonts w:hint="default"/>
+          <w:lang w:val="en-US"/>
+        </w:rPr>
+        <w:drawing>
+          <wp:inline distT="0" distB="0" distL="114300" distR="114300">
+            <wp:extent cx="5937250" cy="1671320"/>
+            <wp:effectExtent l="0" t="0" r="6350" b="5080"/>
+            <wp:docPr id="30" name="Picture 30" descr="Screenshot_20260829_141836"/>
+            <wp:cNvGraphicFramePr>
+              <a:graphicFrameLocks xmlns:a="http://schemas.openxmlformats.org/drawingml/2006/main" noChangeAspect="1"/>
+            </wp:cNvGraphicFramePr>
+            <a:graphic xmlns:a="http://schemas.openxmlformats.org/drawingml/2006/main">
+              <a:graphicData uri="http://schemas.openxmlformats.org/drawingml/2006/picture">
+                <pic:pic xmlns:pic="http://schemas.openxmlformats.org/drawingml/2006/picture">
+                  <pic:nvPicPr>
+                    <pic:cNvPr id="30" name="Picture 30" descr="Screenshot_20260829_141836"/>
+                    <pic:cNvPicPr>
+                      <a:picLocks noChangeAspect="1"/>
+                    </pic:cNvPicPr>
+                  </pic:nvPicPr>
+                  <pic:blipFill>
+                    <a:blip r:embed="rId33"/>
+                    <a:stretch>
+                      <a:fillRect/>
+                    </a:stretch>
+                  </pic:blipFill>
+                  <pic:spPr>
+                    <a:xfrm>
+                      <a:off x="0" y="0"/>
+                      <a:ext cx="5937250" cy="1671320"/>
+                    </a:xfrm>
+                    <a:prstGeom prst="rect">
+                      <a:avLst/>
+                    </a:prstGeom>
+                  </pic:spPr>
+                </pic:pic>
+              </a:graphicData>
+            </a:graphic>
+          </wp:inline>
+        </w:drawing>
+      </w:r>
+    </w:p>
+    <w:p>
+      <w:pPr>
+        <w:bidi w:val="0"/>
+        <w:rPr>
+          <w:rFonts w:hint="default"/>
+          <w:lang w:val="en-US"/>
+        </w:rPr>
+      </w:pPr>
+    </w:p>
+    <w:p>
+      <w:pPr>
+        <w:bidi w:val="0"/>
+        <w:rPr>
+          <w:rFonts w:hint="default"/>
+          <w:lang w:val="en-US"/>
+        </w:rPr>
+      </w:pPr>
+      <w:r>
+        <w:rPr>
+          <w:rFonts w:hint="default"/>
+          <w:lang w:val="en-US"/>
+        </w:rPr>
+        <w:t>kemudian sesuaikan opsi filter dengan keperluan yang diinginkan (contoh: hanya ingin men-download data nias yang masih aktif saja atau semuanya). lalu klik tombol “Download”</w:t>
+      </w:r>
+    </w:p>
+    <w:p>
+      <w:pPr>
+        <w:bidi w:val="0"/>
+        <w:jc w:val="center"/>
+        <w:rPr>
+          <w:rFonts w:hint="default"/>
+          <w:lang w:val="en-US"/>
+        </w:rPr>
+      </w:pPr>
+      <w:r>
+        <w:rPr>
+          <w:sz w:val="22"/>
+        </w:rPr>
+        <w:pict>
+          <v:rect id="_x0000_s1072" o:spid="_x0000_s1072" o:spt="1" style="position:absolute;left:0pt;margin-left:351.35pt;margin-top:1.5pt;height:16.25pt;width:43.75pt;z-index:251702272;mso-width-relative:page;mso-height-relative:page;" filled="f" stroked="t" coordsize="21600,21600">
+            <v:path/>
+            <v:fill on="f" focussize="0,0"/>
+            <v:stroke weight="2.25pt" color="#FF0000"/>
+            <v:imagedata o:title=""/>
+            <o:lock v:ext="edit" aspectratio="f"/>
+          </v:rect>
+        </w:pict>
+      </w:r>
+      <w:r>
+        <w:rPr>
+          <w:sz w:val="22"/>
+        </w:rPr>
+        <w:pict>
+          <v:rect id="_x0000_s1071" o:spid="_x0000_s1071" o:spt="1" style="position:absolute;left:0pt;margin-left:335.1pt;margin-top:216.5pt;height:21.25pt;width:57.5pt;z-index:251701248;mso-width-relative:page;mso-height-relative:page;" filled="f" stroked="t" coordsize="21600,21600">
+            <v:path/>
+            <v:fill on="f" focussize="0,0"/>
+            <v:stroke weight="2.25pt" color="#FF0000"/>
+            <v:imagedata o:title=""/>
+            <o:lock v:ext="edit" aspectratio="f"/>
+          </v:rect>
+        </w:pict>
+      </w:r>
+      <w:r>
+        <w:rPr>
+          <w:rFonts w:hint="default"/>
+          <w:lang w:val="en-US"/>
+        </w:rPr>
+        <w:drawing>
+          <wp:inline distT="0" distB="0" distL="114300" distR="114300">
+            <wp:extent cx="3366770" cy="2997200"/>
+            <wp:effectExtent l="0" t="0" r="5080" b="12700"/>
+            <wp:docPr id="31" name="Picture 31" descr="Screenshot_20260829_141902"/>
+            <wp:cNvGraphicFramePr>
+              <a:graphicFrameLocks xmlns:a="http://schemas.openxmlformats.org/drawingml/2006/main" noChangeAspect="1"/>
+            </wp:cNvGraphicFramePr>
+            <a:graphic xmlns:a="http://schemas.openxmlformats.org/drawingml/2006/main">
+              <a:graphicData uri="http://schemas.openxmlformats.org/drawingml/2006/picture">
+                <pic:pic xmlns:pic="http://schemas.openxmlformats.org/drawingml/2006/picture">
+                  <pic:nvPicPr>
+                    <pic:cNvPr id="31" name="Picture 31" descr="Screenshot_20260829_141902"/>
+                    <pic:cNvPicPr>
+                      <a:picLocks noChangeAspect="1"/>
+                    </pic:cNvPicPr>
+                  </pic:nvPicPr>
+                  <pic:blipFill>
+                    <a:blip r:embed="rId34"/>
+                    <a:stretch>
+                      <a:fillRect/>
+                    </a:stretch>
+                  </pic:blipFill>
+                  <pic:spPr>
+                    <a:xfrm>
+                      <a:off x="0" y="0"/>
+                      <a:ext cx="3366770" cy="2997200"/>
+                    </a:xfrm>
+                    <a:prstGeom prst="rect">
+                      <a:avLst/>
+                    </a:prstGeom>
+                  </pic:spPr>
+                </pic:pic>
+              </a:graphicData>
+            </a:graphic>
+          </wp:inline>
+        </w:drawing>
+      </w:r>
+    </w:p>
+    <w:p>
+      <w:pPr>
+        <w:pStyle w:val="2"/>
+        <w:numPr>
+          <w:ilvl w:val="0"/>
+          <w:numId w:val="1"/>
+        </w:numPr>
+        <w:ind w:left="0" w:leftChars="0" w:firstLine="0" w:firstLineChars="0"/>
+      </w:pPr>
+      <w:bookmarkStart w:id="12" w:name="_Toc1389201324"/>
+      <w:r>
+        <w:t>Pemecahan Masalah (Troubleshooting)</w:t>
+      </w:r>
+      <w:bookmarkEnd w:id="12"/>
     </w:p>
     <w:p>
       <w:pPr>
         <w:pStyle w:val="3"/>
-      </w:pPr>
-      <w:r>
-        <w:t>11.1. Kolom wajib belum diisi</w:t>
-      </w:r>
-    </w:p>
-    <w:p>
-      <w:pPr>
-        <w:jc w:val="center"/>
-      </w:pPr>
-      <w:bookmarkStart w:id="0" w:name="_GoBack"/>
+        <w:numPr>
+          <w:ilvl w:val="0"/>
+          <w:numId w:val="2"/>
+        </w:numPr>
+        <w:tabs>
+          <w:tab w:val="clear" w:pos="420"/>
+        </w:tabs>
+        <w:ind w:left="420" w:leftChars="0" w:hanging="420" w:firstLineChars="0"/>
+      </w:pPr>
+      <w:r>
+        <w:t>Kolom wajib belum diisi</w:t>
+      </w:r>
+    </w:p>
+    <w:p>
+      <w:pPr>
+        <w:jc w:val="center"/>
+      </w:pPr>
       <w:r>
         <w:rPr>
           <w:sz w:val="22"/>
         </w:rPr>
         <w:pict>
-          <v:rect id="_x0000_s1068" o:spid="_x0000_s1068" o:spt="1" style="position:absolute;left:0pt;margin-left:185.8pt;margin-top:158.35pt;height:9.4pt;width:24.35pt;z-index:251699200;mso-width-relative:page;mso-height-relative:page;" fillcolor="#FFFFFF" filled="t" stroked="t" coordsize="21600,21600">
+          <v:rect id="_x0000_s1068" o:spid="_x0000_s1068" o:spt="1" style="position:absolute;left:0pt;margin-left:0pt;margin-top:0pt;height:0pt;width:0pt;z-index:251698176;mso-width-relative:page;mso-height-relative:page;" fillcolor="#FFFFFF" filled="t" stroked="t" coordsize="21600,21600">
             <v:path/>
             <v:fill on="t" focussize="0,0"/>
             <v:stroke color="#000000"/>
@@ -2904,13 +3998,12 @@
           </v:rect>
         </w:pict>
       </w:r>
-      <w:bookmarkEnd w:id="0"/>
       <w:r>
         <w:rPr>
           <w:sz w:val="22"/>
         </w:rPr>
         <w:pict>
-          <v:rect id="_x0000_s1067" o:spid="_x0000_s1067" o:spt="1" style="position:absolute;left:0pt;margin-left:217.65pt;margin-top:125.25pt;height:10.6pt;width:43.75pt;z-index:251698176;mso-width-relative:page;mso-height-relative:page;" fillcolor="#FFFFFF" filled="t" stroked="t" coordsize="21600,21600">
+          <v:rect id="_x0000_s1067" o:spid="_x0000_s1067" o:spt="1" style="position:absolute;left:0pt;margin-left:0pt;margin-top:0pt;height:0pt;width:0pt;z-index:251697152;mso-width-relative:page;mso-height-relative:page;" fillcolor="#FFFFFF" filled="t" stroked="t" coordsize="21600,21600">
             <v:path/>
             <v:fill on="t" focussize="0,0"/>
             <v:stroke color="#000000"/>
@@ -2924,7 +4017,7 @@
           <w:sz w:val="22"/>
         </w:rPr>
         <w:pict>
-          <v:rect id="_x0000_s1066" o:spid="_x0000_s1066" o:spt="1" style="position:absolute;left:0pt;margin-left:97.05pt;margin-top:127.1pt;height:7.5pt;width:85pt;z-index:251697152;mso-width-relative:page;mso-height-relative:page;" fillcolor="#FFFFFF" filled="t" stroked="t" coordsize="21600,21600">
+          <v:rect id="_x0000_s1066" o:spid="_x0000_s1066" o:spt="1" style="position:absolute;left:0pt;margin-left:0pt;margin-top:0pt;height:0pt;width:85pt;z-index:251696128;mso-width-relative:page;mso-height-relative:page;" fillcolor="#FFFFFF" filled="t" stroked="t" coordsize="21600,21600">
             <v:path/>
             <v:fill on="t" focussize="0,0"/>
             <v:stroke color="#000000"/>
@@ -2952,7 +4045,7 @@
                     </pic:cNvPicPr>
                   </pic:nvPicPr>
                   <pic:blipFill>
-                    <a:blip r:embed="rId32"/>
+                    <a:blip r:embed="rId35"/>
                     <a:stretch>
                       <a:fillRect/>
                     </a:stretch>
@@ -2992,7 +4085,7 @@
     </w:p>
     <w:p>
       <w:pPr>
-        <w:pStyle w:val="11"/>
+        <w:pStyle w:val="12"/>
         <w:ind w:left="360"/>
       </w:pPr>
       <w:r>
@@ -3001,7 +4094,7 @@
     </w:p>
     <w:p>
       <w:pPr>
-        <w:pStyle w:val="11"/>
+        <w:pStyle w:val="12"/>
         <w:ind w:left="360"/>
       </w:pPr>
       <w:r>
@@ -3010,7 +4103,7 @@
     </w:p>
     <w:p>
       <w:pPr>
-        <w:pStyle w:val="11"/>
+        <w:pStyle w:val="12"/>
         <w:ind w:left="360"/>
       </w:pPr>
       <w:r>
@@ -3020,14 +4113,22 @@
     <w:p>
       <w:pPr>
         <w:pStyle w:val="3"/>
-      </w:pPr>
-      <w:r>
-        <w:t>11.2. Masalah umum lainnya</w:t>
-      </w:r>
-    </w:p>
-    <w:p>
-      <w:pPr>
-        <w:pStyle w:val="11"/>
+        <w:numPr>
+          <w:ilvl w:val="0"/>
+          <w:numId w:val="3"/>
+        </w:numPr>
+        <w:tabs>
+          <w:tab w:val="clear" w:pos="420"/>
+        </w:tabs>
+        <w:ind w:left="420" w:leftChars="0" w:hanging="420" w:firstLineChars="0"/>
+      </w:pPr>
+      <w:r>
+        <w:t>Masalah umum lainnya</w:t>
+      </w:r>
+    </w:p>
+    <w:p>
+      <w:pPr>
+        <w:pStyle w:val="12"/>
         <w:ind w:left="360"/>
       </w:pPr>
       <w:r>
@@ -3036,7 +4137,7 @@
     </w:p>
     <w:p>
       <w:pPr>
-        <w:pStyle w:val="11"/>
+        <w:pStyle w:val="12"/>
         <w:ind w:left="360"/>
       </w:pPr>
       <w:r>
@@ -3045,7 +4146,7 @@
     </w:p>
     <w:p>
       <w:pPr>
-        <w:pStyle w:val="11"/>
+        <w:pStyle w:val="12"/>
         <w:ind w:left="360"/>
       </w:pPr>
       <w:r>
@@ -3054,7 +4155,7 @@
     </w:p>
     <w:p>
       <w:pPr>
-        <w:pStyle w:val="11"/>
+        <w:pStyle w:val="12"/>
         <w:ind w:left="360"/>
       </w:pPr>
       <w:r>
@@ -3063,25 +4164,32 @@
     </w:p>
     <w:p>
       <w:pPr>
-        <w:pStyle w:val="11"/>
-      </w:pPr>
-    </w:p>
-    <w:p>
-      <w:pPr>
-        <w:pStyle w:val="11"/>
+        <w:pStyle w:val="12"/>
+      </w:pPr>
+    </w:p>
+    <w:p>
+      <w:pPr>
+        <w:pStyle w:val="12"/>
       </w:pPr>
     </w:p>
     <w:p>
       <w:pPr>
         <w:pStyle w:val="2"/>
-      </w:pPr>
-      <w:r>
-        <w:t>12. Informasi Penting</w:t>
-      </w:r>
-    </w:p>
-    <w:p>
-      <w:pPr>
-        <w:pStyle w:val="11"/>
+        <w:numPr>
+          <w:ilvl w:val="0"/>
+          <w:numId w:val="1"/>
+        </w:numPr>
+        <w:ind w:left="0" w:leftChars="0" w:firstLine="0" w:firstLineChars="0"/>
+      </w:pPr>
+      <w:bookmarkStart w:id="13" w:name="_Toc643639544"/>
+      <w:r>
+        <w:t>Informasi Penting</w:t>
+      </w:r>
+      <w:bookmarkEnd w:id="13"/>
+    </w:p>
+    <w:p>
+      <w:pPr>
+        <w:pStyle w:val="12"/>
         <w:ind w:left="360"/>
       </w:pPr>
       <w:r>
@@ -3090,7 +4198,7 @@
     </w:p>
     <w:p>
       <w:pPr>
-        <w:pStyle w:val="11"/>
+        <w:pStyle w:val="12"/>
         <w:ind w:left="360"/>
       </w:pPr>
       <w:r>
@@ -3099,7 +4207,7 @@
     </w:p>
     <w:p>
       <w:pPr>
-        <w:pStyle w:val="11"/>
+        <w:pStyle w:val="12"/>
         <w:ind w:left="360"/>
       </w:pPr>
       <w:r>
@@ -3108,7 +4216,7 @@
     </w:p>
     <w:p>
       <w:pPr>
-        <w:pStyle w:val="11"/>
+        <w:pStyle w:val="12"/>
         <w:ind w:left="360"/>
       </w:pPr>
       <w:r>
@@ -3117,13 +4225,13 @@
     </w:p>
     <w:p>
       <w:pPr>
-        <w:pStyle w:val="11"/>
-        <w:ind w:left="360"/>
-      </w:pPr>
-    </w:p>
-    <w:p>
-      <w:pPr>
-        <w:pStyle w:val="11"/>
+        <w:pStyle w:val="12"/>
+        <w:ind w:left="360"/>
+      </w:pPr>
+    </w:p>
+    <w:p>
+      <w:pPr>
+        <w:pStyle w:val="12"/>
         <w:ind w:left="360"/>
       </w:pPr>
     </w:p>
@@ -3133,7 +4241,6 @@
       </w:r>
     </w:p>
     <w:sectPr>
-      <w:footerReference r:id="rId3" w:type="default"/>
       <w:pgSz w:w="11906" w:h="16838"/>
       <w:pgMar w:top="720" w:right="720" w:bottom="720" w:left="720" w:header="720" w:footer="720" w:gutter="0"/>
       <w:pgNumType w:fmt="decimal"/>
@@ -3212,6 +4319,192 @@
 </w:ftr>
 </file>
 
+<file path=word/numbering.xml><?xml version="1.0" encoding="utf-8"?>
+<w:numbering xmlns:wpc="http://schemas.microsoft.com/office/word/2010/wordprocessingCanvas" xmlns:mc="http://schemas.openxmlformats.org/markup-compatibility/2006" xmlns:o="urn:schemas-microsoft-com:office:office" xmlns:r="http://schemas.openxmlformats.org/officeDocument/2006/relationships" xmlns:m="http://schemas.openxmlformats.org/officeDocument/2006/math" xmlns:v="urn:schemas-microsoft-com:vml" xmlns:wp14="http://schemas.microsoft.com/office/word/2010/wordprocessingDrawing" xmlns:wp="http://schemas.openxmlformats.org/drawingml/2006/wordprocessingDrawing" xmlns:w10="urn:schemas-microsoft-com:office:word" xmlns:w="http://schemas.openxmlformats.org/wordprocessingml/2006/main" xmlns:w14="http://schemas.microsoft.com/office/word/2010/wordml" xmlns:wpg="http://schemas.microsoft.com/office/word/2010/wordprocessingGroup" xmlns:wpi="http://schemas.microsoft.com/office/word/2010/wordprocessingInk" xmlns:wne="http://schemas.microsoft.com/office/word/2006/wordml" xmlns:wps="http://schemas.microsoft.com/office/word/2010/wordprocessingShape" xmlns:wpsCustomData="http://www.wps.cn/officeDocument/2013/wpsCustomData" mc:Ignorable="w14 wp14">
+  <w:abstractNum w:abstractNumId="0">
+    <w:nsid w:val="CB8F2FBA"/>
+    <w:multiLevelType w:val="multilevel"/>
+    <w:tmpl w:val="CB8F2FBA"/>
+    <w:lvl w:ilvl="0" w:tentative="0">
+      <w:start w:val="11"/>
+      <w:numFmt w:val="decimal"/>
+      <w:suff w:val="space"/>
+      <w:lvlText w:val="%1."/>
+      <w:lvlJc w:val="left"/>
+    </w:lvl>
+    <w:lvl w:ilvl="1" w:tentative="0">
+      <w:start w:val="1"/>
+      <w:numFmt w:val="lowerLetter"/>
+      <w:lvlText w:val="%2)"/>
+      <w:lvlJc w:val="left"/>
+      <w:pPr>
+        <w:tabs>
+          <w:tab w:val="left" w:pos="840"/>
+        </w:tabs>
+        <w:ind w:left="840" w:leftChars="0" w:hanging="420" w:firstLineChars="0"/>
+      </w:pPr>
+      <w:rPr>
+        <w:rFonts w:hint="default"/>
+      </w:rPr>
+    </w:lvl>
+    <w:lvl w:ilvl="2" w:tentative="0">
+      <w:start w:val="1"/>
+      <w:numFmt w:val="lowerRoman"/>
+      <w:lvlText w:val="%3."/>
+      <w:lvlJc w:val="left"/>
+      <w:pPr>
+        <w:tabs>
+          <w:tab w:val="left" w:pos="1260"/>
+        </w:tabs>
+        <w:ind w:left="1260" w:leftChars="0" w:hanging="420" w:firstLineChars="0"/>
+      </w:pPr>
+      <w:rPr>
+        <w:rFonts w:hint="default"/>
+      </w:rPr>
+    </w:lvl>
+    <w:lvl w:ilvl="3" w:tentative="0">
+      <w:start w:val="1"/>
+      <w:numFmt w:val="decimal"/>
+      <w:lvlText w:val="%4."/>
+      <w:lvlJc w:val="left"/>
+      <w:pPr>
+        <w:tabs>
+          <w:tab w:val="left" w:pos="1680"/>
+        </w:tabs>
+        <w:ind w:left="1680" w:leftChars="0" w:hanging="420" w:firstLineChars="0"/>
+      </w:pPr>
+      <w:rPr>
+        <w:rFonts w:hint="default"/>
+      </w:rPr>
+    </w:lvl>
+    <w:lvl w:ilvl="4" w:tentative="0">
+      <w:start w:val="1"/>
+      <w:numFmt w:val="lowerLetter"/>
+      <w:lvlText w:val="%5)"/>
+      <w:lvlJc w:val="left"/>
+      <w:pPr>
+        <w:tabs>
+          <w:tab w:val="left" w:pos="2100"/>
+        </w:tabs>
+        <w:ind w:left="2100" w:leftChars="0" w:hanging="420" w:firstLineChars="0"/>
+      </w:pPr>
+      <w:rPr>
+        <w:rFonts w:hint="default"/>
+      </w:rPr>
+    </w:lvl>
+    <w:lvl w:ilvl="5" w:tentative="0">
+      <w:start w:val="1"/>
+      <w:numFmt w:val="lowerRoman"/>
+      <w:lvlText w:val="%6."/>
+      <w:lvlJc w:val="left"/>
+      <w:pPr>
+        <w:tabs>
+          <w:tab w:val="left" w:pos="2520"/>
+        </w:tabs>
+        <w:ind w:left="2520" w:leftChars="0" w:hanging="420" w:firstLineChars="0"/>
+      </w:pPr>
+      <w:rPr>
+        <w:rFonts w:hint="default"/>
+      </w:rPr>
+    </w:lvl>
+    <w:lvl w:ilvl="6" w:tentative="0">
+      <w:start w:val="1"/>
+      <w:numFmt w:val="decimal"/>
+      <w:lvlText w:val="%7."/>
+      <w:lvlJc w:val="left"/>
+      <w:pPr>
+        <w:tabs>
+          <w:tab w:val="left" w:pos="2940"/>
+        </w:tabs>
+        <w:ind w:left="2940" w:leftChars="0" w:hanging="420" w:firstLineChars="0"/>
+      </w:pPr>
+      <w:rPr>
+        <w:rFonts w:hint="default"/>
+      </w:rPr>
+    </w:lvl>
+    <w:lvl w:ilvl="7" w:tentative="0">
+      <w:start w:val="1"/>
+      <w:numFmt w:val="lowerLetter"/>
+      <w:lvlText w:val="%8)"/>
+      <w:lvlJc w:val="left"/>
+      <w:pPr>
+        <w:tabs>
+          <w:tab w:val="left" w:pos="3360"/>
+        </w:tabs>
+        <w:ind w:left="3360" w:leftChars="0" w:hanging="420" w:firstLineChars="0"/>
+      </w:pPr>
+      <w:rPr>
+        <w:rFonts w:hint="default"/>
+      </w:rPr>
+    </w:lvl>
+    <w:lvl w:ilvl="8" w:tentative="0">
+      <w:start w:val="1"/>
+      <w:numFmt w:val="lowerRoman"/>
+      <w:lvlText w:val="%9."/>
+      <w:lvlJc w:val="left"/>
+      <w:pPr>
+        <w:tabs>
+          <w:tab w:val="left" w:pos="3780"/>
+        </w:tabs>
+        <w:ind w:left="3780" w:leftChars="0" w:hanging="420" w:firstLineChars="0"/>
+      </w:pPr>
+      <w:rPr>
+        <w:rFonts w:hint="default"/>
+      </w:rPr>
+    </w:lvl>
+  </w:abstractNum>
+  <w:abstractNum w:abstractNumId="1">
+    <w:nsid w:val="FFDE4C14"/>
+    <w:multiLevelType w:val="singleLevel"/>
+    <w:tmpl w:val="FFDE4C14"/>
+    <w:lvl w:ilvl="0" w:tentative="0">
+      <w:start w:val="1"/>
+      <w:numFmt w:val="bullet"/>
+      <w:lvlText w:val=""/>
+      <w:lvlJc w:val="left"/>
+      <w:pPr>
+        <w:tabs>
+          <w:tab w:val="left" w:pos="420"/>
+        </w:tabs>
+        <w:ind w:left="420" w:leftChars="0" w:hanging="420" w:firstLineChars="0"/>
+      </w:pPr>
+      <w:rPr>
+        <w:rFonts w:hint="default" w:ascii="Wingdings" w:hAnsi="Wingdings"/>
+      </w:rPr>
+    </w:lvl>
+  </w:abstractNum>
+  <w:abstractNum w:abstractNumId="2">
+    <w:nsid w:val="5FBC7FFB"/>
+    <w:multiLevelType w:val="singleLevel"/>
+    <w:tmpl w:val="5FBC7FFB"/>
+    <w:lvl w:ilvl="0" w:tentative="0">
+      <w:start w:val="1"/>
+      <w:numFmt w:val="bullet"/>
+      <w:lvlText w:val=""/>
+      <w:lvlJc w:val="left"/>
+      <w:pPr>
+        <w:tabs>
+          <w:tab w:val="left" w:pos="420"/>
+        </w:tabs>
+        <w:ind w:left="420" w:leftChars="0" w:hanging="420" w:firstLineChars="0"/>
+      </w:pPr>
+      <w:rPr>
+        <w:rFonts w:hint="default" w:ascii="Wingdings" w:hAnsi="Wingdings"/>
+      </w:rPr>
+    </w:lvl>
+  </w:abstractNum>
+  <w:num w:numId="1">
+    <w:abstractNumId w:val="0"/>
+  </w:num>
+  <w:num w:numId="2">
+    <w:abstractNumId w:val="2"/>
+  </w:num>
+  <w:num w:numId="3">
+    <w:abstractNumId w:val="1"/>
+  </w:num>
+</w:numbering>
+</file>
+
 <file path=word/styles.xml><?xml version="1.0" encoding="utf-8"?>
 <w:styles xmlns:mc="http://schemas.openxmlformats.org/markup-compatibility/2006" xmlns:o="urn:schemas-microsoft-com:office:office" xmlns:r="http://schemas.openxmlformats.org/officeDocument/2006/relationships" xmlns:m="http://schemas.openxmlformats.org/officeDocument/2006/math" xmlns:v="urn:schemas-microsoft-com:vml" xmlns:w="http://schemas.openxmlformats.org/wordprocessingml/2006/main" xmlns:w14="http://schemas.microsoft.com/office/word/2010/wordml" xmlns:w10="urn:schemas-microsoft-com:office:word" xmlns:sl="http://schemas.openxmlformats.org/schemaLibrary/2006/main" xmlns:wpsCustomData="http://www.wps.cn/officeDocument/2013/wpsCustomData" mc:Ignorable="w14">
   <w:docDefaults>
@@ -3255,7 +4548,7 @@
     <w:lsdException w:unhideWhenUsed="0" w:uiPriority="0" w:semiHidden="0" w:name="footnote text"/>
     <w:lsdException w:unhideWhenUsed="0" w:uiPriority="0" w:semiHidden="0" w:name="annotation text"/>
     <w:lsdException w:unhideWhenUsed="0" w:uiPriority="0" w:semiHidden="0" w:name="header"/>
-    <w:lsdException w:unhideWhenUsed="0" w:uiPriority="0" w:semiHidden="0" w:name="footer"/>
+    <w:lsdException w:qFormat="1" w:unhideWhenUsed="0" w:uiPriority="0" w:semiHidden="0" w:name="footer"/>
     <w:lsdException w:unhideWhenUsed="0" w:uiPriority="0" w:semiHidden="0" w:name="index heading"/>
     <w:lsdException w:qFormat="1" w:unhideWhenUsed="0" w:uiPriority="0" w:semiHidden="0" w:name="caption"/>
     <w:lsdException w:unhideWhenUsed="0" w:uiPriority="0" w:semiHidden="0" w:name="table of figures"/>
@@ -3555,6 +4848,7 @@
   </w:style>
   <w:style w:type="paragraph" w:styleId="7">
     <w:name w:val="footer"/>
+    <w:qFormat/>
     <w:uiPriority w:val="0"/>
     <w:pPr>
       <w:tabs>
@@ -3567,7 +4861,7 @@
       <w:jc w:val="left"/>
     </w:pPr>
     <w:rPr>
-      <w:rFonts w:hint="default" w:ascii="Calibri" w:hAnsi="Calibri" w:cs="Calibri"/>
+      <w:rFonts w:hint="default" w:ascii="Calibri" w:hAnsi="Calibri" w:eastAsia="SimSun" w:cs="Calibri"/>
       <w:kern w:val="0"/>
       <w:sz w:val="18"/>
       <w:szCs w:val="18"/>
@@ -3620,6 +4914,12 @@
     </w:rPr>
   </w:style>
   <w:style w:type="paragraph" w:styleId="11">
+    <w:name w:val="toc 1"/>
+    <w:basedOn w:val="1"/>
+    <w:next w:val="1"/>
+    <w:uiPriority w:val="0"/>
+  </w:style>
+  <w:style w:type="paragraph" w:styleId="12">
     <w:name w:val="List Paragraph"/>
     <w:qFormat/>
     <w:uiPriority w:val="0"/>
@@ -3921,7 +5221,10 @@
 
 <file path=customXml/item1.xml><?xml version="1.0" encoding="utf-8"?>
 <s:customData xmlns="http://www.wps.cn/officeDocument/2013/wpsCustomData" xmlns:s="http://www.wps.cn/officeDocument/2013/wpsCustomData">
-  <customSectProps/>
+  <customSectProps>
+    <customSectPr/>
+    <customSectPr/>
+  </customSectProps>
   <customShpExts>
     <customShpInfo spid="_x0000_s2049" textRotate="1"/>
     <customShpInfo spid="_x0000_s1026"/>
@@ -3930,7 +5233,6 @@
     <customShpInfo spid="_x0000_s1030"/>
     <customShpInfo spid="_x0000_s1036"/>
     <customShpInfo spid="_x0000_s1035"/>
-    <customShpInfo spid="_x0000_s1034"/>
     <customShpInfo spid="_x0000_s1033"/>
     <customShpInfo spid="_x0000_s1040"/>
     <customShpInfo spid="_x0000_s1039"/>
@@ -3961,6 +5263,10 @@
     <customShpInfo spid="_x0000_s1065"/>
     <customShpInfo spid="_x0000_s1064"/>
     <customShpInfo spid="_x0000_s1063"/>
+    <customShpInfo spid="_x0000_s1069"/>
+    <customShpInfo spid="_x0000_s1070"/>
+    <customShpInfo spid="_x0000_s1072"/>
+    <customShpInfo spid="_x0000_s1071"/>
     <customShpInfo spid="_x0000_s1068"/>
     <customShpInfo spid="_x0000_s1067"/>
     <customShpInfo spid="_x0000_s1066"/>

</xml_diff>

<commit_message>
Update Tutorial Doc - Rev A, fix NIAS abbreviation & several minor phrase
</commit_message>
<xml_diff>
--- a/Tutorial_Pengoperasian_Website_NIAS_Jatim.docx
+++ b/Tutorial_Pengoperasian_Website_NIAS_Jatim.docx
@@ -77,7 +77,17 @@
         <w:jc w:val="center"/>
       </w:pPr>
       <w:r>
-        <w:t>Sistem Pendaftaran Nomor Induk Anggota Selam (NIAS)</w:t>
+        <w:t xml:space="preserve">Sistem Pendaftaran Nomor Induk </w:t>
+      </w:r>
+      <w:r>
+        <w:rPr>
+          <w:rFonts w:hint="default"/>
+          <w:lang w:val="en-US"/>
+        </w:rPr>
+        <w:t xml:space="preserve">Atlet </w:t>
+      </w:r>
+      <w:r>
+        <w:t>Selam (NIAS)</w:t>
       </w:r>
     </w:p>
     <w:p>
@@ -130,8 +140,6 @@
           <w:tab w:val="right" w:leader="dot" w:pos="10466"/>
         </w:tabs>
       </w:pPr>
-      <w:bookmarkStart w:id="14" w:name="_GoBack"/>
-      <w:bookmarkEnd w:id="14"/>
       <w:r>
         <w:fldChar w:fldCharType="begin"/>
       </w:r>
@@ -145,7 +153,7 @@
         <w:fldChar w:fldCharType="begin"/>
       </w:r>
       <w:r>
-        <w:instrText xml:space="preserve"> HYPERLINK \l _Toc1773711299 </w:instrText>
+        <w:instrText xml:space="preserve"> HYPERLINK \l _Toc1882797352 </w:instrText>
       </w:r>
       <w:r>
         <w:fldChar w:fldCharType="separate"/>
@@ -160,7 +168,7 @@
         <w:fldChar w:fldCharType="begin"/>
       </w:r>
       <w:r>
-        <w:instrText xml:space="preserve"> PAGEREF _Toc1773711299 \h </w:instrText>
+        <w:instrText xml:space="preserve"> PAGEREF _Toc1882797352 \h </w:instrText>
       </w:r>
       <w:r>
         <w:fldChar w:fldCharType="separate"/>
@@ -186,7 +194,7 @@
         <w:fldChar w:fldCharType="begin"/>
       </w:r>
       <w:r>
-        <w:instrText xml:space="preserve"> HYPERLINK \l _Toc206092538 </w:instrText>
+        <w:instrText xml:space="preserve"> HYPERLINK \l _Toc55009542 </w:instrText>
       </w:r>
       <w:r>
         <w:fldChar w:fldCharType="separate"/>
@@ -201,7 +209,7 @@
         <w:fldChar w:fldCharType="begin"/>
       </w:r>
       <w:r>
-        <w:instrText xml:space="preserve"> PAGEREF _Toc206092538 \h </w:instrText>
+        <w:instrText xml:space="preserve"> PAGEREF _Toc55009542 \h </w:instrText>
       </w:r>
       <w:r>
         <w:fldChar w:fldCharType="separate"/>
@@ -227,7 +235,7 @@
         <w:fldChar w:fldCharType="begin"/>
       </w:r>
       <w:r>
-        <w:instrText xml:space="preserve"> HYPERLINK \l _Toc1882144265 </w:instrText>
+        <w:instrText xml:space="preserve"> HYPERLINK \l _Toc288215597 </w:instrText>
       </w:r>
       <w:r>
         <w:fldChar w:fldCharType="separate"/>
@@ -242,7 +250,7 @@
         <w:fldChar w:fldCharType="begin"/>
       </w:r>
       <w:r>
-        <w:instrText xml:space="preserve"> PAGEREF _Toc1882144265 \h </w:instrText>
+        <w:instrText xml:space="preserve"> PAGEREF _Toc288215597 \h </w:instrText>
       </w:r>
       <w:r>
         <w:fldChar w:fldCharType="separate"/>
@@ -268,7 +276,7 @@
         <w:fldChar w:fldCharType="begin"/>
       </w:r>
       <w:r>
-        <w:instrText xml:space="preserve"> HYPERLINK \l _Toc1403974640 </w:instrText>
+        <w:instrText xml:space="preserve"> HYPERLINK \l _Toc1091326001 </w:instrText>
       </w:r>
       <w:r>
         <w:fldChar w:fldCharType="separate"/>
@@ -283,7 +291,7 @@
         <w:fldChar w:fldCharType="begin"/>
       </w:r>
       <w:r>
-        <w:instrText xml:space="preserve"> PAGEREF _Toc1403974640 \h </w:instrText>
+        <w:instrText xml:space="preserve"> PAGEREF _Toc1091326001 \h </w:instrText>
       </w:r>
       <w:r>
         <w:fldChar w:fldCharType="separate"/>
@@ -309,7 +317,7 @@
         <w:fldChar w:fldCharType="begin"/>
       </w:r>
       <w:r>
-        <w:instrText xml:space="preserve"> HYPERLINK \l _Toc1471381638 </w:instrText>
+        <w:instrText xml:space="preserve"> HYPERLINK \l _Toc2124367093 </w:instrText>
       </w:r>
       <w:r>
         <w:fldChar w:fldCharType="separate"/>
@@ -324,7 +332,7 @@
         <w:fldChar w:fldCharType="begin"/>
       </w:r>
       <w:r>
-        <w:instrText xml:space="preserve"> PAGEREF _Toc1471381638 \h </w:instrText>
+        <w:instrText xml:space="preserve"> PAGEREF _Toc2124367093 \h </w:instrText>
       </w:r>
       <w:r>
         <w:fldChar w:fldCharType="separate"/>
@@ -350,7 +358,7 @@
         <w:fldChar w:fldCharType="begin"/>
       </w:r>
       <w:r>
-        <w:instrText xml:space="preserve"> HYPERLINK \l _Toc779474862 </w:instrText>
+        <w:instrText xml:space="preserve"> HYPERLINK \l _Toc1418349173 </w:instrText>
       </w:r>
       <w:r>
         <w:fldChar w:fldCharType="separate"/>
@@ -365,7 +373,7 @@
         <w:fldChar w:fldCharType="begin"/>
       </w:r>
       <w:r>
-        <w:instrText xml:space="preserve"> PAGEREF _Toc779474862 \h </w:instrText>
+        <w:instrText xml:space="preserve"> PAGEREF _Toc1418349173 \h </w:instrText>
       </w:r>
       <w:r>
         <w:fldChar w:fldCharType="separate"/>
@@ -391,7 +399,7 @@
         <w:fldChar w:fldCharType="begin"/>
       </w:r>
       <w:r>
-        <w:instrText xml:space="preserve"> HYPERLINK \l _Toc397457170 </w:instrText>
+        <w:instrText xml:space="preserve"> HYPERLINK \l _Toc1638610167 </w:instrText>
       </w:r>
       <w:r>
         <w:fldChar w:fldCharType="separate"/>
@@ -406,7 +414,7 @@
         <w:fldChar w:fldCharType="begin"/>
       </w:r>
       <w:r>
-        <w:instrText xml:space="preserve"> PAGEREF _Toc397457170 \h </w:instrText>
+        <w:instrText xml:space="preserve"> PAGEREF _Toc1638610167 \h </w:instrText>
       </w:r>
       <w:r>
         <w:fldChar w:fldCharType="separate"/>
@@ -432,7 +440,7 @@
         <w:fldChar w:fldCharType="begin"/>
       </w:r>
       <w:r>
-        <w:instrText xml:space="preserve"> HYPERLINK \l _Toc1564085149 </w:instrText>
+        <w:instrText xml:space="preserve"> HYPERLINK \l _Toc1900481698 </w:instrText>
       </w:r>
       <w:r>
         <w:fldChar w:fldCharType="separate"/>
@@ -447,7 +455,7 @@
         <w:fldChar w:fldCharType="begin"/>
       </w:r>
       <w:r>
-        <w:instrText xml:space="preserve"> PAGEREF _Toc1564085149 \h </w:instrText>
+        <w:instrText xml:space="preserve"> PAGEREF _Toc1900481698 \h </w:instrText>
       </w:r>
       <w:r>
         <w:fldChar w:fldCharType="separate"/>
@@ -473,7 +481,7 @@
         <w:fldChar w:fldCharType="begin"/>
       </w:r>
       <w:r>
-        <w:instrText xml:space="preserve"> HYPERLINK \l _Toc649835153 </w:instrText>
+        <w:instrText xml:space="preserve"> HYPERLINK \l _Toc2041873369 </w:instrText>
       </w:r>
       <w:r>
         <w:fldChar w:fldCharType="separate"/>
@@ -488,7 +496,7 @@
         <w:fldChar w:fldCharType="begin"/>
       </w:r>
       <w:r>
-        <w:instrText xml:space="preserve"> PAGEREF _Toc649835153 \h </w:instrText>
+        <w:instrText xml:space="preserve"> PAGEREF _Toc2041873369 \h </w:instrText>
       </w:r>
       <w:r>
         <w:fldChar w:fldCharType="separate"/>
@@ -514,7 +522,7 @@
         <w:fldChar w:fldCharType="begin"/>
       </w:r>
       <w:r>
-        <w:instrText xml:space="preserve"> HYPERLINK \l _Toc67329082 </w:instrText>
+        <w:instrText xml:space="preserve"> HYPERLINK \l _Toc637567132 </w:instrText>
       </w:r>
       <w:r>
         <w:fldChar w:fldCharType="separate"/>
@@ -529,7 +537,7 @@
         <w:fldChar w:fldCharType="begin"/>
       </w:r>
       <w:r>
-        <w:instrText xml:space="preserve"> PAGEREF _Toc67329082 \h </w:instrText>
+        <w:instrText xml:space="preserve"> PAGEREF _Toc637567132 \h </w:instrText>
       </w:r>
       <w:r>
         <w:fldChar w:fldCharType="separate"/>
@@ -555,7 +563,7 @@
         <w:fldChar w:fldCharType="begin"/>
       </w:r>
       <w:r>
-        <w:instrText xml:space="preserve"> HYPERLINK \l _Toc1025688225 </w:instrText>
+        <w:instrText xml:space="preserve"> HYPERLINK \l _Toc354051032 </w:instrText>
       </w:r>
       <w:r>
         <w:fldChar w:fldCharType="separate"/>
@@ -577,7 +585,7 @@
         <w:fldChar w:fldCharType="begin"/>
       </w:r>
       <w:r>
-        <w:instrText xml:space="preserve"> PAGEREF _Toc1025688225 \h </w:instrText>
+        <w:instrText xml:space="preserve"> PAGEREF _Toc354051032 \h </w:instrText>
       </w:r>
       <w:r>
         <w:fldChar w:fldCharType="separate"/>
@@ -603,7 +611,7 @@
         <w:fldChar w:fldCharType="begin"/>
       </w:r>
       <w:r>
-        <w:instrText xml:space="preserve"> HYPERLINK \l _Toc272528582 </w:instrText>
+        <w:instrText xml:space="preserve"> HYPERLINK \l _Toc1601996368 </w:instrText>
       </w:r>
       <w:r>
         <w:fldChar w:fldCharType="separate"/>
@@ -625,7 +633,7 @@
         <w:fldChar w:fldCharType="begin"/>
       </w:r>
       <w:r>
-        <w:instrText xml:space="preserve"> PAGEREF _Toc272528582 \h </w:instrText>
+        <w:instrText xml:space="preserve"> PAGEREF _Toc1601996368 \h </w:instrText>
       </w:r>
       <w:r>
         <w:fldChar w:fldCharType="separate"/>
@@ -651,13 +659,23 @@
         <w:fldChar w:fldCharType="begin"/>
       </w:r>
       <w:r>
-        <w:instrText xml:space="preserve"> HYPERLINK \l _Toc1389201324 </w:instrText>
+        <w:instrText xml:space="preserve"> HYPERLINK \l _Toc1046246417 </w:instrText>
       </w:r>
       <w:r>
         <w:fldChar w:fldCharType="separate"/>
       </w:r>
       <w:r>
-        <w:t>13. Pemecahan Masalah (Troubleshooting)</w:t>
+        <w:t xml:space="preserve">13. </w:t>
+      </w:r>
+      <w:r>
+        <w:rPr>
+          <w:rFonts w:hint="default"/>
+          <w:lang w:val="en-US"/>
+        </w:rPr>
+        <w:t xml:space="preserve">Penanganan </w:t>
+      </w:r>
+      <w:r>
+        <w:t>Masalah (Troubleshooting)</w:t>
       </w:r>
       <w:r>
         <w:tab/>
@@ -666,7 +684,7 @@
         <w:fldChar w:fldCharType="begin"/>
       </w:r>
       <w:r>
-        <w:instrText xml:space="preserve"> PAGEREF _Toc1389201324 \h </w:instrText>
+        <w:instrText xml:space="preserve"> PAGEREF _Toc1046246417 \h </w:instrText>
       </w:r>
       <w:r>
         <w:fldChar w:fldCharType="separate"/>
@@ -692,7 +710,7 @@
         <w:fldChar w:fldCharType="begin"/>
       </w:r>
       <w:r>
-        <w:instrText xml:space="preserve"> HYPERLINK \l _Toc643639544 </w:instrText>
+        <w:instrText xml:space="preserve"> HYPERLINK \l _Toc1449209576 </w:instrText>
       </w:r>
       <w:r>
         <w:fldChar w:fldCharType="separate"/>
@@ -707,7 +725,7 @@
         <w:fldChar w:fldCharType="begin"/>
       </w:r>
       <w:r>
-        <w:instrText xml:space="preserve"> PAGEREF _Toc643639544 \h </w:instrText>
+        <w:instrText xml:space="preserve"> PAGEREF _Toc1449209576 \h </w:instrText>
       </w:r>
       <w:r>
         <w:fldChar w:fldCharType="separate"/>
@@ -741,7 +759,7 @@
       <w:pPr>
         <w:pStyle w:val="2"/>
       </w:pPr>
-      <w:bookmarkStart w:id="0" w:name="_Toc1773711299"/>
+      <w:bookmarkStart w:id="0" w:name="_Toc1882797352"/>
       <w:r>
         <w:t>1. Pendahuluan</w:t>
       </w:r>
@@ -749,7 +767,26 @@
     </w:p>
     <w:p>
       <w:r>
-        <w:t>Website NIAS Jatim adalah sistem pendaftaran Nomor Induk Anggota Selam (NIAS) milik POSSI Jawa Timur. Melalui website ini, pelatih atau official klub dapat mendaftarkan atlet finswimming untuk mendapatkan NIAS (baru), serta memperpanjang atau memperbarui NIAS atlet yang sudah terdaftar.</w:t>
+        <w:t xml:space="preserve">Website NIAS Jatim adalah sistem pendaftaran Nomor Induk </w:t>
+      </w:r>
+      <w:r>
+        <w:rPr>
+          <w:rFonts w:hint="default"/>
+          <w:lang w:val="en-US"/>
+        </w:rPr>
+        <w:t xml:space="preserve">Atlet </w:t>
+      </w:r>
+      <w:r>
+        <w:t xml:space="preserve">Selam (NIAS) milik POSSI Jawa Timur. Melalui website ini, pelatih atau official klub dapat mendaftarkan atlet finswimming untuk mendapatkan NIAS (baru), serta </w:t>
+      </w:r>
+      <w:r>
+        <w:rPr>
+          <w:rFonts w:hint="default"/>
+        </w:rPr>
+        <w:t>memperbarui NIAS atlet yang sudah expired (habis masa berlakunya) atau mutasi club dan/ atau mutasi domisili</w:t>
+      </w:r>
+      <w:r>
+        <w:t>.</w:t>
       </w:r>
     </w:p>
     <w:p>
@@ -980,9 +1017,27 @@
     </w:p>
     <w:p>
       <w:pPr>
+        <w:pStyle w:val="12"/>
+        <w:ind w:left="360"/>
+      </w:pPr>
+    </w:p>
+    <w:p>
+      <w:pPr>
+        <w:pStyle w:val="12"/>
+        <w:ind w:left="360"/>
+      </w:pPr>
+    </w:p>
+    <w:p>
+      <w:pPr>
+        <w:pStyle w:val="12"/>
+        <w:ind w:left="360"/>
+      </w:pPr>
+    </w:p>
+    <w:p>
+      <w:pPr>
         <w:pStyle w:val="2"/>
       </w:pPr>
-      <w:bookmarkStart w:id="1" w:name="_Toc206092538"/>
+      <w:bookmarkStart w:id="1" w:name="_Toc55009542"/>
       <w:r>
         <w:t>2. Membuat Akun</w:t>
       </w:r>
@@ -1301,7 +1356,7 @@
       <w:pPr>
         <w:pStyle w:val="2"/>
       </w:pPr>
-      <w:bookmarkStart w:id="2" w:name="_Toc1882144265"/>
+      <w:bookmarkStart w:id="2" w:name="_Toc288215597"/>
       <w:r>
         <w:t>3. Masuk dan Keluar Akun</w:t>
       </w:r>
@@ -1433,7 +1488,7 @@
       <w:pPr>
         <w:pStyle w:val="2"/>
       </w:pPr>
-      <w:bookmarkStart w:id="3" w:name="_Toc1403974640"/>
+      <w:bookmarkStart w:id="3" w:name="_Toc1091326001"/>
       <w:r>
         <w:t>4. Halaman Utama (Data NIAS)</w:t>
       </w:r>
@@ -1506,7 +1561,23 @@
         <w:ind w:left="360"/>
       </w:pPr>
       <w:r>
-        <w:t>•  “Semua” – daftar seluruh pendaftaran (baru dan update) yang sudah disimpan.</w:t>
+        <w:t xml:space="preserve">•  “Semua” – </w:t>
+      </w:r>
+      <w:r>
+        <w:rPr>
+          <w:rFonts w:hint="default"/>
+        </w:rPr>
+        <w:t>menampilkan daftar Nias Jatim (baru dan update</w:t>
+      </w:r>
+      <w:r>
+        <w:rPr>
+          <w:rFonts w:hint="default"/>
+          <w:lang w:val="en-US"/>
+        </w:rPr>
+        <w:t>)</w:t>
+      </w:r>
+      <w:r>
+        <w:t>.</w:t>
       </w:r>
     </w:p>
     <w:p>
@@ -1548,11 +1619,14 @@
     <w:p/>
     <w:p/>
     <w:p/>
+    <w:p/>
+    <w:p/>
+    <w:p/>
     <w:p>
       <w:pPr>
         <w:pStyle w:val="2"/>
       </w:pPr>
-      <w:bookmarkStart w:id="4" w:name="_Toc1471381638"/>
+      <w:bookmarkStart w:id="4" w:name="_Toc2124367093"/>
       <w:r>
         <w:t>5. Mendaftarkan Atlet Baru</w:t>
       </w:r>
@@ -1725,7 +1799,7 @@
       <w:pPr>
         <w:pStyle w:val="2"/>
       </w:pPr>
-      <w:bookmarkStart w:id="5" w:name="_Toc779474862"/>
+      <w:bookmarkStart w:id="5" w:name="_Toc1418349173"/>
       <w:r>
         <w:t>6. Data Berhasil Disimpan</w:t>
       </w:r>
@@ -1852,7 +1926,7 @@
       <w:pPr>
         <w:pStyle w:val="2"/>
       </w:pPr>
-      <w:bookmarkStart w:id="6" w:name="_Toc397457170"/>
+      <w:bookmarkStart w:id="6" w:name="_Toc1638610167"/>
       <w:r>
         <w:t>7. Update / Perpanjang NIAS</w:t>
       </w:r>
@@ -2363,6 +2437,10 @@
     <w:p/>
     <w:p/>
     <w:p/>
+    <w:p/>
+    <w:p/>
+    <w:p/>
+    <w:p/>
     <w:p>
       <w:pPr>
         <w:pStyle w:val="3"/>
@@ -2613,7 +2691,7 @@
       <w:pPr>
         <w:pStyle w:val="2"/>
       </w:pPr>
-      <w:bookmarkStart w:id="7" w:name="_Toc1564085149"/>
+      <w:bookmarkStart w:id="7" w:name="_Toc1900481698"/>
       <w:r>
         <w:t>8. Konfirmasi dan Hasil Update</w:t>
       </w:r>
@@ -2621,7 +2699,17 @@
     </w:p>
     <w:p>
       <w:r>
-        <w:t>Setelah formulir terisi lengkap, klik tombol “Proses Update”. Muncul kotak konfirmasi “Apakah data yang diisi sudah benar?” – periksa kembali data, lalu klik “Ya, Proses!”</w:t>
+        <w:t>Setelah formulir terisi lengkap, klik tombol “</w:t>
+      </w:r>
+      <w:r>
+        <w:rPr>
+          <w:rFonts w:hint="default"/>
+          <w:lang w:val="en-US"/>
+        </w:rPr>
+        <w:t xml:space="preserve">Simpan </w:t>
+      </w:r>
+      <w:r>
+        <w:t>Update”. Muncul kotak konfirmasi “Apakah data yang diisi sudah benar?” – periksa kembali data, lalu klik “Ya, Proses!”</w:t>
       </w:r>
     </w:p>
     <w:p>
@@ -2791,7 +2879,21 @@
         <w:rPr>
           <w:i/>
         </w:rPr>
-        <w:t>Gambar 17. Setelah diproses, muncul pemberitahuan bahwa update berhasil dan data masuk ke daftar pendaftaran.</w:t>
+        <w:t xml:space="preserve">Gambar 17. Setelah diproses, muncul pemberitahuan bahwa update berhasil dan data masuk ke </w:t>
+      </w:r>
+      <w:r>
+        <w:rPr>
+          <w:rFonts w:hint="default"/>
+          <w:i/>
+          <w:lang w:val="en-US"/>
+        </w:rPr>
+        <w:t xml:space="preserve">list </w:t>
+      </w:r>
+      <w:r>
+        <w:rPr>
+          <w:i/>
+        </w:rPr>
+        <w:t>pendaftaran.</w:t>
       </w:r>
     </w:p>
     <w:p>
@@ -2996,7 +3098,7 @@
       <w:pPr>
         <w:pStyle w:val="2"/>
       </w:pPr>
-      <w:bookmarkStart w:id="8" w:name="_Toc649835153"/>
+      <w:bookmarkStart w:id="8" w:name="_Toc2041873369"/>
       <w:r>
         <w:t>9. Upload Bukti Transfer</w:t>
       </w:r>
@@ -3240,6 +3342,9 @@
       <w:pPr>
         <w:pStyle w:val="6"/>
         <w:jc w:val="center"/>
+        <w:rPr>
+          <w:i/>
+        </w:rPr>
       </w:pPr>
       <w:r>
         <w:rPr>
@@ -3250,9 +3355,18 @@
     </w:p>
     <w:p>
       <w:pPr>
+        <w:pStyle w:val="6"/>
+        <w:jc w:val="center"/>
+        <w:rPr>
+          <w:i/>
+        </w:rPr>
+      </w:pPr>
+    </w:p>
+    <w:p>
+      <w:pPr>
         <w:pStyle w:val="2"/>
       </w:pPr>
-      <w:bookmarkStart w:id="9" w:name="_Toc67329082"/>
+      <w:bookmarkStart w:id="9" w:name="_Toc637567132"/>
       <w:r>
         <w:t>10. Mengirim Data ke POSSI Jatim</w:t>
       </w:r>
@@ -3640,7 +3754,7 @@
         </w:numPr>
         <w:ind w:left="0" w:leftChars="0" w:firstLine="0" w:firstLineChars="0"/>
       </w:pPr>
-      <w:bookmarkStart w:id="10" w:name="_Toc1025688225"/>
+      <w:bookmarkStart w:id="10" w:name="_Toc354051032"/>
       <w:r>
         <w:rPr>
           <w:rFonts w:hint="default"/>
@@ -3750,7 +3864,7 @@
         </w:numPr>
         <w:ind w:left="0" w:leftChars="0" w:firstLine="0" w:firstLineChars="0"/>
       </w:pPr>
-      <w:bookmarkStart w:id="11" w:name="_Toc272528582"/>
+      <w:bookmarkStart w:id="11" w:name="_Toc1601996368"/>
       <w:r>
         <w:rPr>
           <w:rFonts w:hint="default"/>
@@ -3958,9 +4072,16 @@
         </w:numPr>
         <w:ind w:left="0" w:leftChars="0" w:firstLine="0" w:firstLineChars="0"/>
       </w:pPr>
-      <w:bookmarkStart w:id="12" w:name="_Toc1389201324"/>
-      <w:r>
-        <w:t>Pemecahan Masalah (Troubleshooting)</w:t>
+      <w:bookmarkStart w:id="12" w:name="_Toc1046246417"/>
+      <w:r>
+        <w:rPr>
+          <w:rFonts w:hint="default"/>
+          <w:lang w:val="en-US"/>
+        </w:rPr>
+        <w:t xml:space="preserve">Penanganan </w:t>
+      </w:r>
+      <w:r>
+        <w:t>Masalah (Troubleshooting)</w:t>
       </w:r>
       <w:bookmarkEnd w:id="12"/>
     </w:p>
@@ -4174,6 +4295,18 @@
     </w:p>
     <w:p>
       <w:pPr>
+        <w:pStyle w:val="12"/>
+      </w:pPr>
+      <w:bookmarkStart w:id="14" w:name="_GoBack"/>
+      <w:bookmarkEnd w:id="14"/>
+    </w:p>
+    <w:p>
+      <w:pPr>
+        <w:pStyle w:val="12"/>
+      </w:pPr>
+    </w:p>
+    <w:p>
+      <w:pPr>
         <w:pStyle w:val="2"/>
         <w:numPr>
           <w:ilvl w:val="0"/>
@@ -4181,7 +4314,7 @@
         </w:numPr>
         <w:ind w:left="0" w:leftChars="0" w:firstLine="0" w:firstLineChars="0"/>
       </w:pPr>
-      <w:bookmarkStart w:id="13" w:name="_Toc643639544"/>
+      <w:bookmarkStart w:id="13" w:name="_Toc1449209576"/>
       <w:r>
         <w:t>Informasi Penting</w:t>
       </w:r>
@@ -4260,6 +4393,10 @@
       <w:widowControl/>
       <w:suppressLineNumbers w:val="0"/>
       <w:ind w:left="0" w:leftChars="0" w:firstLine="0" w:firstLineChars="0"/>
+      <w:rPr>
+        <w:rFonts w:hint="default"/>
+        <w:lang w:val="en-US"/>
+      </w:rPr>
     </w:pPr>
     <w:r>
       <w:rPr>
@@ -4313,7 +4450,16 @@
         <w:sz w:val="18"/>
         <w:szCs w:val="18"/>
       </w:rPr>
-      <w:t>ASJTM-WEB-USERGUIDE Initial Release</w:t>
+      <w:t xml:space="preserve">ASJTM-WEB-USERGUIDE </w:t>
+    </w:r>
+    <w:r>
+      <w:rPr>
+        <w:rFonts w:hint="default" w:cs="Calibri"/>
+        <w:sz w:val="18"/>
+        <w:szCs w:val="18"/>
+        <w:lang w:val="en-US"/>
+      </w:rPr>
+      <w:t>Rev A</w:t>
     </w:r>
   </w:p>
 </w:ftr>
@@ -4535,7 +4681,7 @@
     <w:lsdException w:unhideWhenUsed="0" w:uiPriority="0" w:semiHidden="0" w:name="index 7"/>
     <w:lsdException w:unhideWhenUsed="0" w:uiPriority="0" w:semiHidden="0" w:name="index 8"/>
     <w:lsdException w:unhideWhenUsed="0" w:uiPriority="0" w:semiHidden="0" w:name="index 9"/>
-    <w:lsdException w:unhideWhenUsed="0" w:uiPriority="0" w:semiHidden="0" w:name="toc 1"/>
+    <w:lsdException w:qFormat="1" w:unhideWhenUsed="0" w:uiPriority="0" w:semiHidden="0" w:name="toc 1"/>
     <w:lsdException w:unhideWhenUsed="0" w:uiPriority="0" w:semiHidden="0" w:name="toc 2"/>
     <w:lsdException w:unhideWhenUsed="0" w:uiPriority="0" w:semiHidden="0" w:name="toc 3"/>
     <w:lsdException w:unhideWhenUsed="0" w:uiPriority="0" w:semiHidden="0" w:name="toc 4"/>
@@ -4547,7 +4693,7 @@
     <w:lsdException w:unhideWhenUsed="0" w:uiPriority="0" w:semiHidden="0" w:name="Normal Indent"/>
     <w:lsdException w:unhideWhenUsed="0" w:uiPriority="0" w:semiHidden="0" w:name="footnote text"/>
     <w:lsdException w:unhideWhenUsed="0" w:uiPriority="0" w:semiHidden="0" w:name="annotation text"/>
-    <w:lsdException w:unhideWhenUsed="0" w:uiPriority="0" w:semiHidden="0" w:name="header"/>
+    <w:lsdException w:qFormat="1" w:unhideWhenUsed="0" w:uiPriority="0" w:semiHidden="0" w:name="header"/>
     <w:lsdException w:qFormat="1" w:unhideWhenUsed="0" w:uiPriority="0" w:semiHidden="0" w:name="footer"/>
     <w:lsdException w:unhideWhenUsed="0" w:uiPriority="0" w:semiHidden="0" w:name="index heading"/>
     <w:lsdException w:qFormat="1" w:unhideWhenUsed="0" w:uiPriority="0" w:semiHidden="0" w:name="caption"/>
@@ -4871,6 +5017,7 @@
   <w:style w:type="paragraph" w:styleId="8">
     <w:name w:val="header"/>
     <w:basedOn w:val="1"/>
+    <w:qFormat/>
     <w:uiPriority w:val="0"/>
     <w:pPr>
       <w:tabs>
@@ -4917,6 +5064,7 @@
     <w:name w:val="toc 1"/>
     <w:basedOn w:val="1"/>
     <w:next w:val="1"/>
+    <w:qFormat/>
     <w:uiPriority w:val="0"/>
   </w:style>
   <w:style w:type="paragraph" w:styleId="12">

</xml_diff>